<commit_message>
nmv 20 09 2026
</commit_message>
<xml_diff>
--- a/Shiva-Stuti/Siva Stuti Malayalam Corrections.docx
+++ b/Shiva-Stuti/Siva Stuti Malayalam Corrections.docx
@@ -1,6 +1,6 @@
 
 <file path=word/document.xml><?xml version="1.0" encoding="utf-8"?>
-<w:document xmlns:wpc="http://schemas.microsoft.com/office/word/2010/wordprocessingCanvas" xmlns:cx="http://schemas.microsoft.com/office/drawing/2014/chartex" xmlns:cx1="http://schemas.microsoft.com/office/drawing/2015/9/8/chartex" xmlns:cx2="http://schemas.microsoft.com/office/drawing/2015/10/21/chartex" xmlns:cx3="http://schemas.microsoft.com/office/drawing/2016/5/9/chartex" xmlns:cx4="http://schemas.microsoft.com/office/drawing/2016/5/10/chartex" xmlns:cx5="http://schemas.microsoft.com/office/drawing/2016/5/11/chartex" xmlns:cx6="http://schemas.microsoft.com/office/drawing/2016/5/12/chartex" xmlns:cx7="http://schemas.microsoft.com/office/drawing/2016/5/13/chartex" xmlns:cx8="http://schemas.microsoft.com/office/drawing/2016/5/14/chartex" xmlns:mc="http://schemas.openxmlformats.org/markup-compatibility/2006" xmlns:aink="http://schemas.microsoft.com/office/drawing/2016/ink" xmlns:am3d="http://schemas.microsoft.com/office/drawing/2017/model3d" xmlns:o="urn:schemas-microsoft-com:office:office" xmlns:oel="http://schemas.microsoft.com/office/2019/extlst" xmlns:r="http://schemas.openxmlformats.org/officeDocument/2006/relationships" xmlns:m="http://schemas.openxmlformats.org/officeDocument/2006/math" xmlns:v="urn:schemas-microsoft-com:vml" xmlns:wp14="http://schemas.microsoft.com/office/word/2010/wordprocessingDrawing" xmlns:wp="http://schemas.openxmlformats.org/drawingml/2006/wordprocessingDrawing" xmlns:w10="urn:schemas-microsoft-com:office:word" xmlns:w="http://schemas.openxmlformats.org/wordprocessingml/2006/main" xmlns:w14="http://schemas.microsoft.com/office/word/2010/wordml" xmlns:w15="http://schemas.microsoft.com/office/word/2012/wordml" xmlns:w16cex="http://schemas.microsoft.com/office/word/2018/wordml/cex" xmlns:w16cid="http://schemas.microsoft.com/office/word/2016/wordml/cid" xmlns:w16="http://schemas.microsoft.com/office/word/2018/wordml" xmlns:w16du="http://schemas.microsoft.com/office/word/2023/wordml/word16du" xmlns:w16sdtdh="http://schemas.microsoft.com/office/word/2020/wordml/sdtdatahash" xmlns:w16se="http://schemas.microsoft.com/office/word/2015/wordml/symex" xmlns:wpg="http://schemas.microsoft.com/office/word/2010/wordprocessingGroup" xmlns:wpi="http://schemas.microsoft.com/office/word/2010/wordprocessingInk" xmlns:wne="http://schemas.microsoft.com/office/word/2006/wordml" xmlns:wps="http://schemas.microsoft.com/office/word/2010/wordprocessingShape" mc:Ignorable="w14 w15 w16se w16cid w16 w16cex w16sdtdh w16du wp14">
+<w:document xmlns:wpc="http://schemas.microsoft.com/office/word/2010/wordprocessingCanvas" xmlns:cx="http://schemas.microsoft.com/office/drawing/2014/chartex" xmlns:cx1="http://schemas.microsoft.com/office/drawing/2015/9/8/chartex" xmlns:cx2="http://schemas.microsoft.com/office/drawing/2015/10/21/chartex" xmlns:cx3="http://schemas.microsoft.com/office/drawing/2016/5/9/chartex" xmlns:cx4="http://schemas.microsoft.com/office/drawing/2016/5/10/chartex" xmlns:cx5="http://schemas.microsoft.com/office/drawing/2016/5/11/chartex" xmlns:cx6="http://schemas.microsoft.com/office/drawing/2016/5/12/chartex" xmlns:cx7="http://schemas.microsoft.com/office/drawing/2016/5/13/chartex" xmlns:cx8="http://schemas.microsoft.com/office/drawing/2016/5/14/chartex" xmlns:mc="http://schemas.openxmlformats.org/markup-compatibility/2006" xmlns:aink="http://schemas.microsoft.com/office/drawing/2016/ink" xmlns:am3d="http://schemas.microsoft.com/office/drawing/2017/model3d" xmlns:o="urn:schemas-microsoft-com:office:office" xmlns:oel="http://schemas.microsoft.com/office/2019/extlst" xmlns:r="http://schemas.openxmlformats.org/officeDocument/2006/relationships" xmlns:m="http://schemas.openxmlformats.org/officeDocument/2006/math" xmlns:v="urn:schemas-microsoft-com:vml" xmlns:wp14="http://schemas.microsoft.com/office/word/2010/wordprocessingDrawing" xmlns:wp="http://schemas.openxmlformats.org/drawingml/2006/wordprocessingDrawing" xmlns:w10="urn:schemas-microsoft-com:office:word" xmlns:w="http://schemas.openxmlformats.org/wordprocessingml/2006/main" xmlns:w14="http://schemas.microsoft.com/office/word/2010/wordml" xmlns:w15="http://schemas.microsoft.com/office/word/2012/wordml" xmlns:w16cex="http://schemas.microsoft.com/office/word/2018/wordml/cex" xmlns:w16cid="http://schemas.microsoft.com/office/word/2016/wordml/cid" xmlns:w16="http://schemas.microsoft.com/office/word/2018/wordml" xmlns:w16du="http://schemas.microsoft.com/office/word/2023/wordml/word16du" xmlns:w16sdtdh="http://schemas.microsoft.com/office/word/2020/wordml/sdtdatahash" xmlns:w16sdtfl="http://schemas.microsoft.com/office/word/2024/wordml/sdtformatlock" xmlns:w16se="http://schemas.microsoft.com/office/word/2015/wordml/symex" xmlns:wpg="http://schemas.microsoft.com/office/word/2010/wordprocessingGroup" xmlns:wpi="http://schemas.microsoft.com/office/word/2010/wordprocessingInk" xmlns:wne="http://schemas.microsoft.com/office/word/2006/wordml" xmlns:wps="http://schemas.microsoft.com/office/word/2010/wordprocessingShape" mc:Ignorable="w14 w15 w16se w16cid w16 w16cex w16sdtdh w16sdtfl w16du wp14">
   <w:body>
     <w:p>
       <w:pPr>
@@ -167,7 +167,7 @@
       </w:tr>
       <w:tr>
         <w:trPr>
-          <w:trHeight w:val="1247"/>
+          <w:trHeight w:val="1334"/>
         </w:trPr>
         <w:tc>
           <w:tcPr>
@@ -449,7 +449,7 @@
       </w:tr>
       <w:tr>
         <w:trPr>
-          <w:trHeight w:val="1251"/>
+          <w:trHeight w:val="1409"/>
         </w:trPr>
         <w:tc>
           <w:tcPr>
@@ -971,7 +971,7 @@
       </w:tr>
       <w:tr>
         <w:trPr>
-          <w:trHeight w:val="1275"/>
+          <w:trHeight w:val="1407"/>
         </w:trPr>
         <w:tc>
           <w:tcPr>
@@ -1225,7 +1225,7 @@
       </w:tr>
       <w:tr>
         <w:trPr>
-          <w:trHeight w:val="1408"/>
+          <w:trHeight w:val="3243"/>
         </w:trPr>
         <w:tc>
           <w:tcPr>
@@ -1402,7 +1402,6 @@
                 <w:szCs w:val="32"/>
                 <w:lang w:bidi="ta-IN"/>
               </w:rPr>
-              <w:lastRenderedPageBreak/>
               <w:t>Middle page</w:t>
             </w:r>
           </w:p>
@@ -1436,7 +1435,6 @@
                 <w:sz w:val="36"/>
                 <w:szCs w:val="36"/>
               </w:rPr>
-              <w:lastRenderedPageBreak/>
               <w:t xml:space="preserve">di— Bizp–Z§¥KhõJ— | </w:t>
             </w:r>
           </w:p>
@@ -1574,7 +1572,6 @@
                 <w:sz w:val="36"/>
                 <w:szCs w:val="36"/>
               </w:rPr>
-              <w:lastRenderedPageBreak/>
               <w:t>kz–ky–</w:t>
             </w:r>
             <w:r>
@@ -1633,7 +1630,6 @@
                 <w:sz w:val="36"/>
                 <w:szCs w:val="36"/>
               </w:rPr>
-              <w:lastRenderedPageBreak/>
               <w:t xml:space="preserve">di— Bizp–Z§¥KhõJ— | </w:t>
             </w:r>
           </w:p>
@@ -1767,7 +1763,6 @@
                 <w:sz w:val="36"/>
                 <w:szCs w:val="36"/>
               </w:rPr>
-              <w:lastRenderedPageBreak/>
               <w:t>kz–ky–</w:t>
             </w:r>
             <w:r>
@@ -1820,7 +1815,6 @@
           <w:szCs w:val="32"/>
           <w:u w:val="single"/>
         </w:rPr>
-        <w:lastRenderedPageBreak/>
         <w:t>=================</w:t>
       </w:r>
     </w:p>
@@ -3172,7 +3166,6 @@
                 <w:szCs w:val="28"/>
                 <w:lang w:val="it-IT"/>
               </w:rPr>
-              <w:lastRenderedPageBreak/>
               <w:t>8.1 Mano jyotiH</w:t>
             </w:r>
           </w:p>
@@ -4718,7 +4711,6 @@
                 <w:szCs w:val="28"/>
                 <w:lang w:val="it-IT"/>
               </w:rPr>
-              <w:lastRenderedPageBreak/>
               <w:t>9.7 Panchaa~ga rudraH</w:t>
             </w:r>
           </w:p>
@@ -6480,7 +6472,6 @@
                 <w:sz w:val="28"/>
                 <w:szCs w:val="28"/>
               </w:rPr>
-              <w:lastRenderedPageBreak/>
               <w:t>16.4  rudra</w:t>
             </w:r>
             <w:proofErr w:type="gramEnd"/>
@@ -7831,7 +7822,6 @@
                 <w:szCs w:val="28"/>
                 <w:lang w:val="it-IT"/>
               </w:rPr>
-              <w:lastRenderedPageBreak/>
               <w:t>9.1 Shiva Samkalpam</w:t>
             </w:r>
           </w:p>
@@ -9619,7 +9609,6 @@
                 <w:sz w:val="28"/>
                 <w:szCs w:val="28"/>
               </w:rPr>
-              <w:lastRenderedPageBreak/>
               <w:t>Item No - 14.</w:t>
             </w:r>
             <w:r>
@@ -11454,7 +11443,6 @@
                 <w:sz w:val="28"/>
                 <w:szCs w:val="28"/>
               </w:rPr>
-              <w:lastRenderedPageBreak/>
               <w:t>Rudra Kramam</w:t>
             </w:r>
           </w:p>
@@ -12863,7 +12851,6 @@
           <w:szCs w:val="32"/>
           <w:u w:val="single"/>
         </w:rPr>
-        <w:lastRenderedPageBreak/>
         <w:t>Shiva Stuti Malayalam Book</w:t>
       </w:r>
       <w:r>
@@ -14162,7 +14149,6 @@
                 <w:sz w:val="28"/>
                 <w:szCs w:val="28"/>
               </w:rPr>
-              <w:lastRenderedPageBreak/>
               <w:t xml:space="preserve">3.6.9 </w:t>
             </w:r>
           </w:p>
@@ -14205,7 +14191,6 @@
                 <w:sz w:val="36"/>
                 <w:szCs w:val="36"/>
               </w:rPr>
-              <w:lastRenderedPageBreak/>
               <w:t>Kyºy</w:t>
             </w:r>
             <w:r>
@@ -14276,7 +14261,6 @@
                 <w:sz w:val="36"/>
                 <w:szCs w:val="36"/>
               </w:rPr>
-              <w:lastRenderedPageBreak/>
               <w:t>Kyºy</w:t>
             </w:r>
             <w:r>
@@ -14377,7 +14361,6 @@
                 <w:sz w:val="28"/>
                 <w:szCs w:val="28"/>
               </w:rPr>
-              <w:lastRenderedPageBreak/>
               <w:t xml:space="preserve">3.6.14, </w:t>
             </w:r>
           </w:p>
@@ -15878,7 +15861,6 @@
                 <w:szCs w:val="28"/>
                 <w:lang w:val="it-IT"/>
               </w:rPr>
-              <w:lastRenderedPageBreak/>
               <w:t>18. Swahakaara Mantra</w:t>
             </w:r>
           </w:p>
@@ -17273,7 +17255,6 @@
                 <w:sz w:val="28"/>
                 <w:szCs w:val="28"/>
               </w:rPr>
-              <w:lastRenderedPageBreak/>
               <w:t>Abisheka teertha praashanam</w:t>
             </w:r>
           </w:p>
@@ -17313,7 +17294,6 @@
                 <w:sz w:val="36"/>
                 <w:szCs w:val="36"/>
               </w:rPr>
-              <w:lastRenderedPageBreak/>
               <w:t>sª</w:t>
             </w:r>
             <w:r>
@@ -17372,7 +17352,6 @@
                 <w:sz w:val="36"/>
                 <w:szCs w:val="36"/>
               </w:rPr>
-              <w:lastRenderedPageBreak/>
               <w:t>sª</w:t>
             </w:r>
             <w:r>
@@ -17422,7 +17401,6 @@
                 <w:sz w:val="28"/>
                 <w:szCs w:val="28"/>
               </w:rPr>
-              <w:lastRenderedPageBreak/>
               <w:t>20.1.3</w:t>
             </w:r>
           </w:p>
@@ -18787,7 +18765,6 @@
                 <w:sz w:val="28"/>
                 <w:szCs w:val="28"/>
               </w:rPr>
-              <w:lastRenderedPageBreak/>
               <w:t xml:space="preserve">16.1 Rudra Krama padaH, </w:t>
             </w:r>
           </w:p>
@@ -20427,7 +20404,6 @@
                 <w:sz w:val="28"/>
                 <w:szCs w:val="28"/>
               </w:rPr>
-              <w:lastRenderedPageBreak/>
               <w:t>17.</w:t>
             </w:r>
             <w:r>
@@ -21875,7 +21851,6 @@
                 <w:sz w:val="36"/>
                 <w:szCs w:val="36"/>
               </w:rPr>
-              <w:lastRenderedPageBreak/>
               <w:t>Z</w:t>
             </w:r>
             <w:r>
@@ -21923,7 +21898,6 @@
                 <w:sz w:val="28"/>
                 <w:szCs w:val="28"/>
               </w:rPr>
-              <w:lastRenderedPageBreak/>
               <w:t>(OM not required)</w:t>
             </w:r>
           </w:p>
@@ -23403,7 +23377,6 @@
                 <w:szCs w:val="36"/>
                 <w:lang w:val="en-IN" w:eastAsia="en-IN" w:bidi="ml-IN"/>
               </w:rPr>
-              <w:lastRenderedPageBreak/>
               <w:t>F–</w:t>
             </w:r>
             <w:r>
@@ -23465,7 +23438,6 @@
                 <w:szCs w:val="36"/>
                 <w:lang w:val="en-IN" w:eastAsia="en-IN" w:bidi="ml-IN"/>
               </w:rPr>
-              <w:lastRenderedPageBreak/>
               <w:t>F–</w:t>
             </w:r>
             <w:r>
@@ -23542,7 +23514,6 @@
                 <w:szCs w:val="36"/>
                 <w:lang w:val="en-IN" w:eastAsia="en-IN" w:bidi="ml-IN"/>
               </w:rPr>
-              <w:lastRenderedPageBreak/>
               <w:t>F–</w:t>
             </w:r>
             <w:r>
@@ -23609,7 +23580,6 @@
                 <w:szCs w:val="28"/>
                 <w:u w:val="single"/>
               </w:rPr>
-              <w:lastRenderedPageBreak/>
               <w:t>9.2</w:t>
             </w:r>
             <w:r>
@@ -24847,7 +24817,6 @@
                 <w:szCs w:val="36"/>
                 <w:lang w:val="en-IN" w:eastAsia="en-IN" w:bidi="ml-IN"/>
               </w:rPr>
-              <w:lastRenderedPageBreak/>
               <w:t>s¡p–ªYk—</w:t>
             </w:r>
             <w:r>
@@ -24900,7 +24869,6 @@
                 <w:szCs w:val="36"/>
                 <w:lang w:val="en-IN" w:eastAsia="en-IN" w:bidi="ml-IN"/>
               </w:rPr>
-              <w:lastRenderedPageBreak/>
               <w:t xml:space="preserve">tky—YzI </w:t>
             </w:r>
           </w:p>
@@ -24925,7 +24893,6 @@
                 <w:szCs w:val="36"/>
                 <w:lang w:val="en-IN" w:eastAsia="en-IN" w:bidi="ml-IN"/>
               </w:rPr>
-              <w:lastRenderedPageBreak/>
               <w:t>s¡p–ªYk—</w:t>
             </w:r>
             <w:r>
@@ -24974,7 +24941,6 @@
                 <w:szCs w:val="28"/>
                 <w:u w:val="single"/>
               </w:rPr>
-              <w:lastRenderedPageBreak/>
               <w:t>12.2.9</w:t>
             </w:r>
           </w:p>
@@ -26207,7 +26173,6 @@
                 <w:sz w:val="28"/>
                 <w:szCs w:val="28"/>
               </w:rPr>
-              <w:lastRenderedPageBreak/>
               <w:t>Again in 12.12</w:t>
             </w:r>
           </w:p>
@@ -26266,7 +26231,6 @@
                 <w:highlight w:val="yellow"/>
                 <w:lang w:val="en-IN" w:eastAsia="en-IN" w:bidi="ml-IN"/>
               </w:rPr>
-              <w:lastRenderedPageBreak/>
               <w:t>öZy</w:t>
             </w:r>
             <w:r>
@@ -26304,7 +26268,6 @@
                 <w:highlight w:val="yellow"/>
                 <w:lang w:val="en-IN" w:eastAsia="en-IN" w:bidi="ml-IN"/>
               </w:rPr>
-              <w:lastRenderedPageBreak/>
               <w:t>qI— P</w:t>
             </w:r>
             <w:r>
@@ -26381,7 +26344,6 @@
                 <w:highlight w:val="green"/>
                 <w:u w:val="single"/>
               </w:rPr>
-              <w:lastRenderedPageBreak/>
               <w:t>Z</w:t>
             </w:r>
             <w:r>
@@ -26428,7 +26390,6 @@
                 <w:highlight w:val="green"/>
                 <w:lang w:val="en-IN" w:eastAsia="en-IN" w:bidi="ml-IN"/>
               </w:rPr>
-              <w:lastRenderedPageBreak/>
               <w:t>qI P</w:t>
             </w:r>
             <w:r>
@@ -26520,7 +26481,6 @@
                 <w:szCs w:val="24"/>
                 <w:u w:val="single"/>
               </w:rPr>
-              <w:lastRenderedPageBreak/>
               <w:t>12.8 Anuvaakam 5</w:t>
             </w:r>
           </w:p>
@@ -27646,7 +27606,6 @@
                 <w:szCs w:val="28"/>
                 <w:lang w:bidi="ml-IN"/>
               </w:rPr>
-              <w:lastRenderedPageBreak/>
               <w:t xml:space="preserve">upacarams like </w:t>
             </w:r>
           </w:p>
@@ -27739,7 +27698,6 @@
                 <w:szCs w:val="36"/>
                 <w:lang w:val="en-IN" w:eastAsia="en-IN" w:bidi="ml-IN"/>
               </w:rPr>
-              <w:lastRenderedPageBreak/>
               <w:t>BpxtyZx</w:t>
             </w:r>
             <w:r>
@@ -29193,7 +29151,6 @@
                 <w:sz w:val="28"/>
                 <w:szCs w:val="28"/>
               </w:rPr>
-              <w:lastRenderedPageBreak/>
               <w:t>16.9 Rudra Kramam</w:t>
             </w:r>
           </w:p>
@@ -30431,7 +30388,6 @@
                 <w:sz w:val="28"/>
                 <w:szCs w:val="28"/>
               </w:rPr>
-              <w:lastRenderedPageBreak/>
               <w:t>17.7 Chamaka Kramam</w:t>
             </w:r>
           </w:p>
@@ -32008,7 +31964,6 @@
                 <w:szCs w:val="36"/>
                 <w:lang w:val="en-IN" w:eastAsia="en-IN" w:bidi="ml-IN"/>
               </w:rPr>
-              <w:lastRenderedPageBreak/>
               <w:t>bypyr</w:t>
             </w:r>
             <w:r>
@@ -32072,7 +32027,6 @@
                 <w:szCs w:val="36"/>
                 <w:lang w:val="en-IN" w:eastAsia="en-IN" w:bidi="ml-IN"/>
               </w:rPr>
-              <w:lastRenderedPageBreak/>
               <w:t>e£aypz</w:t>
             </w:r>
             <w:r>
@@ -32201,7 +32155,6 @@
                 <w:szCs w:val="36"/>
                 <w:lang w:val="en-IN" w:eastAsia="en-IN" w:bidi="ml-IN"/>
               </w:rPr>
-              <w:lastRenderedPageBreak/>
               <w:t>bypyr</w:t>
             </w:r>
             <w:r>
@@ -32267,7 +32220,6 @@
                 <w:sz w:val="28"/>
                 <w:szCs w:val="28"/>
               </w:rPr>
-              <w:lastRenderedPageBreak/>
               <w:t>19.1.2 and 19.4.2</w:t>
             </w:r>
           </w:p>
@@ -33665,7 +33617,6 @@
                 <w:sz w:val="28"/>
                 <w:szCs w:val="28"/>
               </w:rPr>
-              <w:lastRenderedPageBreak/>
               <w:t>Convention dropped</w:t>
             </w:r>
           </w:p>
@@ -34144,7 +34095,6 @@
           <w:szCs w:val="32"/>
           <w:u w:val="single"/>
         </w:rPr>
-        <w:lastRenderedPageBreak/>
         <w:t>Malayalam Shiva Stuti Book</w:t>
       </w:r>
       <w:r>
@@ -35364,7 +35314,6 @@
                 <w:sz w:val="28"/>
                 <w:szCs w:val="28"/>
               </w:rPr>
-              <w:lastRenderedPageBreak/>
               <w:t>Section 12.4 Upacharam (snanam)</w:t>
             </w:r>
           </w:p>
@@ -36468,7 +36417,6 @@
                 <w:sz w:val="32"/>
                 <w:szCs w:val="32"/>
               </w:rPr>
-              <w:lastRenderedPageBreak/>
               <w:t>Section 19.1.8 and 19.4.8 after Mantra Pushpam</w:t>
             </w:r>
           </w:p>
@@ -36659,7 +36607,7 @@
 </file>
 
 <file path=word/endnotes.xml><?xml version="1.0" encoding="utf-8"?>
-<w:endnotes xmlns:wpc="http://schemas.microsoft.com/office/word/2010/wordprocessingCanvas" xmlns:cx="http://schemas.microsoft.com/office/drawing/2014/chartex" xmlns:cx1="http://schemas.microsoft.com/office/drawing/2015/9/8/chartex" xmlns:cx2="http://schemas.microsoft.com/office/drawing/2015/10/21/chartex" xmlns:cx3="http://schemas.microsoft.com/office/drawing/2016/5/9/chartex" xmlns:cx4="http://schemas.microsoft.com/office/drawing/2016/5/10/chartex" xmlns:cx5="http://schemas.microsoft.com/office/drawing/2016/5/11/chartex" xmlns:cx6="http://schemas.microsoft.com/office/drawing/2016/5/12/chartex" xmlns:cx7="http://schemas.microsoft.com/office/drawing/2016/5/13/chartex" xmlns:cx8="http://schemas.microsoft.com/office/drawing/2016/5/14/chartex" xmlns:mc="http://schemas.openxmlformats.org/markup-compatibility/2006" xmlns:aink="http://schemas.microsoft.com/office/drawing/2016/ink" xmlns:am3d="http://schemas.microsoft.com/office/drawing/2017/model3d" xmlns:o="urn:schemas-microsoft-com:office:office" xmlns:oel="http://schemas.microsoft.com/office/2019/extlst" xmlns:r="http://schemas.openxmlformats.org/officeDocument/2006/relationships" xmlns:m="http://schemas.openxmlformats.org/officeDocument/2006/math" xmlns:v="urn:schemas-microsoft-com:vml" xmlns:wp14="http://schemas.microsoft.com/office/word/2010/wordprocessingDrawing" xmlns:wp="http://schemas.openxmlformats.org/drawingml/2006/wordprocessingDrawing" xmlns:w10="urn:schemas-microsoft-com:office:word" xmlns:w="http://schemas.openxmlformats.org/wordprocessingml/2006/main" xmlns:w14="http://schemas.microsoft.com/office/word/2010/wordml" xmlns:w15="http://schemas.microsoft.com/office/word/2012/wordml" xmlns:w16cex="http://schemas.microsoft.com/office/word/2018/wordml/cex" xmlns:w16cid="http://schemas.microsoft.com/office/word/2016/wordml/cid" xmlns:w16="http://schemas.microsoft.com/office/word/2018/wordml" xmlns:w16du="http://schemas.microsoft.com/office/word/2023/wordml/word16du" xmlns:w16sdtdh="http://schemas.microsoft.com/office/word/2020/wordml/sdtdatahash" xmlns:w16se="http://schemas.microsoft.com/office/word/2015/wordml/symex" xmlns:wpg="http://schemas.microsoft.com/office/word/2010/wordprocessingGroup" xmlns:wpi="http://schemas.microsoft.com/office/word/2010/wordprocessingInk" xmlns:wne="http://schemas.microsoft.com/office/word/2006/wordml" xmlns:wps="http://schemas.microsoft.com/office/word/2010/wordprocessingShape" mc:Ignorable="w14 w15 w16se w16cid w16 w16cex w16sdtdh w16du wp14">
+<w:endnotes xmlns:wpc="http://schemas.microsoft.com/office/word/2010/wordprocessingCanvas" xmlns:cx="http://schemas.microsoft.com/office/drawing/2014/chartex" xmlns:cx1="http://schemas.microsoft.com/office/drawing/2015/9/8/chartex" xmlns:cx2="http://schemas.microsoft.com/office/drawing/2015/10/21/chartex" xmlns:cx3="http://schemas.microsoft.com/office/drawing/2016/5/9/chartex" xmlns:cx4="http://schemas.microsoft.com/office/drawing/2016/5/10/chartex" xmlns:cx5="http://schemas.microsoft.com/office/drawing/2016/5/11/chartex" xmlns:cx6="http://schemas.microsoft.com/office/drawing/2016/5/12/chartex" xmlns:cx7="http://schemas.microsoft.com/office/drawing/2016/5/13/chartex" xmlns:cx8="http://schemas.microsoft.com/office/drawing/2016/5/14/chartex" xmlns:mc="http://schemas.openxmlformats.org/markup-compatibility/2006" xmlns:aink="http://schemas.microsoft.com/office/drawing/2016/ink" xmlns:am3d="http://schemas.microsoft.com/office/drawing/2017/model3d" xmlns:o="urn:schemas-microsoft-com:office:office" xmlns:oel="http://schemas.microsoft.com/office/2019/extlst" xmlns:r="http://schemas.openxmlformats.org/officeDocument/2006/relationships" xmlns:m="http://schemas.openxmlformats.org/officeDocument/2006/math" xmlns:v="urn:schemas-microsoft-com:vml" xmlns:wp14="http://schemas.microsoft.com/office/word/2010/wordprocessingDrawing" xmlns:wp="http://schemas.openxmlformats.org/drawingml/2006/wordprocessingDrawing" xmlns:w10="urn:schemas-microsoft-com:office:word" xmlns:w="http://schemas.openxmlformats.org/wordprocessingml/2006/main" xmlns:w14="http://schemas.microsoft.com/office/word/2010/wordml" xmlns:w15="http://schemas.microsoft.com/office/word/2012/wordml" xmlns:w16cex="http://schemas.microsoft.com/office/word/2018/wordml/cex" xmlns:w16cid="http://schemas.microsoft.com/office/word/2016/wordml/cid" xmlns:w16="http://schemas.microsoft.com/office/word/2018/wordml" xmlns:w16du="http://schemas.microsoft.com/office/word/2023/wordml/word16du" xmlns:w16sdtdh="http://schemas.microsoft.com/office/word/2020/wordml/sdtdatahash" xmlns:w16sdtfl="http://schemas.microsoft.com/office/word/2024/wordml/sdtformatlock" xmlns:w16se="http://schemas.microsoft.com/office/word/2015/wordml/symex" xmlns:wpg="http://schemas.microsoft.com/office/word/2010/wordprocessingGroup" xmlns:wpi="http://schemas.microsoft.com/office/word/2010/wordprocessingInk" xmlns:wne="http://schemas.microsoft.com/office/word/2006/wordml" xmlns:wps="http://schemas.microsoft.com/office/word/2010/wordprocessingShape" mc:Ignorable="w14 w15 w16se w16cid w16 w16cex w16sdtdh w16sdtfl w16du wp14">
   <w:endnote w:type="separator" w:id="-1">
     <w:p>
       <w:pPr>
@@ -36684,7 +36632,7 @@
 </file>
 
 <file path=word/footer1.xml><?xml version="1.0" encoding="utf-8"?>
-<w:ftr xmlns:wpc="http://schemas.microsoft.com/office/word/2010/wordprocessingCanvas" xmlns:cx="http://schemas.microsoft.com/office/drawing/2014/chartex" xmlns:cx1="http://schemas.microsoft.com/office/drawing/2015/9/8/chartex" xmlns:cx2="http://schemas.microsoft.com/office/drawing/2015/10/21/chartex" xmlns:cx3="http://schemas.microsoft.com/office/drawing/2016/5/9/chartex" xmlns:cx4="http://schemas.microsoft.com/office/drawing/2016/5/10/chartex" xmlns:cx5="http://schemas.microsoft.com/office/drawing/2016/5/11/chartex" xmlns:cx6="http://schemas.microsoft.com/office/drawing/2016/5/12/chartex" xmlns:cx7="http://schemas.microsoft.com/office/drawing/2016/5/13/chartex" xmlns:cx8="http://schemas.microsoft.com/office/drawing/2016/5/14/chartex" xmlns:mc="http://schemas.openxmlformats.org/markup-compatibility/2006" xmlns:aink="http://schemas.microsoft.com/office/drawing/2016/ink" xmlns:am3d="http://schemas.microsoft.com/office/drawing/2017/model3d" xmlns:o="urn:schemas-microsoft-com:office:office" xmlns:oel="http://schemas.microsoft.com/office/2019/extlst" xmlns:r="http://schemas.openxmlformats.org/officeDocument/2006/relationships" xmlns:m="http://schemas.openxmlformats.org/officeDocument/2006/math" xmlns:v="urn:schemas-microsoft-com:vml" xmlns:wp14="http://schemas.microsoft.com/office/word/2010/wordprocessingDrawing" xmlns:wp="http://schemas.openxmlformats.org/drawingml/2006/wordprocessingDrawing" xmlns:w10="urn:schemas-microsoft-com:office:word" xmlns:w="http://schemas.openxmlformats.org/wordprocessingml/2006/main" xmlns:w14="http://schemas.microsoft.com/office/word/2010/wordml" xmlns:w15="http://schemas.microsoft.com/office/word/2012/wordml" xmlns:w16cex="http://schemas.microsoft.com/office/word/2018/wordml/cex" xmlns:w16cid="http://schemas.microsoft.com/office/word/2016/wordml/cid" xmlns:w16="http://schemas.microsoft.com/office/word/2018/wordml" xmlns:w16du="http://schemas.microsoft.com/office/word/2023/wordml/word16du" xmlns:w16sdtdh="http://schemas.microsoft.com/office/word/2020/wordml/sdtdatahash" xmlns:w16se="http://schemas.microsoft.com/office/word/2015/wordml/symex" xmlns:wpg="http://schemas.microsoft.com/office/word/2010/wordprocessingGroup" xmlns:wpi="http://schemas.microsoft.com/office/word/2010/wordprocessingInk" xmlns:wne="http://schemas.microsoft.com/office/word/2006/wordml" xmlns:wps="http://schemas.microsoft.com/office/word/2010/wordprocessingShape" mc:Ignorable="w14 w15 w16se w16cid w16 w16cex w16sdtdh w16du wp14">
+<w:ftr xmlns:wpc="http://schemas.microsoft.com/office/word/2010/wordprocessingCanvas" xmlns:cx="http://schemas.microsoft.com/office/drawing/2014/chartex" xmlns:cx1="http://schemas.microsoft.com/office/drawing/2015/9/8/chartex" xmlns:cx2="http://schemas.microsoft.com/office/drawing/2015/10/21/chartex" xmlns:cx3="http://schemas.microsoft.com/office/drawing/2016/5/9/chartex" xmlns:cx4="http://schemas.microsoft.com/office/drawing/2016/5/10/chartex" xmlns:cx5="http://schemas.microsoft.com/office/drawing/2016/5/11/chartex" xmlns:cx6="http://schemas.microsoft.com/office/drawing/2016/5/12/chartex" xmlns:cx7="http://schemas.microsoft.com/office/drawing/2016/5/13/chartex" xmlns:cx8="http://schemas.microsoft.com/office/drawing/2016/5/14/chartex" xmlns:mc="http://schemas.openxmlformats.org/markup-compatibility/2006" xmlns:aink="http://schemas.microsoft.com/office/drawing/2016/ink" xmlns:am3d="http://schemas.microsoft.com/office/drawing/2017/model3d" xmlns:o="urn:schemas-microsoft-com:office:office" xmlns:oel="http://schemas.microsoft.com/office/2019/extlst" xmlns:r="http://schemas.openxmlformats.org/officeDocument/2006/relationships" xmlns:m="http://schemas.openxmlformats.org/officeDocument/2006/math" xmlns:v="urn:schemas-microsoft-com:vml" xmlns:wp14="http://schemas.microsoft.com/office/word/2010/wordprocessingDrawing" xmlns:wp="http://schemas.openxmlformats.org/drawingml/2006/wordprocessingDrawing" xmlns:w10="urn:schemas-microsoft-com:office:word" xmlns:w="http://schemas.openxmlformats.org/wordprocessingml/2006/main" xmlns:w14="http://schemas.microsoft.com/office/word/2010/wordml" xmlns:w15="http://schemas.microsoft.com/office/word/2012/wordml" xmlns:w16cex="http://schemas.microsoft.com/office/word/2018/wordml/cex" xmlns:w16cid="http://schemas.microsoft.com/office/word/2016/wordml/cid" xmlns:w16="http://schemas.microsoft.com/office/word/2018/wordml" xmlns:w16du="http://schemas.microsoft.com/office/word/2023/wordml/word16du" xmlns:w16sdtdh="http://schemas.microsoft.com/office/word/2020/wordml/sdtdatahash" xmlns:w16sdtfl="http://schemas.microsoft.com/office/word/2024/wordml/sdtformatlock" xmlns:w16se="http://schemas.microsoft.com/office/word/2015/wordml/symex" xmlns:wpg="http://schemas.microsoft.com/office/word/2010/wordprocessingGroup" xmlns:wpi="http://schemas.microsoft.com/office/word/2010/wordprocessingInk" xmlns:wne="http://schemas.microsoft.com/office/word/2006/wordml" xmlns:wps="http://schemas.microsoft.com/office/word/2010/wordprocessingShape" mc:Ignorable="w14 w15 w16se w16cid w16 w16cex w16sdtdh w16sdtfl w16du wp14">
   <w:p>
     <w:pPr>
       <w:pStyle w:val="Footer"/>
@@ -36814,7 +36762,7 @@
 </file>
 
 <file path=word/footer2.xml><?xml version="1.0" encoding="utf-8"?>
-<w:ftr xmlns:wpc="http://schemas.microsoft.com/office/word/2010/wordprocessingCanvas" xmlns:cx="http://schemas.microsoft.com/office/drawing/2014/chartex" xmlns:cx1="http://schemas.microsoft.com/office/drawing/2015/9/8/chartex" xmlns:cx2="http://schemas.microsoft.com/office/drawing/2015/10/21/chartex" xmlns:cx3="http://schemas.microsoft.com/office/drawing/2016/5/9/chartex" xmlns:cx4="http://schemas.microsoft.com/office/drawing/2016/5/10/chartex" xmlns:cx5="http://schemas.microsoft.com/office/drawing/2016/5/11/chartex" xmlns:cx6="http://schemas.microsoft.com/office/drawing/2016/5/12/chartex" xmlns:cx7="http://schemas.microsoft.com/office/drawing/2016/5/13/chartex" xmlns:cx8="http://schemas.microsoft.com/office/drawing/2016/5/14/chartex" xmlns:mc="http://schemas.openxmlformats.org/markup-compatibility/2006" xmlns:aink="http://schemas.microsoft.com/office/drawing/2016/ink" xmlns:am3d="http://schemas.microsoft.com/office/drawing/2017/model3d" xmlns:o="urn:schemas-microsoft-com:office:office" xmlns:oel="http://schemas.microsoft.com/office/2019/extlst" xmlns:r="http://schemas.openxmlformats.org/officeDocument/2006/relationships" xmlns:m="http://schemas.openxmlformats.org/officeDocument/2006/math" xmlns:v="urn:schemas-microsoft-com:vml" xmlns:wp14="http://schemas.microsoft.com/office/word/2010/wordprocessingDrawing" xmlns:wp="http://schemas.openxmlformats.org/drawingml/2006/wordprocessingDrawing" xmlns:w10="urn:schemas-microsoft-com:office:word" xmlns:w="http://schemas.openxmlformats.org/wordprocessingml/2006/main" xmlns:w14="http://schemas.microsoft.com/office/word/2010/wordml" xmlns:w15="http://schemas.microsoft.com/office/word/2012/wordml" xmlns:w16cex="http://schemas.microsoft.com/office/word/2018/wordml/cex" xmlns:w16cid="http://schemas.microsoft.com/office/word/2016/wordml/cid" xmlns:w16="http://schemas.microsoft.com/office/word/2018/wordml" xmlns:w16du="http://schemas.microsoft.com/office/word/2023/wordml/word16du" xmlns:w16sdtdh="http://schemas.microsoft.com/office/word/2020/wordml/sdtdatahash" xmlns:w16se="http://schemas.microsoft.com/office/word/2015/wordml/symex" xmlns:wpg="http://schemas.microsoft.com/office/word/2010/wordprocessingGroup" xmlns:wpi="http://schemas.microsoft.com/office/word/2010/wordprocessingInk" xmlns:wne="http://schemas.microsoft.com/office/word/2006/wordml" xmlns:wps="http://schemas.microsoft.com/office/word/2010/wordprocessingShape" mc:Ignorable="w14 w15 w16se w16cid w16 w16cex w16sdtdh w16du wp14">
+<w:ftr xmlns:wpc="http://schemas.microsoft.com/office/word/2010/wordprocessingCanvas" xmlns:cx="http://schemas.microsoft.com/office/drawing/2014/chartex" xmlns:cx1="http://schemas.microsoft.com/office/drawing/2015/9/8/chartex" xmlns:cx2="http://schemas.microsoft.com/office/drawing/2015/10/21/chartex" xmlns:cx3="http://schemas.microsoft.com/office/drawing/2016/5/9/chartex" xmlns:cx4="http://schemas.microsoft.com/office/drawing/2016/5/10/chartex" xmlns:cx5="http://schemas.microsoft.com/office/drawing/2016/5/11/chartex" xmlns:cx6="http://schemas.microsoft.com/office/drawing/2016/5/12/chartex" xmlns:cx7="http://schemas.microsoft.com/office/drawing/2016/5/13/chartex" xmlns:cx8="http://schemas.microsoft.com/office/drawing/2016/5/14/chartex" xmlns:mc="http://schemas.openxmlformats.org/markup-compatibility/2006" xmlns:aink="http://schemas.microsoft.com/office/drawing/2016/ink" xmlns:am3d="http://schemas.microsoft.com/office/drawing/2017/model3d" xmlns:o="urn:schemas-microsoft-com:office:office" xmlns:oel="http://schemas.microsoft.com/office/2019/extlst" xmlns:r="http://schemas.openxmlformats.org/officeDocument/2006/relationships" xmlns:m="http://schemas.openxmlformats.org/officeDocument/2006/math" xmlns:v="urn:schemas-microsoft-com:vml" xmlns:wp14="http://schemas.microsoft.com/office/word/2010/wordprocessingDrawing" xmlns:wp="http://schemas.openxmlformats.org/drawingml/2006/wordprocessingDrawing" xmlns:w10="urn:schemas-microsoft-com:office:word" xmlns:w="http://schemas.openxmlformats.org/wordprocessingml/2006/main" xmlns:w14="http://schemas.microsoft.com/office/word/2010/wordml" xmlns:w15="http://schemas.microsoft.com/office/word/2012/wordml" xmlns:w16cex="http://schemas.microsoft.com/office/word/2018/wordml/cex" xmlns:w16cid="http://schemas.microsoft.com/office/word/2016/wordml/cid" xmlns:w16="http://schemas.microsoft.com/office/word/2018/wordml" xmlns:w16du="http://schemas.microsoft.com/office/word/2023/wordml/word16du" xmlns:w16sdtdh="http://schemas.microsoft.com/office/word/2020/wordml/sdtdatahash" xmlns:w16sdtfl="http://schemas.microsoft.com/office/word/2024/wordml/sdtformatlock" xmlns:w16se="http://schemas.microsoft.com/office/word/2015/wordml/symex" xmlns:wpg="http://schemas.microsoft.com/office/word/2010/wordprocessingGroup" xmlns:wpi="http://schemas.microsoft.com/office/word/2010/wordprocessingInk" xmlns:wne="http://schemas.microsoft.com/office/word/2006/wordml" xmlns:wps="http://schemas.microsoft.com/office/word/2010/wordprocessingShape" mc:Ignorable="w14 w15 w16se w16cid w16 w16cex w16sdtdh w16sdtfl w16du wp14">
   <w:p>
     <w:pPr>
       <w:pBdr>
@@ -37004,7 +36952,7 @@
 </file>
 
 <file path=word/footnotes.xml><?xml version="1.0" encoding="utf-8"?>
-<w:footnotes xmlns:wpc="http://schemas.microsoft.com/office/word/2010/wordprocessingCanvas" xmlns:cx="http://schemas.microsoft.com/office/drawing/2014/chartex" xmlns:cx1="http://schemas.microsoft.com/office/drawing/2015/9/8/chartex" xmlns:cx2="http://schemas.microsoft.com/office/drawing/2015/10/21/chartex" xmlns:cx3="http://schemas.microsoft.com/office/drawing/2016/5/9/chartex" xmlns:cx4="http://schemas.microsoft.com/office/drawing/2016/5/10/chartex" xmlns:cx5="http://schemas.microsoft.com/office/drawing/2016/5/11/chartex" xmlns:cx6="http://schemas.microsoft.com/office/drawing/2016/5/12/chartex" xmlns:cx7="http://schemas.microsoft.com/office/drawing/2016/5/13/chartex" xmlns:cx8="http://schemas.microsoft.com/office/drawing/2016/5/14/chartex" xmlns:mc="http://schemas.openxmlformats.org/markup-compatibility/2006" xmlns:aink="http://schemas.microsoft.com/office/drawing/2016/ink" xmlns:am3d="http://schemas.microsoft.com/office/drawing/2017/model3d" xmlns:o="urn:schemas-microsoft-com:office:office" xmlns:oel="http://schemas.microsoft.com/office/2019/extlst" xmlns:r="http://schemas.openxmlformats.org/officeDocument/2006/relationships" xmlns:m="http://schemas.openxmlformats.org/officeDocument/2006/math" xmlns:v="urn:schemas-microsoft-com:vml" xmlns:wp14="http://schemas.microsoft.com/office/word/2010/wordprocessingDrawing" xmlns:wp="http://schemas.openxmlformats.org/drawingml/2006/wordprocessingDrawing" xmlns:w10="urn:schemas-microsoft-com:office:word" xmlns:w="http://schemas.openxmlformats.org/wordprocessingml/2006/main" xmlns:w14="http://schemas.microsoft.com/office/word/2010/wordml" xmlns:w15="http://schemas.microsoft.com/office/word/2012/wordml" xmlns:w16cex="http://schemas.microsoft.com/office/word/2018/wordml/cex" xmlns:w16cid="http://schemas.microsoft.com/office/word/2016/wordml/cid" xmlns:w16="http://schemas.microsoft.com/office/word/2018/wordml" xmlns:w16du="http://schemas.microsoft.com/office/word/2023/wordml/word16du" xmlns:w16sdtdh="http://schemas.microsoft.com/office/word/2020/wordml/sdtdatahash" xmlns:w16se="http://schemas.microsoft.com/office/word/2015/wordml/symex" xmlns:wpg="http://schemas.microsoft.com/office/word/2010/wordprocessingGroup" xmlns:wpi="http://schemas.microsoft.com/office/word/2010/wordprocessingInk" xmlns:wne="http://schemas.microsoft.com/office/word/2006/wordml" xmlns:wps="http://schemas.microsoft.com/office/word/2010/wordprocessingShape" mc:Ignorable="w14 w15 w16se w16cid w16 w16cex w16sdtdh w16du wp14">
+<w:footnotes xmlns:wpc="http://schemas.microsoft.com/office/word/2010/wordprocessingCanvas" xmlns:cx="http://schemas.microsoft.com/office/drawing/2014/chartex" xmlns:cx1="http://schemas.microsoft.com/office/drawing/2015/9/8/chartex" xmlns:cx2="http://schemas.microsoft.com/office/drawing/2015/10/21/chartex" xmlns:cx3="http://schemas.microsoft.com/office/drawing/2016/5/9/chartex" xmlns:cx4="http://schemas.microsoft.com/office/drawing/2016/5/10/chartex" xmlns:cx5="http://schemas.microsoft.com/office/drawing/2016/5/11/chartex" xmlns:cx6="http://schemas.microsoft.com/office/drawing/2016/5/12/chartex" xmlns:cx7="http://schemas.microsoft.com/office/drawing/2016/5/13/chartex" xmlns:cx8="http://schemas.microsoft.com/office/drawing/2016/5/14/chartex" xmlns:mc="http://schemas.openxmlformats.org/markup-compatibility/2006" xmlns:aink="http://schemas.microsoft.com/office/drawing/2016/ink" xmlns:am3d="http://schemas.microsoft.com/office/drawing/2017/model3d" xmlns:o="urn:schemas-microsoft-com:office:office" xmlns:oel="http://schemas.microsoft.com/office/2019/extlst" xmlns:r="http://schemas.openxmlformats.org/officeDocument/2006/relationships" xmlns:m="http://schemas.openxmlformats.org/officeDocument/2006/math" xmlns:v="urn:schemas-microsoft-com:vml" xmlns:wp14="http://schemas.microsoft.com/office/word/2010/wordprocessingDrawing" xmlns:wp="http://schemas.openxmlformats.org/drawingml/2006/wordprocessingDrawing" xmlns:w10="urn:schemas-microsoft-com:office:word" xmlns:w="http://schemas.openxmlformats.org/wordprocessingml/2006/main" xmlns:w14="http://schemas.microsoft.com/office/word/2010/wordml" xmlns:w15="http://schemas.microsoft.com/office/word/2012/wordml" xmlns:w16cex="http://schemas.microsoft.com/office/word/2018/wordml/cex" xmlns:w16cid="http://schemas.microsoft.com/office/word/2016/wordml/cid" xmlns:w16="http://schemas.microsoft.com/office/word/2018/wordml" xmlns:w16du="http://schemas.microsoft.com/office/word/2023/wordml/word16du" xmlns:w16sdtdh="http://schemas.microsoft.com/office/word/2020/wordml/sdtdatahash" xmlns:w16sdtfl="http://schemas.microsoft.com/office/word/2024/wordml/sdtformatlock" xmlns:w16se="http://schemas.microsoft.com/office/word/2015/wordml/symex" xmlns:wpg="http://schemas.microsoft.com/office/word/2010/wordprocessingGroup" xmlns:wpi="http://schemas.microsoft.com/office/word/2010/wordprocessingInk" xmlns:wne="http://schemas.microsoft.com/office/word/2006/wordml" xmlns:wps="http://schemas.microsoft.com/office/word/2010/wordprocessingShape" mc:Ignorable="w14 w15 w16se w16cid w16 w16cex w16sdtdh w16sdtfl w16du wp14">
   <w:footnote w:type="separator" w:id="-1">
     <w:p>
       <w:pPr>
@@ -37029,7 +36977,7 @@
 </file>
 
 <file path=word/header1.xml><?xml version="1.0" encoding="utf-8"?>
-<w:hdr xmlns:wpc="http://schemas.microsoft.com/office/word/2010/wordprocessingCanvas" xmlns:cx="http://schemas.microsoft.com/office/drawing/2014/chartex" xmlns:cx1="http://schemas.microsoft.com/office/drawing/2015/9/8/chartex" xmlns:cx2="http://schemas.microsoft.com/office/drawing/2015/10/21/chartex" xmlns:cx3="http://schemas.microsoft.com/office/drawing/2016/5/9/chartex" xmlns:cx4="http://schemas.microsoft.com/office/drawing/2016/5/10/chartex" xmlns:cx5="http://schemas.microsoft.com/office/drawing/2016/5/11/chartex" xmlns:cx6="http://schemas.microsoft.com/office/drawing/2016/5/12/chartex" xmlns:cx7="http://schemas.microsoft.com/office/drawing/2016/5/13/chartex" xmlns:cx8="http://schemas.microsoft.com/office/drawing/2016/5/14/chartex" xmlns:mc="http://schemas.openxmlformats.org/markup-compatibility/2006" xmlns:aink="http://schemas.microsoft.com/office/drawing/2016/ink" xmlns:am3d="http://schemas.microsoft.com/office/drawing/2017/model3d" xmlns:o="urn:schemas-microsoft-com:office:office" xmlns:oel="http://schemas.microsoft.com/office/2019/extlst" xmlns:r="http://schemas.openxmlformats.org/officeDocument/2006/relationships" xmlns:m="http://schemas.openxmlformats.org/officeDocument/2006/math" xmlns:v="urn:schemas-microsoft-com:vml" xmlns:wp14="http://schemas.microsoft.com/office/word/2010/wordprocessingDrawing" xmlns:wp="http://schemas.openxmlformats.org/drawingml/2006/wordprocessingDrawing" xmlns:w10="urn:schemas-microsoft-com:office:word" xmlns:w="http://schemas.openxmlformats.org/wordprocessingml/2006/main" xmlns:w14="http://schemas.microsoft.com/office/word/2010/wordml" xmlns:w15="http://schemas.microsoft.com/office/word/2012/wordml" xmlns:w16cex="http://schemas.microsoft.com/office/word/2018/wordml/cex" xmlns:w16cid="http://schemas.microsoft.com/office/word/2016/wordml/cid" xmlns:w16="http://schemas.microsoft.com/office/word/2018/wordml" xmlns:w16du="http://schemas.microsoft.com/office/word/2023/wordml/word16du" xmlns:w16sdtdh="http://schemas.microsoft.com/office/word/2020/wordml/sdtdatahash" xmlns:w16se="http://schemas.microsoft.com/office/word/2015/wordml/symex" xmlns:wpg="http://schemas.microsoft.com/office/word/2010/wordprocessingGroup" xmlns:wpi="http://schemas.microsoft.com/office/word/2010/wordprocessingInk" xmlns:wne="http://schemas.microsoft.com/office/word/2006/wordml" xmlns:wps="http://schemas.microsoft.com/office/word/2010/wordprocessingShape" mc:Ignorable="w14 w15 w16se w16cid w16 w16cex w16sdtdh w16du wp14">
+<w:hdr xmlns:wpc="http://schemas.microsoft.com/office/word/2010/wordprocessingCanvas" xmlns:cx="http://schemas.microsoft.com/office/drawing/2014/chartex" xmlns:cx1="http://schemas.microsoft.com/office/drawing/2015/9/8/chartex" xmlns:cx2="http://schemas.microsoft.com/office/drawing/2015/10/21/chartex" xmlns:cx3="http://schemas.microsoft.com/office/drawing/2016/5/9/chartex" xmlns:cx4="http://schemas.microsoft.com/office/drawing/2016/5/10/chartex" xmlns:cx5="http://schemas.microsoft.com/office/drawing/2016/5/11/chartex" xmlns:cx6="http://schemas.microsoft.com/office/drawing/2016/5/12/chartex" xmlns:cx7="http://schemas.microsoft.com/office/drawing/2016/5/13/chartex" xmlns:cx8="http://schemas.microsoft.com/office/drawing/2016/5/14/chartex" xmlns:mc="http://schemas.openxmlformats.org/markup-compatibility/2006" xmlns:aink="http://schemas.microsoft.com/office/drawing/2016/ink" xmlns:am3d="http://schemas.microsoft.com/office/drawing/2017/model3d" xmlns:o="urn:schemas-microsoft-com:office:office" xmlns:oel="http://schemas.microsoft.com/office/2019/extlst" xmlns:r="http://schemas.openxmlformats.org/officeDocument/2006/relationships" xmlns:m="http://schemas.openxmlformats.org/officeDocument/2006/math" xmlns:v="urn:schemas-microsoft-com:vml" xmlns:wp14="http://schemas.microsoft.com/office/word/2010/wordprocessingDrawing" xmlns:wp="http://schemas.openxmlformats.org/drawingml/2006/wordprocessingDrawing" xmlns:w10="urn:schemas-microsoft-com:office:word" xmlns:w="http://schemas.openxmlformats.org/wordprocessingml/2006/main" xmlns:w14="http://schemas.microsoft.com/office/word/2010/wordml" xmlns:w15="http://schemas.microsoft.com/office/word/2012/wordml" xmlns:w16cex="http://schemas.microsoft.com/office/word/2018/wordml/cex" xmlns:w16cid="http://schemas.microsoft.com/office/word/2016/wordml/cid" xmlns:w16="http://schemas.microsoft.com/office/word/2018/wordml" xmlns:w16du="http://schemas.microsoft.com/office/word/2023/wordml/word16du" xmlns:w16sdtdh="http://schemas.microsoft.com/office/word/2020/wordml/sdtdatahash" xmlns:w16sdtfl="http://schemas.microsoft.com/office/word/2024/wordml/sdtformatlock" xmlns:w16se="http://schemas.microsoft.com/office/word/2015/wordml/symex" xmlns:wpg="http://schemas.microsoft.com/office/word/2010/wordprocessingGroup" xmlns:wpi="http://schemas.microsoft.com/office/word/2010/wordprocessingInk" xmlns:wne="http://schemas.microsoft.com/office/word/2006/wordml" xmlns:wps="http://schemas.microsoft.com/office/word/2010/wordprocessingShape" mc:Ignorable="w14 w15 w16se w16cid w16 w16cex w16sdtdh w16sdtfl w16du wp14">
   <w:p>
     <w:pPr>
       <w:pStyle w:val="Header"/>
@@ -37042,7 +36990,7 @@
 </file>
 
 <file path=word/header2.xml><?xml version="1.0" encoding="utf-8"?>
-<w:hdr xmlns:wpc="http://schemas.microsoft.com/office/word/2010/wordprocessingCanvas" xmlns:cx="http://schemas.microsoft.com/office/drawing/2014/chartex" xmlns:cx1="http://schemas.microsoft.com/office/drawing/2015/9/8/chartex" xmlns:cx2="http://schemas.microsoft.com/office/drawing/2015/10/21/chartex" xmlns:cx3="http://schemas.microsoft.com/office/drawing/2016/5/9/chartex" xmlns:cx4="http://schemas.microsoft.com/office/drawing/2016/5/10/chartex" xmlns:cx5="http://schemas.microsoft.com/office/drawing/2016/5/11/chartex" xmlns:cx6="http://schemas.microsoft.com/office/drawing/2016/5/12/chartex" xmlns:cx7="http://schemas.microsoft.com/office/drawing/2016/5/13/chartex" xmlns:cx8="http://schemas.microsoft.com/office/drawing/2016/5/14/chartex" xmlns:mc="http://schemas.openxmlformats.org/markup-compatibility/2006" xmlns:aink="http://schemas.microsoft.com/office/drawing/2016/ink" xmlns:am3d="http://schemas.microsoft.com/office/drawing/2017/model3d" xmlns:o="urn:schemas-microsoft-com:office:office" xmlns:oel="http://schemas.microsoft.com/office/2019/extlst" xmlns:r="http://schemas.openxmlformats.org/officeDocument/2006/relationships" xmlns:m="http://schemas.openxmlformats.org/officeDocument/2006/math" xmlns:v="urn:schemas-microsoft-com:vml" xmlns:wp14="http://schemas.microsoft.com/office/word/2010/wordprocessingDrawing" xmlns:wp="http://schemas.openxmlformats.org/drawingml/2006/wordprocessingDrawing" xmlns:w10="urn:schemas-microsoft-com:office:word" xmlns:w="http://schemas.openxmlformats.org/wordprocessingml/2006/main" xmlns:w14="http://schemas.microsoft.com/office/word/2010/wordml" xmlns:w15="http://schemas.microsoft.com/office/word/2012/wordml" xmlns:w16cex="http://schemas.microsoft.com/office/word/2018/wordml/cex" xmlns:w16cid="http://schemas.microsoft.com/office/word/2016/wordml/cid" xmlns:w16="http://schemas.microsoft.com/office/word/2018/wordml" xmlns:w16du="http://schemas.microsoft.com/office/word/2023/wordml/word16du" xmlns:w16sdtdh="http://schemas.microsoft.com/office/word/2020/wordml/sdtdatahash" xmlns:w16se="http://schemas.microsoft.com/office/word/2015/wordml/symex" xmlns:wpg="http://schemas.microsoft.com/office/word/2010/wordprocessingGroup" xmlns:wpi="http://schemas.microsoft.com/office/word/2010/wordprocessingInk" xmlns:wne="http://schemas.microsoft.com/office/word/2006/wordml" xmlns:wps="http://schemas.microsoft.com/office/word/2010/wordprocessingShape" mc:Ignorable="w14 w15 w16se w16cid w16 w16cex w16sdtdh w16du wp14">
+<w:hdr xmlns:wpc="http://schemas.microsoft.com/office/word/2010/wordprocessingCanvas" xmlns:cx="http://schemas.microsoft.com/office/drawing/2014/chartex" xmlns:cx1="http://schemas.microsoft.com/office/drawing/2015/9/8/chartex" xmlns:cx2="http://schemas.microsoft.com/office/drawing/2015/10/21/chartex" xmlns:cx3="http://schemas.microsoft.com/office/drawing/2016/5/9/chartex" xmlns:cx4="http://schemas.microsoft.com/office/drawing/2016/5/10/chartex" xmlns:cx5="http://schemas.microsoft.com/office/drawing/2016/5/11/chartex" xmlns:cx6="http://schemas.microsoft.com/office/drawing/2016/5/12/chartex" xmlns:cx7="http://schemas.microsoft.com/office/drawing/2016/5/13/chartex" xmlns:cx8="http://schemas.microsoft.com/office/drawing/2016/5/14/chartex" xmlns:mc="http://schemas.openxmlformats.org/markup-compatibility/2006" xmlns:aink="http://schemas.microsoft.com/office/drawing/2016/ink" xmlns:am3d="http://schemas.microsoft.com/office/drawing/2017/model3d" xmlns:o="urn:schemas-microsoft-com:office:office" xmlns:oel="http://schemas.microsoft.com/office/2019/extlst" xmlns:r="http://schemas.openxmlformats.org/officeDocument/2006/relationships" xmlns:m="http://schemas.openxmlformats.org/officeDocument/2006/math" xmlns:v="urn:schemas-microsoft-com:vml" xmlns:wp14="http://schemas.microsoft.com/office/word/2010/wordprocessingDrawing" xmlns:wp="http://schemas.openxmlformats.org/drawingml/2006/wordprocessingDrawing" xmlns:w10="urn:schemas-microsoft-com:office:word" xmlns:w="http://schemas.openxmlformats.org/wordprocessingml/2006/main" xmlns:w14="http://schemas.microsoft.com/office/word/2010/wordml" xmlns:w15="http://schemas.microsoft.com/office/word/2012/wordml" xmlns:w16cex="http://schemas.microsoft.com/office/word/2018/wordml/cex" xmlns:w16cid="http://schemas.microsoft.com/office/word/2016/wordml/cid" xmlns:w16="http://schemas.microsoft.com/office/word/2018/wordml" xmlns:w16du="http://schemas.microsoft.com/office/word/2023/wordml/word16du" xmlns:w16sdtdh="http://schemas.microsoft.com/office/word/2020/wordml/sdtdatahash" xmlns:w16sdtfl="http://schemas.microsoft.com/office/word/2024/wordml/sdtformatlock" xmlns:w16se="http://schemas.microsoft.com/office/word/2015/wordml/symex" xmlns:wpg="http://schemas.microsoft.com/office/word/2010/wordprocessingGroup" xmlns:wpi="http://schemas.microsoft.com/office/word/2010/wordprocessingInk" xmlns:wne="http://schemas.microsoft.com/office/word/2006/wordml" xmlns:wps="http://schemas.microsoft.com/office/word/2010/wordprocessingShape" mc:Ignorable="w14 w15 w16se w16cid w16 w16cex w16sdtdh w16sdtfl w16du wp14">
   <w:p>
     <w:pPr>
       <w:pStyle w:val="Header"/>
@@ -37055,7 +37003,7 @@
 </file>
 
 <file path=word/numbering.xml><?xml version="1.0" encoding="utf-8"?>
-<w:numbering xmlns:wpc="http://schemas.microsoft.com/office/word/2010/wordprocessingCanvas" xmlns:cx="http://schemas.microsoft.com/office/drawing/2014/chartex" xmlns:cx1="http://schemas.microsoft.com/office/drawing/2015/9/8/chartex" xmlns:cx2="http://schemas.microsoft.com/office/drawing/2015/10/21/chartex" xmlns:cx3="http://schemas.microsoft.com/office/drawing/2016/5/9/chartex" xmlns:cx4="http://schemas.microsoft.com/office/drawing/2016/5/10/chartex" xmlns:cx5="http://schemas.microsoft.com/office/drawing/2016/5/11/chartex" xmlns:cx6="http://schemas.microsoft.com/office/drawing/2016/5/12/chartex" xmlns:cx7="http://schemas.microsoft.com/office/drawing/2016/5/13/chartex" xmlns:cx8="http://schemas.microsoft.com/office/drawing/2016/5/14/chartex" xmlns:mc="http://schemas.openxmlformats.org/markup-compatibility/2006" xmlns:aink="http://schemas.microsoft.com/office/drawing/2016/ink" xmlns:am3d="http://schemas.microsoft.com/office/drawing/2017/model3d" xmlns:o="urn:schemas-microsoft-com:office:office" xmlns:oel="http://schemas.microsoft.com/office/2019/extlst" xmlns:r="http://schemas.openxmlformats.org/officeDocument/2006/relationships" xmlns:m="http://schemas.openxmlformats.org/officeDocument/2006/math" xmlns:v="urn:schemas-microsoft-com:vml" xmlns:wp14="http://schemas.microsoft.com/office/word/2010/wordprocessingDrawing" xmlns:wp="http://schemas.openxmlformats.org/drawingml/2006/wordprocessingDrawing" xmlns:w10="urn:schemas-microsoft-com:office:word" xmlns:w="http://schemas.openxmlformats.org/wordprocessingml/2006/main" xmlns:w14="http://schemas.microsoft.com/office/word/2010/wordml" xmlns:w15="http://schemas.microsoft.com/office/word/2012/wordml" xmlns:w16cex="http://schemas.microsoft.com/office/word/2018/wordml/cex" xmlns:w16cid="http://schemas.microsoft.com/office/word/2016/wordml/cid" xmlns:w16="http://schemas.microsoft.com/office/word/2018/wordml" xmlns:w16du="http://schemas.microsoft.com/office/word/2023/wordml/word16du" xmlns:w16sdtdh="http://schemas.microsoft.com/office/word/2020/wordml/sdtdatahash" xmlns:w16se="http://schemas.microsoft.com/office/word/2015/wordml/symex" xmlns:wpg="http://schemas.microsoft.com/office/word/2010/wordprocessingGroup" xmlns:wpi="http://schemas.microsoft.com/office/word/2010/wordprocessingInk" xmlns:wne="http://schemas.microsoft.com/office/word/2006/wordml" xmlns:wps="http://schemas.microsoft.com/office/word/2010/wordprocessingShape" mc:Ignorable="w14 w15 w16se w16cid w16 w16cex w16sdtdh w16du wp14">
+<w:numbering xmlns:wpc="http://schemas.microsoft.com/office/word/2010/wordprocessingCanvas" xmlns:cx="http://schemas.microsoft.com/office/drawing/2014/chartex" xmlns:cx1="http://schemas.microsoft.com/office/drawing/2015/9/8/chartex" xmlns:cx2="http://schemas.microsoft.com/office/drawing/2015/10/21/chartex" xmlns:cx3="http://schemas.microsoft.com/office/drawing/2016/5/9/chartex" xmlns:cx4="http://schemas.microsoft.com/office/drawing/2016/5/10/chartex" xmlns:cx5="http://schemas.microsoft.com/office/drawing/2016/5/11/chartex" xmlns:cx6="http://schemas.microsoft.com/office/drawing/2016/5/12/chartex" xmlns:cx7="http://schemas.microsoft.com/office/drawing/2016/5/13/chartex" xmlns:cx8="http://schemas.microsoft.com/office/drawing/2016/5/14/chartex" xmlns:mc="http://schemas.openxmlformats.org/markup-compatibility/2006" xmlns:aink="http://schemas.microsoft.com/office/drawing/2016/ink" xmlns:am3d="http://schemas.microsoft.com/office/drawing/2017/model3d" xmlns:o="urn:schemas-microsoft-com:office:office" xmlns:oel="http://schemas.microsoft.com/office/2019/extlst" xmlns:r="http://schemas.openxmlformats.org/officeDocument/2006/relationships" xmlns:m="http://schemas.openxmlformats.org/officeDocument/2006/math" xmlns:v="urn:schemas-microsoft-com:vml" xmlns:wp14="http://schemas.microsoft.com/office/word/2010/wordprocessingDrawing" xmlns:wp="http://schemas.openxmlformats.org/drawingml/2006/wordprocessingDrawing" xmlns:w10="urn:schemas-microsoft-com:office:word" xmlns:w="http://schemas.openxmlformats.org/wordprocessingml/2006/main" xmlns:w14="http://schemas.microsoft.com/office/word/2010/wordml" xmlns:w15="http://schemas.microsoft.com/office/word/2012/wordml" xmlns:w16cex="http://schemas.microsoft.com/office/word/2018/wordml/cex" xmlns:w16cid="http://schemas.microsoft.com/office/word/2016/wordml/cid" xmlns:w16="http://schemas.microsoft.com/office/word/2018/wordml" xmlns:w16du="http://schemas.microsoft.com/office/word/2023/wordml/word16du" xmlns:w16sdtdh="http://schemas.microsoft.com/office/word/2020/wordml/sdtdatahash" xmlns:w16sdtfl="http://schemas.microsoft.com/office/word/2024/wordml/sdtformatlock" xmlns:w16se="http://schemas.microsoft.com/office/word/2015/wordml/symex" xmlns:wpg="http://schemas.microsoft.com/office/word/2010/wordprocessingGroup" xmlns:wpi="http://schemas.microsoft.com/office/word/2010/wordprocessingInk" xmlns:wne="http://schemas.microsoft.com/office/word/2006/wordml" xmlns:wps="http://schemas.microsoft.com/office/word/2010/wordprocessingShape" mc:Ignorable="w14 w15 w16se w16cid w16 w16cex w16sdtdh w16sdtfl w16du wp14">
   <w:abstractNum w:abstractNumId="0" w15:restartNumberingAfterBreak="0">
     <w:nsid w:val="01FD797C"/>
     <w:multiLevelType w:val="hybridMultilevel"/>
@@ -37496,7 +37444,7 @@
 </file>
 
 <file path=word/styles.xml><?xml version="1.0" encoding="utf-8"?>
-<w:styles xmlns:mc="http://schemas.openxmlformats.org/markup-compatibility/2006" xmlns:r="http://schemas.openxmlformats.org/officeDocument/2006/relationships" xmlns:w="http://schemas.openxmlformats.org/wordprocessingml/2006/main" xmlns:w14="http://schemas.microsoft.com/office/word/2010/wordml" xmlns:w15="http://schemas.microsoft.com/office/word/2012/wordml" xmlns:w16cex="http://schemas.microsoft.com/office/word/2018/wordml/cex" xmlns:w16cid="http://schemas.microsoft.com/office/word/2016/wordml/cid" xmlns:w16="http://schemas.microsoft.com/office/word/2018/wordml" xmlns:w16du="http://schemas.microsoft.com/office/word/2023/wordml/word16du" xmlns:w16sdtdh="http://schemas.microsoft.com/office/word/2020/wordml/sdtdatahash" xmlns:w16se="http://schemas.microsoft.com/office/word/2015/wordml/symex" mc:Ignorable="w14 w15 w16se w16cid w16 w16cex w16sdtdh w16du">
+<w:styles xmlns:mc="http://schemas.openxmlformats.org/markup-compatibility/2006" xmlns:r="http://schemas.openxmlformats.org/officeDocument/2006/relationships" xmlns:w="http://schemas.openxmlformats.org/wordprocessingml/2006/main" xmlns:w14="http://schemas.microsoft.com/office/word/2010/wordml" xmlns:w15="http://schemas.microsoft.com/office/word/2012/wordml" xmlns:w16cex="http://schemas.microsoft.com/office/word/2018/wordml/cex" xmlns:w16cid="http://schemas.microsoft.com/office/word/2016/wordml/cid" xmlns:w16="http://schemas.microsoft.com/office/word/2018/wordml" xmlns:w16du="http://schemas.microsoft.com/office/word/2023/wordml/word16du" xmlns:w16sdtdh="http://schemas.microsoft.com/office/word/2020/wordml/sdtdatahash" xmlns:w16sdtfl="http://schemas.microsoft.com/office/word/2024/wordml/sdtformatlock" xmlns:w16se="http://schemas.microsoft.com/office/word/2015/wordml/symex" mc:Ignorable="w14 w15 w16se w16cid w16 w16cex w16sdtdh w16sdtfl w16du">
   <w:docDefaults>
     <w:rPrDefault>
       <w:rPr>

</xml_diff>

<commit_message>
nmv 21 09 2026
</commit_message>
<xml_diff>
--- a/Shiva-Stuti/Siva Stuti Malayalam Corrections.docx
+++ b/Shiva-Stuti/Siva Stuti Malayalam Corrections.docx
@@ -20,9 +20,8 @@
           <w:sz w:val="36"/>
           <w:u w:val="single"/>
         </w:rPr>
-        <w:t xml:space="preserve">Shiva Stuti Malayalam Book Corrections –Observed </w:t>
+        <w:t xml:space="preserve">Shiva Stuti Malayalam Book Corrections –Observed till </w:t>
       </w:r>
-      <w:proofErr w:type="gramStart"/>
       <w:r>
         <w:rPr>
           <w:rFonts w:cs="Arial"/>
@@ -30,19 +29,8 @@
           <w:sz w:val="36"/>
           <w:u w:val="single"/>
         </w:rPr>
-        <w:t xml:space="preserve">till </w:t>
+        <w:t>30th Sep 2026</w:t>
       </w:r>
-      <w:r>
-        <w:rPr>
-          <w:rFonts w:cs="Arial"/>
-          <w:b/>
-          <w:sz w:val="36"/>
-          <w:highlight w:val="red"/>
-          <w:u w:val="single"/>
-        </w:rPr>
-        <w:t>?????</w:t>
-      </w:r>
-      <w:proofErr w:type="gramEnd"/>
     </w:p>
     <w:p>
       <w:pPr>
@@ -167,7 +155,7 @@
       </w:tr>
       <w:tr>
         <w:trPr>
-          <w:trHeight w:val="1334"/>
+          <w:trHeight w:val="947"/>
         </w:trPr>
         <w:tc>
           <w:tcPr>
@@ -192,12 +180,9 @@
                 <w:szCs w:val="32"/>
                 <w:lang w:bidi="ta-IN"/>
               </w:rPr>
-              <w:t>16.1, First Anuvaakam</w:t>
-            </w:r>
-          </w:p>
-          <w:p>
-            <w:pPr>
-              <w:spacing w:before="0" w:line="240" w:lineRule="auto"/>
+              <w:t>3.6</w:t>
+            </w:r>
+            <w:r>
               <w:rPr>
                 <w:rFonts w:cs="Arial"/>
                 <w:b/>
@@ -205,7 +190,8 @@
                 <w:szCs w:val="32"/>
                 <w:lang w:bidi="ta-IN"/>
               </w:rPr>
-            </w:pPr>
+              <w:t xml:space="preserve">, </w:t>
+            </w:r>
             <w:r>
               <w:rPr>
                 <w:rFonts w:cs="Arial"/>
@@ -214,12 +200,21 @@
                 <w:szCs w:val="32"/>
                 <w:lang w:bidi="ta-IN"/>
               </w:rPr>
-              <w:t>PageNo. 221</w:t>
-            </w:r>
-          </w:p>
-          <w:p>
-            <w:pPr>
-              <w:spacing w:before="0" w:line="240" w:lineRule="auto"/>
+              <w:t xml:space="preserve"> Pavamaana suktam, Para 4 , </w:t>
+            </w:r>
+          </w:p>
+          <w:p>
+            <w:pPr>
+              <w:spacing w:before="0" w:line="240" w:lineRule="auto"/>
+              <w:rPr>
+                <w:rFonts w:cs="Arial"/>
+                <w:b/>
+                <w:sz w:val="36"/>
+                <w:szCs w:val="52"/>
+                <w:lang w:val="en-IN" w:bidi="ta-IN"/>
+              </w:rPr>
+            </w:pPr>
+            <w:r>
               <w:rPr>
                 <w:rFonts w:cs="Arial"/>
                 <w:b/>
@@ -227,16 +222,7 @@
                 <w:szCs w:val="32"/>
                 <w:lang w:bidi="ta-IN"/>
               </w:rPr>
-            </w:pPr>
-            <w:r>
-              <w:rPr>
-                <w:rFonts w:cs="Arial"/>
-                <w:b/>
-                <w:sz w:val="28"/>
-                <w:szCs w:val="32"/>
-                <w:lang w:bidi="ta-IN"/>
-              </w:rPr>
-              <w:t>Middle page</w:t>
+              <w:t>1st Line</w:t>
             </w:r>
           </w:p>
         </w:tc>
@@ -254,53 +240,597 @@
               <w:rPr>
                 <w:rFonts w:ascii="BRH Malayalam Extra" w:hAnsi="BRH Malayalam Extra" w:cs="BRH Malayalam Extra"/>
                 <w:sz w:val="36"/>
-                <w:szCs w:val="36"/>
-              </w:rPr>
-            </w:pPr>
-            <w:r>
-              <w:rPr>
-                <w:rFonts w:ascii="BRH Malayalam Extra" w:hAnsi="BRH Malayalam Extra" w:cs="BRH Malayalam Extra"/>
-                <w:sz w:val="36"/>
-                <w:szCs w:val="36"/>
-              </w:rPr>
-              <w:t xml:space="preserve">R–Ihj–©a§ sªpx˜J </w:t>
-            </w:r>
-            <w:r>
-              <w:rPr>
-                <w:rFonts w:ascii="BRH Malayalam Extra" w:hAnsi="BRH Malayalam Extra" w:cs="BRH Malayalam Extra"/>
-                <w:sz w:val="36"/>
-                <w:szCs w:val="36"/>
-              </w:rPr>
-              <w:t xml:space="preserve">| </w:t>
-            </w:r>
-          </w:p>
+                <w:szCs w:val="52"/>
+                <w:lang w:val="it-IT"/>
+              </w:rPr>
+            </w:pPr>
+            <w:r>
+              <w:rPr>
+                <w:rFonts w:ascii="BRH Malayalam Extra" w:hAnsi="BRH Malayalam Extra" w:cs="BRH Malayalam Extra"/>
+                <w:sz w:val="36"/>
+                <w:szCs w:val="52"/>
+                <w:lang w:val="it-IT"/>
+              </w:rPr>
+              <w:t>jJ ex—pix–dz-k–¥</w:t>
+            </w:r>
+            <w:r>
+              <w:rPr>
+                <w:rFonts w:ascii="BRH Malayalam Extra" w:hAnsi="BRH Malayalam Extra" w:cs="BRH Malayalam Extra"/>
+                <w:sz w:val="36"/>
+                <w:szCs w:val="52"/>
+                <w:highlight w:val="yellow"/>
+                <w:lang w:val="it-IT"/>
+              </w:rPr>
+              <w:t>Æ</w:t>
+            </w:r>
+            <w:r>
+              <w:rPr>
+                <w:rFonts w:ascii="BRH Malayalam Extra" w:hAnsi="BRH Malayalam Extra" w:cs="BRH Malayalam Extra"/>
+                <w:sz w:val="36"/>
+                <w:szCs w:val="52"/>
+                <w:lang w:val="it-IT"/>
+              </w:rPr>
+              <w:t>Zy— |</w:t>
+            </w:r>
+          </w:p>
+        </w:tc>
+        <w:tc>
+          <w:tcPr>
+            <w:tcW w:w="5220" w:type="dxa"/>
+          </w:tcPr>
+          <w:p>
+            <w:pPr>
+              <w:spacing w:before="0" w:line="240" w:lineRule="auto"/>
+              <w:rPr>
+                <w:rFonts w:ascii="BRH Malayalam Extra" w:hAnsi="BRH Malayalam Extra" w:cs="BRH Malayalam Extra"/>
+                <w:sz w:val="36"/>
+                <w:szCs w:val="52"/>
+                <w:lang w:val="it-IT"/>
+              </w:rPr>
+            </w:pPr>
+            <w:r>
+              <w:rPr>
+                <w:rFonts w:ascii="BRH Malayalam Extra" w:hAnsi="BRH Malayalam Extra" w:cs="BRH Malayalam Extra"/>
+                <w:sz w:val="36"/>
+                <w:szCs w:val="52"/>
+                <w:lang w:val="it-IT"/>
+              </w:rPr>
+              <w:t>jJ ex—pix–dz-k–¥Æ</w:t>
+            </w:r>
+            <w:r>
+              <w:rPr>
+                <w:rFonts w:ascii="BRH Malayalam Extra" w:hAnsi="BRH Malayalam Extra" w:cs="BRH Malayalam Extra"/>
+                <w:sz w:val="36"/>
+                <w:szCs w:val="52"/>
+                <w:highlight w:val="green"/>
+                <w:lang w:val="it-IT"/>
+              </w:rPr>
+              <w:t>õ</w:t>
+            </w:r>
+            <w:r>
+              <w:rPr>
+                <w:rFonts w:ascii="BRH Malayalam Extra" w:hAnsi="BRH Malayalam Extra" w:cs="BRH Malayalam Extra"/>
+                <w:sz w:val="36"/>
+                <w:szCs w:val="52"/>
+                <w:lang w:val="it-IT"/>
+              </w:rPr>
+              <w:t>Zy— |</w:t>
+            </w:r>
+          </w:p>
+        </w:tc>
+      </w:tr>
+      <w:tr>
+        <w:trPr>
+          <w:trHeight w:val="1811"/>
+        </w:trPr>
+        <w:tc>
+          <w:tcPr>
+            <w:tcW w:w="3339" w:type="dxa"/>
+          </w:tcPr>
+          <w:p>
+            <w:pPr>
+              <w:spacing w:before="0" w:line="240" w:lineRule="auto"/>
+              <w:rPr>
+                <w:rFonts w:cs="Arial"/>
+                <w:b/>
+                <w:sz w:val="28"/>
+                <w:szCs w:val="32"/>
+                <w:lang w:bidi="ta-IN"/>
+              </w:rPr>
+            </w:pPr>
+            <w:r>
+              <w:rPr>
+                <w:rFonts w:cs="Arial"/>
+                <w:b/>
+                <w:sz w:val="28"/>
+                <w:szCs w:val="32"/>
+                <w:lang w:bidi="ta-IN"/>
+              </w:rPr>
+              <w:t>7.2, point No.9</w:t>
+            </w:r>
+          </w:p>
+          <w:p>
+            <w:pPr>
+              <w:spacing w:before="0" w:line="240" w:lineRule="auto"/>
+              <w:rPr>
+                <w:rFonts w:cs="Arial"/>
+                <w:b/>
+                <w:sz w:val="28"/>
+                <w:szCs w:val="32"/>
+                <w:lang w:bidi="ta-IN"/>
+              </w:rPr>
+            </w:pPr>
+          </w:p>
+        </w:tc>
+        <w:tc>
+          <w:tcPr>
+            <w:tcW w:w="5103" w:type="dxa"/>
+          </w:tcPr>
           <w:p>
             <w:pPr>
               <w:widowControl w:val="0"/>
               <w:autoSpaceDE w:val="0"/>
               <w:autoSpaceDN w:val="0"/>
               <w:adjustRightInd w:val="0"/>
-              <w:spacing w:before="0" w:line="240" w:lineRule="auto"/>
-              <w:rPr>
-                <w:rFonts w:ascii="BRH Malayalam Extra" w:hAnsi="BRH Malayalam Extra" w:cs="BRH Malayalam Extra"/>
-                <w:sz w:val="40"/>
-                <w:szCs w:val="40"/>
-              </w:rPr>
-            </w:pPr>
-            <w:r>
-              <w:rPr>
-                <w:rFonts w:ascii="BRH Malayalam Extra" w:hAnsi="BRH Malayalam Extra" w:cs="BRH Malayalam Extra"/>
-                <w:sz w:val="36"/>
-                <w:szCs w:val="36"/>
-              </w:rPr>
-              <w:t>sªpx˜</w:t>
-            </w:r>
-            <w:proofErr w:type="gramStart"/>
-            <w:r>
-              <w:rPr>
-                <w:rFonts w:ascii="BRH Malayalam Extra" w:hAnsi="BRH Malayalam Extra" w:cs="BRH Malayalam Extra"/>
-                <w:sz w:val="36"/>
-                <w:szCs w:val="36"/>
+              <w:spacing w:line="240" w:lineRule="auto"/>
+              <w:rPr>
+                <w:rFonts w:ascii="BRH Malayalam Extra" w:hAnsi="BRH Malayalam Extra" w:cs="BRH Malayalam Extra"/>
+                <w:sz w:val="36"/>
+                <w:szCs w:val="36"/>
+              </w:rPr>
+            </w:pPr>
+            <w:r>
+              <w:rPr>
+                <w:rFonts w:ascii="BRH Malayalam Extra" w:hAnsi="BRH Malayalam Extra" w:cs="BRH Malayalam Extra"/>
+                <w:sz w:val="36"/>
+                <w:szCs w:val="36"/>
+                <w:highlight w:val="yellow"/>
+              </w:rPr>
+              <w:t>p£</w:t>
+            </w:r>
+            <w:r>
+              <w:rPr>
+                <w:rFonts w:ascii="BRH Malayalam Extra" w:hAnsi="BRH Malayalam Extra" w:cs="BRH Malayalam Extra"/>
+                <w:sz w:val="36"/>
+                <w:szCs w:val="36"/>
+              </w:rPr>
+              <w:t xml:space="preserve">–öZt¥Zõ– hk— t¢Z¦ </w:t>
+            </w:r>
+            <w:r>
+              <w:rPr>
+                <w:rFonts w:ascii="BRH Malayalam Extra" w:hAnsi="BRH Malayalam Extra" w:cs="BRH Malayalam Extra"/>
+                <w:sz w:val="36"/>
+                <w:szCs w:val="36"/>
+              </w:rPr>
+              <w:t>,</w:t>
+            </w:r>
+          </w:p>
+          <w:p>
+            <w:pPr>
+              <w:widowControl w:val="0"/>
+              <w:autoSpaceDE w:val="0"/>
+              <w:autoSpaceDN w:val="0"/>
+              <w:adjustRightInd w:val="0"/>
+              <w:spacing w:line="240" w:lineRule="auto"/>
+              <w:rPr>
+                <w:rFonts w:ascii="BRH Malayalam Extra" w:hAnsi="BRH Malayalam Extra" w:cs="BRH Malayalam Extra"/>
+                <w:sz w:val="36"/>
+                <w:szCs w:val="36"/>
+              </w:rPr>
+            </w:pPr>
+            <w:r>
+              <w:rPr>
+                <w:rFonts w:ascii="BRH Malayalam Extra" w:hAnsi="BRH Malayalam Extra" w:cs="BRH Malayalam Extra"/>
+                <w:sz w:val="36"/>
+                <w:szCs w:val="36"/>
+              </w:rPr>
+              <w:t>A–</w:t>
+            </w:r>
+            <w:r>
+              <w:rPr>
+                <w:rFonts w:ascii="BRH Malayalam Extra" w:hAnsi="BRH Malayalam Extra" w:cs="BRH Malayalam Extra"/>
+                <w:sz w:val="36"/>
+                <w:szCs w:val="36"/>
+                <w:highlight w:val="yellow"/>
+              </w:rPr>
+              <w:t>sôx A</w:t>
+            </w:r>
+            <w:r>
+              <w:rPr>
+                <w:rFonts w:ascii="BRH Malayalam Extra" w:hAnsi="BRH Malayalam Extra" w:cs="BRH Malayalam Extra"/>
+                <w:sz w:val="36"/>
+                <w:szCs w:val="36"/>
+              </w:rPr>
+              <w:t>—pÇ¡ ¥b–pxJ ||</w:t>
+            </w:r>
+          </w:p>
+        </w:tc>
+        <w:tc>
+          <w:tcPr>
+            <w:tcW w:w="5220" w:type="dxa"/>
+          </w:tcPr>
+          <w:p>
+            <w:pPr>
+              <w:widowControl w:val="0"/>
+              <w:autoSpaceDE w:val="0"/>
+              <w:autoSpaceDN w:val="0"/>
+              <w:adjustRightInd w:val="0"/>
+              <w:spacing w:line="240" w:lineRule="auto"/>
+              <w:rPr>
+                <w:rFonts w:ascii="BRH Malayalam Extra" w:hAnsi="BRH Malayalam Extra" w:cs="BRH Malayalam Extra"/>
+                <w:sz w:val="36"/>
+                <w:szCs w:val="48"/>
+              </w:rPr>
+            </w:pPr>
+            <w:r>
+              <w:rPr>
+                <w:rFonts w:ascii="BRH Malayalam Extra" w:hAnsi="BRH Malayalam Extra" w:cs="BRH Malayalam Extra"/>
+                <w:sz w:val="36"/>
+                <w:szCs w:val="48"/>
+              </w:rPr>
+              <w:t>p£</w:t>
+            </w:r>
+            <w:r>
+              <w:rPr>
+                <w:rFonts w:ascii="BRH Malayalam Extra" w:hAnsi="BRH Malayalam Extra" w:cs="BRH Malayalam Extra"/>
+                <w:sz w:val="36"/>
+                <w:szCs w:val="48"/>
+                <w:highlight w:val="green"/>
+              </w:rPr>
+              <w:t>öZ</w:t>
+            </w:r>
+            <w:r>
+              <w:rPr>
+                <w:rFonts w:ascii="BRH Malayalam Extra" w:hAnsi="BRH Malayalam Extra" w:cs="BRH Malayalam Extra"/>
+                <w:sz w:val="44"/>
+                <w:szCs w:val="48"/>
+              </w:rPr>
+              <w:t>–</w:t>
+            </w:r>
+            <w:r>
+              <w:rPr>
+                <w:rFonts w:ascii="BRH Malayalam Extra" w:hAnsi="BRH Malayalam Extra" w:cs="BRH Malayalam Extra"/>
+                <w:sz w:val="36"/>
+                <w:szCs w:val="48"/>
+              </w:rPr>
+              <w:t>t¥Zõ</w:t>
+            </w:r>
+            <w:r>
+              <w:rPr>
+                <w:rFonts w:ascii="BRH Malayalam Extra" w:hAnsi="BRH Malayalam Extra" w:cs="BRH Malayalam Extra"/>
+                <w:sz w:val="44"/>
+                <w:szCs w:val="48"/>
+              </w:rPr>
+              <w:t>–</w:t>
+            </w:r>
+            <w:r>
+              <w:rPr>
+                <w:rFonts w:ascii="BRH Malayalam Extra" w:hAnsi="BRH Malayalam Extra" w:cs="BRH Malayalam Extra"/>
+                <w:sz w:val="36"/>
+                <w:szCs w:val="48"/>
+              </w:rPr>
+              <w:t xml:space="preserve"> hk— t¢Z¦ </w:t>
+            </w:r>
+          </w:p>
+          <w:p>
+            <w:pPr>
+              <w:widowControl w:val="0"/>
+              <w:autoSpaceDE w:val="0"/>
+              <w:autoSpaceDN w:val="0"/>
+              <w:adjustRightInd w:val="0"/>
+              <w:spacing w:line="240" w:lineRule="auto"/>
+              <w:rPr>
+                <w:rFonts w:ascii="BRH Malayalam Extra" w:hAnsi="BRH Malayalam Extra" w:cs="BRH Malayalam Extra"/>
+                <w:sz w:val="36"/>
+                <w:szCs w:val="36"/>
+              </w:rPr>
+            </w:pPr>
+            <w:r>
+              <w:rPr>
+                <w:rFonts w:ascii="BRH Malayalam Extra" w:hAnsi="BRH Malayalam Extra" w:cs="BRH Malayalam Extra"/>
+                <w:sz w:val="36"/>
+                <w:szCs w:val="36"/>
+              </w:rPr>
+              <w:t>A–</w:t>
+            </w:r>
+            <w:r>
+              <w:rPr>
+                <w:rFonts w:ascii="BRH Malayalam Extra" w:hAnsi="BRH Malayalam Extra" w:cs="BRH Malayalam Extra"/>
+                <w:sz w:val="36"/>
+                <w:szCs w:val="36"/>
+                <w:highlight w:val="green"/>
+              </w:rPr>
+              <w:t>sôx© A</w:t>
+            </w:r>
+            <w:r>
+              <w:rPr>
+                <w:rFonts w:ascii="BRH Malayalam Extra" w:hAnsi="BRH Malayalam Extra" w:cs="BRH Malayalam Extra"/>
+                <w:sz w:val="36"/>
+                <w:szCs w:val="36"/>
+              </w:rPr>
+              <w:t>—pÇ¡ ¥b–pxJ ||</w:t>
+            </w:r>
+          </w:p>
+        </w:tc>
+      </w:tr>
+      <w:tr>
+        <w:trPr>
+          <w:trHeight w:val="986"/>
+        </w:trPr>
+        <w:tc>
+          <w:tcPr>
+            <w:tcW w:w="3339" w:type="dxa"/>
+          </w:tcPr>
+          <w:p>
+            <w:pPr>
+              <w:spacing w:before="0" w:line="240" w:lineRule="auto"/>
+              <w:rPr>
+                <w:rFonts w:cs="Arial"/>
+                <w:b/>
+                <w:sz w:val="28"/>
+                <w:szCs w:val="32"/>
+                <w:lang w:bidi="ta-IN"/>
+              </w:rPr>
+            </w:pPr>
+            <w:r>
+              <w:rPr>
+                <w:rFonts w:cs="Arial"/>
+                <w:b/>
+                <w:sz w:val="28"/>
+                <w:szCs w:val="32"/>
+                <w:lang w:bidi="ta-IN"/>
+              </w:rPr>
+              <w:t>8.2, aatmaraksha,</w:t>
+            </w:r>
+          </w:p>
+          <w:p>
+            <w:pPr>
+              <w:spacing w:before="0" w:line="240" w:lineRule="auto"/>
+              <w:rPr>
+                <w:rFonts w:cs="Arial"/>
+                <w:b/>
+                <w:sz w:val="28"/>
+                <w:szCs w:val="32"/>
+                <w:lang w:bidi="ta-IN"/>
+              </w:rPr>
+            </w:pPr>
+            <w:r>
+              <w:rPr>
+                <w:rFonts w:cs="Arial"/>
+                <w:b/>
+                <w:sz w:val="28"/>
+                <w:szCs w:val="32"/>
+                <w:lang w:bidi="ta-IN"/>
+              </w:rPr>
+              <w:t>Para No.5 &amp; 6</w:t>
+            </w:r>
+          </w:p>
+        </w:tc>
+        <w:tc>
+          <w:tcPr>
+            <w:tcW w:w="5103" w:type="dxa"/>
+          </w:tcPr>
+          <w:p>
+            <w:pPr>
+              <w:widowControl w:val="0"/>
+              <w:autoSpaceDE w:val="0"/>
+              <w:autoSpaceDN w:val="0"/>
+              <w:adjustRightInd w:val="0"/>
+              <w:spacing w:before="0" w:line="240" w:lineRule="auto"/>
+              <w:rPr>
+                <w:rFonts w:ascii="BRH Malayalam Extra" w:hAnsi="BRH Malayalam Extra" w:cs="BRH Malayalam Extra"/>
+                <w:sz w:val="36"/>
+                <w:szCs w:val="36"/>
+              </w:rPr>
+            </w:pPr>
+            <w:r>
+              <w:rPr>
+                <w:rFonts w:ascii="BRH Malayalam Extra" w:hAnsi="BRH Malayalam Extra" w:cs="BRH Malayalam Extra"/>
+                <w:sz w:val="36"/>
+                <w:szCs w:val="36"/>
+                <w:lang w:val="it-IT"/>
+              </w:rPr>
+              <w:t>PZ¡</w:t>
+            </w:r>
+            <w:r>
+              <w:rPr>
+                <w:rFonts w:ascii="BRH Malayalam Extra" w:hAnsi="BRH Malayalam Extra" w:cs="BRH Malayalam Extra"/>
+                <w:sz w:val="36"/>
+                <w:szCs w:val="36"/>
+                <w:highlight w:val="green"/>
+                <w:lang w:val="it-IT"/>
+              </w:rPr>
+              <w:t>—</w:t>
+            </w:r>
+            <w:r>
+              <w:rPr>
+                <w:rFonts w:ascii="BRH Malayalam Extra" w:hAnsi="BRH Malayalam Extra" w:cs="BRH Malayalam Extra"/>
+                <w:sz w:val="36"/>
+                <w:szCs w:val="36"/>
+                <w:highlight w:val="yellow"/>
+                <w:lang w:val="it-IT"/>
+              </w:rPr>
+              <w:t>ª</w:t>
+            </w:r>
+            <w:r>
+              <w:rPr>
+                <w:rFonts w:ascii="BRH Malayalam Extra" w:hAnsi="BRH Malayalam Extra" w:cs="BRH Malayalam Extra"/>
+                <w:sz w:val="36"/>
+                <w:szCs w:val="36"/>
+                <w:lang w:val="it-IT"/>
+              </w:rPr>
+              <w:t xml:space="preserve"> </w:t>
+            </w:r>
+            <w:r>
+              <w:rPr>
+                <w:rFonts w:ascii="BRH Malayalam Extra" w:hAnsi="BRH Malayalam Extra" w:cs="BRH Malayalam Extra"/>
+                <w:sz w:val="36"/>
+                <w:szCs w:val="36"/>
+                <w:lang w:val="it-IT"/>
+              </w:rPr>
+              <w:t>t¢¥Zx</w:t>
+            </w:r>
+          </w:p>
+        </w:tc>
+        <w:tc>
+          <w:tcPr>
+            <w:tcW w:w="5220" w:type="dxa"/>
+          </w:tcPr>
+          <w:p>
+            <w:pPr>
+              <w:spacing w:before="0" w:line="240" w:lineRule="auto"/>
+              <w:rPr>
+                <w:rFonts w:ascii="Cambria" w:hAnsi="Cambria" w:cs="BRH Malayalam Extra"/>
+                <w:sz w:val="36"/>
+                <w:szCs w:val="36"/>
+                <w:lang w:val="en-IN"/>
+              </w:rPr>
+            </w:pPr>
+            <w:r>
+              <w:rPr>
+                <w:rFonts w:ascii="BRH Malayalam Extra" w:hAnsi="BRH Malayalam Extra" w:cs="BRH Malayalam Extra"/>
+                <w:sz w:val="36"/>
+                <w:szCs w:val="36"/>
+                <w:lang w:val="en-IN"/>
+              </w:rPr>
+              <w:t>PZ¡</w:t>
+            </w:r>
+            <w:r>
+              <w:rPr>
+                <w:rFonts w:ascii="BRH Malayalam Extra" w:hAnsi="BRH Malayalam Extra" w:cs="BRH Malayalam Extra"/>
+                <w:sz w:val="36"/>
+                <w:szCs w:val="36"/>
+                <w:highlight w:val="green"/>
+                <w:lang w:val="en-IN"/>
+              </w:rPr>
+              <w:t>—ª</w:t>
+            </w:r>
+            <w:r>
+              <w:rPr>
+                <w:rFonts w:ascii="BRH Malayalam Extra" w:hAnsi="BRH Malayalam Extra" w:cs="BRH Malayalam Extra"/>
+                <w:sz w:val="36"/>
+                <w:szCs w:val="36"/>
+                <w:lang w:val="en-IN"/>
+              </w:rPr>
+              <w:t>.t¢¥Zx  (</w:t>
+            </w:r>
+            <w:r>
+              <w:rPr>
+                <w:rFonts w:cs="Arial"/>
+                <w:sz w:val="32"/>
+                <w:szCs w:val="32"/>
+                <w:lang w:val="en-IN"/>
+              </w:rPr>
+              <w:t>missing swara bakhti inserted at 5 places</w:t>
+            </w:r>
+            <w:r>
+              <w:rPr>
+                <w:rFonts w:ascii="Cambria" w:hAnsi="Cambria" w:cs="BRH Malayalam Extra"/>
+                <w:sz w:val="32"/>
+                <w:szCs w:val="32"/>
+                <w:lang w:val="en-IN"/>
+              </w:rPr>
+              <w:t xml:space="preserve"> )</w:t>
+            </w:r>
+          </w:p>
+        </w:tc>
+      </w:tr>
+      <w:tr>
+        <w:trPr>
+          <w:trHeight w:val="689"/>
+        </w:trPr>
+        <w:tc>
+          <w:tcPr>
+            <w:tcW w:w="3339" w:type="dxa"/>
+          </w:tcPr>
+          <w:p>
+            <w:pPr>
+              <w:spacing w:before="0" w:line="240" w:lineRule="auto"/>
+              <w:rPr>
+                <w:rFonts w:cs="Arial"/>
+                <w:b/>
+                <w:sz w:val="28"/>
+                <w:szCs w:val="32"/>
+                <w:lang w:bidi="ta-IN"/>
+              </w:rPr>
+            </w:pPr>
+            <w:r>
+              <w:rPr>
+                <w:rFonts w:cs="Arial"/>
+                <w:b/>
+                <w:sz w:val="28"/>
+                <w:szCs w:val="32"/>
+                <w:lang w:bidi="ta-IN"/>
+              </w:rPr>
+              <w:t>12.8, Chamakam.</w:t>
+            </w:r>
+          </w:p>
+          <w:p>
+            <w:pPr>
+              <w:spacing w:before="0" w:line="240" w:lineRule="auto"/>
+              <w:rPr>
+                <w:rFonts w:cs="Arial"/>
+                <w:b/>
+                <w:sz w:val="28"/>
+                <w:szCs w:val="32"/>
+                <w:lang w:bidi="ta-IN"/>
+              </w:rPr>
+            </w:pPr>
+            <w:r>
+              <w:rPr>
+                <w:rFonts w:cs="Arial"/>
+                <w:b/>
+                <w:sz w:val="28"/>
+                <w:szCs w:val="32"/>
+                <w:lang w:bidi="ta-IN"/>
+              </w:rPr>
+              <w:t>5th Chapter</w:t>
+            </w:r>
+            <w:r>
+              <w:rPr>
+                <w:rFonts w:cs="Arial"/>
+                <w:b/>
+                <w:sz w:val="28"/>
+                <w:szCs w:val="32"/>
+                <w:lang w:bidi="ta-IN"/>
+              </w:rPr>
+              <w:t xml:space="preserve"> and at various places</w:t>
+            </w:r>
+          </w:p>
+        </w:tc>
+        <w:tc>
+          <w:tcPr>
+            <w:tcW w:w="5103" w:type="dxa"/>
+          </w:tcPr>
+          <w:p>
+            <w:pPr>
+              <w:widowControl w:val="0"/>
+              <w:autoSpaceDE w:val="0"/>
+              <w:autoSpaceDN w:val="0"/>
+              <w:adjustRightInd w:val="0"/>
+              <w:spacing w:before="0" w:line="240" w:lineRule="auto"/>
+              <w:rPr>
+                <w:rFonts w:ascii="BRH Malayalam Extra" w:hAnsi="BRH Malayalam Extra" w:cs="BRH Malayalam Extra"/>
+                <w:sz w:val="36"/>
+                <w:szCs w:val="36"/>
+              </w:rPr>
+            </w:pPr>
+            <w:r>
+              <w:rPr>
+                <w:rFonts w:ascii="BRH Malayalam Extra" w:hAnsi="BRH Malayalam Extra" w:cs="BRH Malayalam Extra"/>
+                <w:sz w:val="36"/>
+                <w:szCs w:val="36"/>
+                <w:lang w:val="it-IT"/>
+              </w:rPr>
+              <w:t>q°y—</w:t>
+            </w:r>
+            <w:r>
+              <w:rPr>
+                <w:rFonts w:ascii="BRH Malayalam Extra" w:hAnsi="BRH Malayalam Extra" w:cs="BRH Malayalam Extra"/>
+                <w:sz w:val="36"/>
+                <w:szCs w:val="36"/>
+                <w:highlight w:val="yellow"/>
+                <w:lang w:val="it-IT"/>
               </w:rPr>
               <w:t>Ò</w:t>
             </w:r>
@@ -309,6 +839,45 @@
                 <w:rFonts w:ascii="BRH Malayalam Extra" w:hAnsi="BRH Malayalam Extra" w:cs="BRH Malayalam Extra"/>
                 <w:sz w:val="36"/>
                 <w:szCs w:val="36"/>
+                <w:lang w:val="it-IT"/>
+              </w:rPr>
+              <w:t xml:space="preserve"> ¥i–</w:t>
+            </w:r>
+            <w:r>
+              <w:rPr>
+                <w:rFonts w:cs="BRH Malayalam Extra"/>
+                <w:b/>
+                <w:sz w:val="36"/>
+                <w:szCs w:val="36"/>
+                <w:lang w:val="it-IT"/>
+              </w:rPr>
+              <w:t xml:space="preserve">, </w:t>
+            </w:r>
+            <w:r>
+              <w:rPr>
+                <w:rFonts w:ascii="BRH Malayalam Extra" w:hAnsi="BRH Malayalam Extra" w:cs="BRH Malayalam Extra"/>
+                <w:sz w:val="36"/>
+                <w:szCs w:val="36"/>
+                <w:lang w:val="it-IT"/>
+              </w:rPr>
+              <w:t>„ªa—Ò i–</w:t>
+            </w:r>
+            <w:r>
+              <w:rPr>
+                <w:rFonts w:cs="BRH Malayalam Extra"/>
+                <w:b/>
+                <w:sz w:val="36"/>
+                <w:szCs w:val="36"/>
+                <w:lang w:val="it-IT"/>
+              </w:rPr>
+              <w:t>,</w:t>
+            </w:r>
+            <w:r>
+              <w:rPr>
+                <w:rFonts w:ascii="BRH Malayalam Extra" w:hAnsi="BRH Malayalam Extra" w:cs="BRH Malayalam Extra"/>
+                <w:sz w:val="36"/>
+                <w:szCs w:val="36"/>
+                <w:lang w:val="it-IT"/>
               </w:rPr>
               <w:t xml:space="preserve"> </w:t>
             </w:r>
@@ -317,9 +886,214 @@
                 <w:rFonts w:ascii="BRH Malayalam Extra" w:hAnsi="BRH Malayalam Extra" w:cs="BRH Malayalam Extra"/>
                 <w:sz w:val="36"/>
                 <w:szCs w:val="36"/>
+                <w:lang w:val="it-IT"/>
+              </w:rPr>
+              <w:tab/>
+            </w:r>
+          </w:p>
+        </w:tc>
+        <w:tc>
+          <w:tcPr>
+            <w:tcW w:w="5220" w:type="dxa"/>
+          </w:tcPr>
+          <w:p>
+            <w:pPr>
+              <w:spacing w:before="0" w:line="240" w:lineRule="auto"/>
+              <w:rPr>
+                <w:rFonts w:ascii="BRH Malayalam Extra" w:hAnsi="BRH Malayalam Extra" w:cs="BRH Malayalam Extra"/>
+                <w:sz w:val="36"/>
+                <w:szCs w:val="36"/>
+                <w:lang w:val="en-IN"/>
+              </w:rPr>
+            </w:pPr>
+            <w:r>
+              <w:rPr>
+                <w:rFonts w:ascii="BRH Malayalam Extra" w:hAnsi="BRH Malayalam Extra" w:cs="BRH Malayalam Extra"/>
+                <w:sz w:val="36"/>
+                <w:szCs w:val="36"/>
+                <w:lang w:val="en-IN"/>
+              </w:rPr>
+              <w:t>q°y—</w:t>
+            </w:r>
+            <w:r>
+              <w:rPr>
+                <w:rFonts w:ascii="BRH Malayalam Extra" w:hAnsi="BRH Malayalam Extra" w:cs="BRH Malayalam Extra"/>
+                <w:sz w:val="36"/>
+                <w:szCs w:val="36"/>
+                <w:highlight w:val="green"/>
+                <w:lang w:val="en-IN"/>
+              </w:rPr>
+              <w:t>Ò</w:t>
+            </w:r>
+            <w:r>
+              <w:rPr>
+                <w:rFonts w:ascii="BRH Malayalam Extra" w:hAnsi="BRH Malayalam Extra" w:cs="BRH Malayalam Extra"/>
+                <w:sz w:val="36"/>
+                <w:szCs w:val="36"/>
+                <w:lang w:val="en-IN"/>
+              </w:rPr>
+              <w:t>– ¥i</w:t>
+            </w:r>
+            <w:r>
+              <w:rPr>
+                <w:rFonts w:cs="BRH Malayalam Extra"/>
+                <w:b/>
+                <w:sz w:val="36"/>
+                <w:szCs w:val="36"/>
+                <w:lang w:val="en-IN"/>
+              </w:rPr>
+              <w:t xml:space="preserve">, </w:t>
+            </w:r>
+            <w:r>
+              <w:rPr>
+                <w:rFonts w:ascii="BRH Malayalam Extra" w:hAnsi="BRH Malayalam Extra" w:cs="BRH Malayalam Extra"/>
+                <w:sz w:val="36"/>
+                <w:szCs w:val="36"/>
+                <w:lang w:val="en-IN"/>
+              </w:rPr>
+              <w:t>„ªa—Ò i–</w:t>
+            </w:r>
+            <w:r>
+              <w:rPr>
+                <w:rFonts w:cs="BRH Malayalam Extra"/>
+                <w:b/>
+                <w:sz w:val="36"/>
+                <w:szCs w:val="36"/>
+                <w:lang w:val="en-IN"/>
+              </w:rPr>
+              <w:t>,</w:t>
+            </w:r>
+            <w:r>
+              <w:rPr>
+                <w:rFonts w:ascii="BRH Malayalam Extra" w:hAnsi="BRH Malayalam Extra" w:cs="BRH Malayalam Extra"/>
+                <w:sz w:val="36"/>
+                <w:szCs w:val="36"/>
+                <w:lang w:val="en-IN"/>
               </w:rPr>
               <w:t xml:space="preserve"> </w:t>
             </w:r>
+          </w:p>
+          <w:p>
+            <w:pPr>
+              <w:spacing w:before="0" w:line="240" w:lineRule="auto"/>
+              <w:rPr>
+                <w:rFonts w:ascii="BRH Malayalam Extra" w:hAnsi="BRH Malayalam Extra" w:cs="BRH Malayalam Extra"/>
+                <w:sz w:val="36"/>
+                <w:szCs w:val="36"/>
+              </w:rPr>
+            </w:pPr>
+            <w:r>
+              <w:rPr>
+                <w:rFonts w:ascii="BRH Malayalam Extra" w:hAnsi="BRH Malayalam Extra" w:cs="BRH Malayalam Extra"/>
+                <w:sz w:val="36"/>
+                <w:szCs w:val="36"/>
+                <w:lang w:val="en-IN"/>
+              </w:rPr>
+              <w:t>(</w:t>
+            </w:r>
+            <w:r>
+              <w:rPr>
+                <w:rFonts w:ascii="Cambria" w:hAnsi="Cambria" w:cs="BRH Malayalam Extra"/>
+                <w:sz w:val="36"/>
+                <w:szCs w:val="36"/>
+                <w:lang w:val="en-IN"/>
+              </w:rPr>
+              <w:t>where ever this corrections a</w:t>
+            </w:r>
+            <w:r>
+              <w:rPr>
+                <w:rFonts w:ascii="Cambria" w:hAnsi="Cambria" w:cs="BRH Malayalam Extra"/>
+                <w:sz w:val="36"/>
+                <w:szCs w:val="36"/>
+                <w:lang w:val="en-IN"/>
+              </w:rPr>
+              <w:t>pplies in the entire book)</w:t>
+            </w:r>
+            <w:r>
+              <w:rPr>
+                <w:rFonts w:ascii="BRH Malayalam Extra" w:hAnsi="BRH Malayalam Extra" w:cs="BRH Malayalam Extra"/>
+                <w:sz w:val="36"/>
+                <w:szCs w:val="36"/>
+                <w:lang w:val="en-IN"/>
+              </w:rPr>
+              <w:tab/>
+            </w:r>
+          </w:p>
+        </w:tc>
+      </w:tr>
+      <w:tr>
+        <w:trPr>
+          <w:trHeight w:val="841"/>
+        </w:trPr>
+        <w:tc>
+          <w:tcPr>
+            <w:tcW w:w="3339" w:type="dxa"/>
+          </w:tcPr>
+          <w:p>
+            <w:pPr>
+              <w:spacing w:before="0" w:line="240" w:lineRule="auto"/>
+              <w:rPr>
+                <w:rFonts w:cs="Arial"/>
+                <w:b/>
+                <w:sz w:val="28"/>
+                <w:szCs w:val="32"/>
+                <w:lang w:bidi="ta-IN"/>
+              </w:rPr>
+            </w:pPr>
+            <w:r>
+              <w:rPr>
+                <w:rFonts w:cs="Arial"/>
+                <w:b/>
+                <w:sz w:val="28"/>
+                <w:szCs w:val="32"/>
+                <w:lang w:bidi="ta-IN"/>
+              </w:rPr>
+              <w:t>Chapter No. 14</w:t>
+            </w:r>
+          </w:p>
+        </w:tc>
+        <w:tc>
+          <w:tcPr>
+            <w:tcW w:w="5103" w:type="dxa"/>
+          </w:tcPr>
+          <w:p>
+            <w:pPr>
+              <w:widowControl w:val="0"/>
+              <w:autoSpaceDE w:val="0"/>
+              <w:autoSpaceDN w:val="0"/>
+              <w:adjustRightInd w:val="0"/>
+              <w:spacing w:before="0" w:line="240" w:lineRule="auto"/>
+              <w:rPr>
+                <w:rFonts w:ascii="BRH Malayalam Extra" w:hAnsi="BRH Malayalam Extra" w:cs="BRH Malayalam Extra"/>
+                <w:sz w:val="36"/>
+                <w:szCs w:val="36"/>
+              </w:rPr>
+            </w:pPr>
+            <w:r>
+              <w:rPr>
+                <w:rFonts w:ascii="BRH Malayalam Extra" w:hAnsi="BRH Malayalam Extra" w:cs="BRH Malayalam Extra"/>
+                <w:sz w:val="36"/>
+                <w:szCs w:val="36"/>
+              </w:rPr>
+              <w:t>HxI h¢ªh¡p–sþ¡</w:t>
+            </w:r>
+            <w:r>
+              <w:rPr>
+                <w:rFonts w:ascii="BRH Malayalam Extra" w:hAnsi="BRH Malayalam Extra" w:cs="BRH Malayalam Extra"/>
+                <w:sz w:val="36"/>
+                <w:szCs w:val="36"/>
+                <w:highlight w:val="yellow"/>
+              </w:rPr>
+              <w:t>p</w:t>
+            </w:r>
+            <w:r>
+              <w:rPr>
+                <w:rFonts w:ascii="BRH Malayalam Extra" w:hAnsi="BRH Malayalam Extra" w:cs="BRH Malayalam Extra"/>
+                <w:sz w:val="36"/>
+                <w:szCs w:val="36"/>
+              </w:rPr>
+              <w:t xml:space="preserve">–J </w:t>
+            </w:r>
             <w:r>
               <w:rPr>
                 <w:rFonts w:ascii="BRH Malayalam Extra" w:hAnsi="BRH Malayalam Extra" w:cs="BRH Malayalam Extra"/>
@@ -328,7 +1102,38 @@
               </w:rPr>
               <w:t>|</w:t>
             </w:r>
-            <w:proofErr w:type="gramEnd"/>
+          </w:p>
+        </w:tc>
+        <w:tc>
+          <w:tcPr>
+            <w:tcW w:w="5220" w:type="dxa"/>
+          </w:tcPr>
+          <w:p>
+            <w:pPr>
+              <w:spacing w:before="0" w:line="240" w:lineRule="auto"/>
+              <w:rPr>
+                <w:rFonts w:ascii="BRH Malayalam Extra" w:hAnsi="BRH Malayalam Extra" w:cs="BRH Malayalam Extra"/>
+                <w:sz w:val="36"/>
+                <w:szCs w:val="36"/>
+              </w:rPr>
+            </w:pPr>
+            <w:r>
+              <w:rPr>
+                <w:rFonts w:ascii="BRH Malayalam Extra" w:hAnsi="BRH Malayalam Extra" w:cs="BRH Malayalam Extra"/>
+                <w:sz w:val="36"/>
+                <w:szCs w:val="36"/>
+              </w:rPr>
+              <w:t>HxI h¢ªh¡p–sþ¡</w:t>
+            </w:r>
+            <w:r>
+              <w:rPr>
+                <w:rFonts w:ascii="BRH Malayalam Extra" w:hAnsi="BRH Malayalam Extra" w:cs="BRH Malayalam Extra"/>
+                <w:sz w:val="36"/>
+                <w:szCs w:val="36"/>
+                <w:highlight w:val="green"/>
+              </w:rPr>
+              <w:t>p—J</w:t>
+            </w:r>
             <w:r>
               <w:rPr>
                 <w:rFonts w:ascii="BRH Malayalam Extra" w:hAnsi="BRH Malayalam Extra" w:cs="BRH Malayalam Extra"/>
@@ -342,8 +1147,401 @@
                 <w:rFonts w:ascii="BRH Malayalam Extra" w:hAnsi="BRH Malayalam Extra" w:cs="BRH Malayalam Extra"/>
                 <w:sz w:val="36"/>
                 <w:szCs w:val="36"/>
+              </w:rPr>
+              <w:t>|</w:t>
+            </w:r>
+            <w:r>
+              <w:rPr>
+                <w:rFonts w:ascii="BRH Malayalam Extra" w:hAnsi="BRH Malayalam Extra" w:cs="BRH Malayalam Extra"/>
+                <w:sz w:val="36"/>
+                <w:szCs w:val="36"/>
+              </w:rPr>
+              <w:t xml:space="preserve"> </w:t>
+            </w:r>
+          </w:p>
+          <w:p>
+            <w:pPr>
+              <w:spacing w:before="0" w:line="240" w:lineRule="auto"/>
+              <w:rPr>
+                <w:rFonts w:ascii="BRH Malayalam Extra" w:hAnsi="BRH Malayalam Extra" w:cs="BRH Malayalam Extra"/>
+                <w:sz w:val="36"/>
+                <w:szCs w:val="36"/>
+              </w:rPr>
+            </w:pPr>
+            <w:r>
+              <w:rPr>
+                <w:rFonts w:cs="Arial"/>
+                <w:sz w:val="28"/>
+                <w:szCs w:val="28"/>
+              </w:rPr>
+              <w:t>(changed at 11 places)</w:t>
+            </w:r>
+          </w:p>
+        </w:tc>
+      </w:tr>
+      <w:tr>
+        <w:trPr>
+          <w:trHeight w:val="1251"/>
+        </w:trPr>
+        <w:tc>
+          <w:tcPr>
+            <w:tcW w:w="3339" w:type="dxa"/>
+          </w:tcPr>
+          <w:p>
+            <w:pPr>
+              <w:spacing w:before="0" w:line="240" w:lineRule="auto"/>
+              <w:rPr>
+                <w:rFonts w:cs="Arial"/>
+                <w:b/>
+                <w:sz w:val="28"/>
+                <w:szCs w:val="32"/>
+                <w:lang w:bidi="ta-IN"/>
+              </w:rPr>
+            </w:pPr>
+            <w:r>
+              <w:rPr>
+                <w:rFonts w:cs="Arial"/>
+                <w:b/>
+                <w:sz w:val="28"/>
+                <w:szCs w:val="32"/>
+                <w:lang w:bidi="ta-IN"/>
+              </w:rPr>
+              <w:t xml:space="preserve">Rudram Kramam, </w:t>
+            </w:r>
+          </w:p>
+          <w:p>
+            <w:pPr>
+              <w:spacing w:before="0" w:line="240" w:lineRule="auto"/>
+              <w:rPr>
+                <w:rFonts w:cs="Arial"/>
+                <w:b/>
+                <w:sz w:val="28"/>
+                <w:szCs w:val="32"/>
+                <w:lang w:bidi="ta-IN"/>
+              </w:rPr>
+            </w:pPr>
+            <w:r>
+              <w:rPr>
+                <w:rFonts w:cs="Arial"/>
+                <w:b/>
+                <w:sz w:val="28"/>
+                <w:szCs w:val="32"/>
+                <w:lang w:bidi="ta-IN"/>
+              </w:rPr>
+              <w:t>16.1, First Anuvaakam</w:t>
+            </w:r>
+          </w:p>
+          <w:p>
+            <w:pPr>
+              <w:spacing w:before="0" w:line="240" w:lineRule="auto"/>
+              <w:rPr>
+                <w:rFonts w:cs="Arial"/>
+                <w:b/>
+                <w:sz w:val="28"/>
+                <w:szCs w:val="32"/>
+                <w:lang w:bidi="ta-IN"/>
+              </w:rPr>
+            </w:pPr>
+            <w:r>
+              <w:rPr>
+                <w:rFonts w:cs="Arial"/>
+                <w:b/>
+                <w:sz w:val="28"/>
+                <w:szCs w:val="32"/>
+                <w:lang w:bidi="ta-IN"/>
+              </w:rPr>
+              <w:t>PageNo. 224</w:t>
+            </w:r>
+          </w:p>
+          <w:p>
+            <w:pPr>
+              <w:spacing w:before="0" w:line="240" w:lineRule="auto"/>
+              <w:rPr>
+                <w:rFonts w:cs="Arial"/>
+                <w:b/>
+                <w:sz w:val="28"/>
+                <w:szCs w:val="32"/>
+                <w:lang w:bidi="ta-IN"/>
+              </w:rPr>
+            </w:pPr>
+            <w:r>
+              <w:rPr>
+                <w:rFonts w:cs="Arial"/>
+                <w:b/>
+                <w:sz w:val="28"/>
+                <w:szCs w:val="32"/>
+                <w:lang w:bidi="ta-IN"/>
+              </w:rPr>
+              <w:t>Middle page</w:t>
+            </w:r>
+          </w:p>
+        </w:tc>
+        <w:tc>
+          <w:tcPr>
+            <w:tcW w:w="5103" w:type="dxa"/>
+          </w:tcPr>
+          <w:p>
+            <w:pPr>
+              <w:widowControl w:val="0"/>
+              <w:autoSpaceDE w:val="0"/>
+              <w:autoSpaceDN w:val="0"/>
+              <w:adjustRightInd w:val="0"/>
+              <w:spacing w:before="0" w:line="240" w:lineRule="auto"/>
+              <w:rPr>
+                <w:rFonts w:ascii="BRH Malayalam Extra" w:hAnsi="BRH Malayalam Extra" w:cs="BRH Malayalam Extra"/>
+                <w:sz w:val="36"/>
+                <w:szCs w:val="36"/>
+              </w:rPr>
+            </w:pPr>
+            <w:r>
+              <w:rPr>
+                <w:rFonts w:ascii="BRH Malayalam Extra" w:hAnsi="BRH Malayalam Extra" w:cs="BRH Malayalam Extra"/>
+                <w:sz w:val="36"/>
+                <w:szCs w:val="36"/>
+              </w:rPr>
+              <w:t xml:space="preserve">t¥së– gyh—ª.ry | </w:t>
+            </w:r>
+          </w:p>
+          <w:p>
+            <w:pPr>
+              <w:widowControl w:val="0"/>
+              <w:autoSpaceDE w:val="0"/>
+              <w:autoSpaceDN w:val="0"/>
+              <w:adjustRightInd w:val="0"/>
+              <w:spacing w:before="0" w:line="240" w:lineRule="auto"/>
+              <w:rPr>
+                <w:rFonts w:ascii="BRH Malayalam Extra" w:hAnsi="BRH Malayalam Extra" w:cs="BRH Malayalam Extra"/>
+                <w:sz w:val="36"/>
+                <w:szCs w:val="36"/>
+              </w:rPr>
+            </w:pPr>
+            <w:r>
+              <w:rPr>
+                <w:rFonts w:ascii="BRH Malayalam Extra" w:hAnsi="BRH Malayalam Extra" w:cs="BRH Malayalam Extra"/>
+                <w:sz w:val="36"/>
+                <w:szCs w:val="36"/>
+              </w:rPr>
+              <w:t>gyh</w:t>
+            </w:r>
+            <w:r>
+              <w:rPr>
+                <w:rFonts w:ascii="BRH Malayalam Extra" w:hAnsi="BRH Malayalam Extra" w:cs="BRH Malayalam Extra"/>
+                <w:sz w:val="36"/>
+                <w:szCs w:val="36"/>
                 <w:highlight w:val="yellow"/>
               </w:rPr>
+              <w:t>–ª.rõ</w:t>
+            </w:r>
+            <w:r>
+              <w:rPr>
+                <w:rFonts w:ascii="BRH Malayalam Extra" w:hAnsi="BRH Malayalam Extra" w:cs="BRH Malayalam Extra"/>
+                <w:sz w:val="36"/>
+                <w:szCs w:val="36"/>
+              </w:rPr>
+              <w:t>së—¥p</w:t>
+            </w:r>
+          </w:p>
+        </w:tc>
+        <w:tc>
+          <w:tcPr>
+            <w:tcW w:w="5220" w:type="dxa"/>
+          </w:tcPr>
+          <w:p>
+            <w:pPr>
+              <w:widowControl w:val="0"/>
+              <w:autoSpaceDE w:val="0"/>
+              <w:autoSpaceDN w:val="0"/>
+              <w:adjustRightInd w:val="0"/>
+              <w:spacing w:before="0" w:line="240" w:lineRule="auto"/>
+              <w:rPr>
+                <w:rFonts w:ascii="BRH Malayalam Extra" w:hAnsi="BRH Malayalam Extra" w:cs="BRH Malayalam Extra"/>
+                <w:sz w:val="36"/>
+                <w:szCs w:val="36"/>
+              </w:rPr>
+            </w:pPr>
+            <w:r>
+              <w:rPr>
+                <w:rFonts w:ascii="BRH Malayalam Extra" w:hAnsi="BRH Malayalam Extra" w:cs="BRH Malayalam Extra"/>
+                <w:sz w:val="36"/>
+                <w:szCs w:val="36"/>
+              </w:rPr>
+              <w:t xml:space="preserve">t¥së– gyh—ª.ry | </w:t>
+            </w:r>
+          </w:p>
+          <w:p>
+            <w:pPr>
+              <w:spacing w:before="0" w:line="240" w:lineRule="auto"/>
+              <w:rPr>
+                <w:rFonts w:ascii="Cambria" w:hAnsi="Cambria" w:cs="BRH Malayalam Extra"/>
+                <w:sz w:val="36"/>
+                <w:szCs w:val="36"/>
+              </w:rPr>
+            </w:pPr>
+            <w:r>
+              <w:rPr>
+                <w:rFonts w:ascii="BRH Malayalam Extra" w:hAnsi="BRH Malayalam Extra" w:cs="BRH Malayalam Extra"/>
+                <w:sz w:val="36"/>
+                <w:szCs w:val="36"/>
+              </w:rPr>
+              <w:t>gyh–</w:t>
+            </w:r>
+            <w:r>
+              <w:rPr>
+                <w:rFonts w:ascii="BRH Malayalam Extra" w:hAnsi="BRH Malayalam Extra" w:cs="BRH Malayalam Extra"/>
+                <w:sz w:val="36"/>
+                <w:szCs w:val="36"/>
+                <w:highlight w:val="green"/>
+              </w:rPr>
+              <w:t>ªr</w:t>
+            </w:r>
+            <w:r>
+              <w:rPr>
+                <w:rFonts w:ascii="BRH Malayalam Extra" w:hAnsi="BRH Malayalam Extra" w:cs="BRH Malayalam Extra"/>
+                <w:sz w:val="36"/>
+                <w:szCs w:val="36"/>
+              </w:rPr>
+              <w:t>õsë—¥p</w:t>
+            </w:r>
+            <w:r>
+              <w:rPr>
+                <w:rFonts w:ascii="BRH Malayalam Extra" w:hAnsi="BRH Malayalam Extra" w:cs="BRH Malayalam Extra"/>
+                <w:sz w:val="36"/>
+                <w:szCs w:val="36"/>
+              </w:rPr>
+              <w:t xml:space="preserve"> (</w:t>
+            </w:r>
+            <w:r>
+              <w:rPr>
+                <w:rFonts w:cs="Arial"/>
+                <w:szCs w:val="24"/>
+              </w:rPr>
+              <w:t>swara bakthi removed</w:t>
+            </w:r>
+          </w:p>
+        </w:tc>
+      </w:tr>
+      <w:tr>
+        <w:trPr>
+          <w:trHeight w:val="901"/>
+        </w:trPr>
+        <w:tc>
+          <w:tcPr>
+            <w:tcW w:w="3339" w:type="dxa"/>
+          </w:tcPr>
+          <w:p>
+            <w:pPr>
+              <w:spacing w:before="0" w:line="240" w:lineRule="auto"/>
+              <w:rPr>
+                <w:rFonts w:cs="Arial"/>
+                <w:b/>
+                <w:sz w:val="28"/>
+                <w:szCs w:val="32"/>
+                <w:lang w:bidi="ta-IN"/>
+              </w:rPr>
+            </w:pPr>
+            <w:r>
+              <w:rPr>
+                <w:rFonts w:cs="Arial"/>
+                <w:b/>
+                <w:sz w:val="28"/>
+                <w:szCs w:val="32"/>
+                <w:lang w:bidi="ta-IN"/>
+              </w:rPr>
+              <w:lastRenderedPageBreak/>
+              <w:t xml:space="preserve">Rudram Kramam, </w:t>
+            </w:r>
+          </w:p>
+          <w:p>
+            <w:pPr>
+              <w:spacing w:before="0" w:line="240" w:lineRule="auto"/>
+              <w:rPr>
+                <w:rFonts w:cs="Arial"/>
+                <w:b/>
+                <w:sz w:val="28"/>
+                <w:szCs w:val="32"/>
+                <w:lang w:bidi="ta-IN"/>
+              </w:rPr>
+            </w:pPr>
+            <w:r>
+              <w:rPr>
+                <w:rFonts w:cs="Arial"/>
+                <w:b/>
+                <w:sz w:val="28"/>
+                <w:szCs w:val="32"/>
+                <w:lang w:bidi="ta-IN"/>
+              </w:rPr>
+              <w:t>16.1, First Anuvaakam</w:t>
+            </w:r>
+          </w:p>
+          <w:p>
+            <w:pPr>
+              <w:spacing w:before="0" w:line="240" w:lineRule="auto"/>
+              <w:rPr>
+                <w:rFonts w:cs="Arial"/>
+                <w:b/>
+                <w:sz w:val="28"/>
+                <w:szCs w:val="32"/>
+                <w:lang w:bidi="ta-IN"/>
+              </w:rPr>
+            </w:pPr>
+            <w:r>
+              <w:rPr>
+                <w:rFonts w:cs="Arial"/>
+                <w:b/>
+                <w:sz w:val="28"/>
+                <w:szCs w:val="32"/>
+                <w:lang w:bidi="ta-IN"/>
+              </w:rPr>
+              <w:t>PageNo. 225</w:t>
+            </w:r>
+          </w:p>
+          <w:p>
+            <w:pPr>
+              <w:spacing w:before="0" w:line="240" w:lineRule="auto"/>
+              <w:rPr>
+                <w:rFonts w:cs="Arial"/>
+                <w:b/>
+                <w:sz w:val="36"/>
+                <w:szCs w:val="36"/>
+                <w:lang w:bidi="ta-IN"/>
+              </w:rPr>
+            </w:pPr>
+            <w:r>
+              <w:rPr>
+                <w:rFonts w:cs="Arial"/>
+                <w:b/>
+                <w:sz w:val="28"/>
+                <w:szCs w:val="32"/>
+                <w:lang w:bidi="ta-IN"/>
+              </w:rPr>
+              <w:t>Middle page</w:t>
+            </w:r>
+          </w:p>
+        </w:tc>
+        <w:tc>
+          <w:tcPr>
+            <w:tcW w:w="5103" w:type="dxa"/>
+          </w:tcPr>
+          <w:p>
+            <w:pPr>
+              <w:widowControl w:val="0"/>
+              <w:autoSpaceDE w:val="0"/>
+              <w:autoSpaceDN w:val="0"/>
+              <w:adjustRightInd w:val="0"/>
+              <w:spacing w:before="0" w:line="240" w:lineRule="auto"/>
+              <w:rPr>
+                <w:rFonts w:ascii="BRH Malayalam Extra" w:hAnsi="BRH Malayalam Extra" w:cs="BRH Malayalam Extra"/>
+                <w:sz w:val="36"/>
+                <w:szCs w:val="36"/>
+              </w:rPr>
+            </w:pPr>
+            <w:r>
+              <w:rPr>
+                <w:rFonts w:ascii="BRH Malayalam Extra" w:hAnsi="BRH Malayalam Extra" w:cs="BRH Malayalam Extra"/>
+                <w:sz w:val="36"/>
+                <w:szCs w:val="36"/>
+                <w:highlight w:val="yellow"/>
+              </w:rPr>
               <w:t>P</w:t>
             </w:r>
             <w:r>
@@ -354,14 +1552,6 @@
               </w:rPr>
               <w:t xml:space="preserve"> jx–Z¡–cx–dõ—J</w:t>
             </w:r>
-            <w:r>
-              <w:rPr>
-                <w:rFonts w:ascii="BRH Malayalam Extra" w:hAnsi="BRH Malayalam Extra" w:cs="BRH Malayalam Extra"/>
-                <w:sz w:val="36"/>
-                <w:szCs w:val="36"/>
-              </w:rPr>
-              <w:t xml:space="preserve"> |</w:t>
-            </w:r>
           </w:p>
         </w:tc>
         <w:tc>
@@ -370,55 +1560,17 @@
           </w:tcPr>
           <w:p>
             <w:pPr>
-              <w:spacing w:before="0" w:line="240" w:lineRule="auto"/>
-              <w:rPr>
-                <w:rFonts w:ascii="BRH Malayalam Extra" w:hAnsi="BRH Malayalam Extra" w:cs="BRH Malayalam Extra"/>
-                <w:sz w:val="36"/>
-                <w:szCs w:val="36"/>
-              </w:rPr>
-            </w:pPr>
-            <w:r>
-              <w:rPr>
-                <w:rFonts w:ascii="BRH Malayalam Extra" w:hAnsi="BRH Malayalam Extra" w:cs="BRH Malayalam Extra"/>
-                <w:sz w:val="36"/>
-                <w:szCs w:val="36"/>
-              </w:rPr>
-              <w:t xml:space="preserve">R–Ihj–©a§ sªpx˜J </w:t>
-            </w:r>
-            <w:r>
-              <w:rPr>
-                <w:rFonts w:ascii="BRH Malayalam Extra" w:hAnsi="BRH Malayalam Extra" w:cs="BRH Malayalam Extra"/>
-                <w:sz w:val="36"/>
-                <w:szCs w:val="36"/>
-              </w:rPr>
-              <w:t xml:space="preserve">| </w:t>
-            </w:r>
-          </w:p>
-          <w:p>
-            <w:pPr>
-              <w:spacing w:before="0" w:line="240" w:lineRule="auto"/>
-              <w:rPr>
-                <w:rFonts w:ascii="BRH Malayalam Extra" w:hAnsi="BRH Malayalam Extra" w:cs="BRH Malayalam Extra"/>
-                <w:sz w:val="40"/>
-                <w:szCs w:val="40"/>
-              </w:rPr>
-            </w:pPr>
-            <w:r>
-              <w:rPr>
-                <w:rFonts w:ascii="BRH Malayalam Extra" w:hAnsi="BRH Malayalam Extra" w:cs="BRH Malayalam Extra"/>
-                <w:sz w:val="36"/>
-                <w:szCs w:val="36"/>
-              </w:rPr>
-              <w:t xml:space="preserve">sªpx˜Ò </w:t>
-            </w:r>
-            <w:r>
-              <w:rPr>
-                <w:rFonts w:ascii="BRH Malayalam Extra" w:hAnsi="BRH Malayalam Extra" w:cs="BRH Malayalam Extra"/>
-                <w:sz w:val="36"/>
-                <w:szCs w:val="36"/>
-              </w:rPr>
-              <w:t xml:space="preserve">| </w:t>
-            </w:r>
+              <w:widowControl w:val="0"/>
+              <w:autoSpaceDE w:val="0"/>
+              <w:autoSpaceDN w:val="0"/>
+              <w:adjustRightInd w:val="0"/>
+              <w:spacing w:before="0" w:line="240" w:lineRule="auto"/>
+              <w:rPr>
+                <w:rFonts w:ascii="BRH Malayalam Extra" w:hAnsi="BRH Malayalam Extra" w:cs="BRH Malayalam Extra"/>
+                <w:sz w:val="36"/>
+                <w:szCs w:val="36"/>
+              </w:rPr>
+            </w:pPr>
             <w:r>
               <w:rPr>
                 <w:rFonts w:ascii="BRH Malayalam Extra" w:hAnsi="BRH Malayalam Extra" w:cs="BRH Malayalam Extra"/>
@@ -426,23 +1578,15 @@
                 <w:szCs w:val="36"/>
                 <w:highlight w:val="green"/>
               </w:rPr>
-              <w:t>P</w:t>
-            </w:r>
-            <w:r>
-              <w:rPr>
-                <w:rFonts w:ascii="BRH Malayalam Extra" w:hAnsi="BRH Malayalam Extra" w:cs="BRH Malayalam Extra"/>
-                <w:sz w:val="36"/>
-                <w:szCs w:val="36"/>
-              </w:rPr>
-              <w:t>– jx–Z¡–cx–dõ—J</w:t>
-            </w:r>
-            <w:r>
-              <w:rPr>
-                <w:rFonts w:ascii="BRH Malayalam Extra" w:hAnsi="BRH Malayalam Extra" w:cs="BRH Malayalam Extra"/>
-                <w:sz w:val="36"/>
-                <w:szCs w:val="36"/>
-              </w:rPr>
-              <w:t xml:space="preserve"> |</w:t>
+              <w:t>P–</w:t>
+            </w:r>
+            <w:r>
+              <w:rPr>
+                <w:rFonts w:ascii="BRH Malayalam Extra" w:hAnsi="BRH Malayalam Extra" w:cs="BRH Malayalam Extra"/>
+                <w:sz w:val="36"/>
+                <w:szCs w:val="36"/>
+              </w:rPr>
+              <w:t xml:space="preserve"> jx–Z¡–cx–dõ—J</w:t>
             </w:r>
           </w:p>
         </w:tc>
@@ -474,7 +1618,7 @@
                 <w:szCs w:val="32"/>
                 <w:lang w:bidi="ta-IN"/>
               </w:rPr>
-              <w:t>16.1, First Anuvaakam</w:t>
+              <w:t xml:space="preserve">Rudram Kramam, </w:t>
             </w:r>
           </w:p>
           <w:p>
@@ -496,7 +1640,39 @@
                 <w:szCs w:val="32"/>
                 <w:lang w:bidi="ta-IN"/>
               </w:rPr>
-              <w:t>PageNo. 225</w:t>
+              <w:t>16.1, First Anuvaakam</w:t>
+            </w:r>
+          </w:p>
+          <w:p>
+            <w:pPr>
+              <w:spacing w:before="0" w:line="240" w:lineRule="auto"/>
+              <w:rPr>
+                <w:rFonts w:cs="Arial"/>
+                <w:b/>
+                <w:sz w:val="28"/>
+                <w:szCs w:val="32"/>
+                <w:lang w:bidi="ta-IN"/>
+              </w:rPr>
+            </w:pPr>
+            <w:r>
+              <w:rPr>
+                <w:rFonts w:cs="Arial"/>
+                <w:b/>
+                <w:sz w:val="28"/>
+                <w:szCs w:val="32"/>
+                <w:lang w:bidi="ta-IN"/>
+              </w:rPr>
+              <w:t>PageNo. 22</w:t>
+            </w:r>
+            <w:r>
+              <w:rPr>
+                <w:rFonts w:cs="Arial"/>
+                <w:b/>
+                <w:sz w:val="28"/>
+                <w:szCs w:val="32"/>
+                <w:lang w:bidi="ta-IN"/>
+              </w:rPr>
+              <w:t>8</w:t>
             </w:r>
           </w:p>
           <w:p>
@@ -717,7 +1893,7 @@
       </w:tr>
       <w:tr>
         <w:trPr>
-          <w:trHeight w:val="1411"/>
+          <w:trHeight w:val="1005"/>
         </w:trPr>
         <w:tc>
           <w:tcPr>
@@ -748,7 +1924,7 @@
                 <w:szCs w:val="32"/>
                 <w:lang w:bidi="ta-IN"/>
               </w:rPr>
-              <w:t>16.2, 2nd Anuvaakam</w:t>
+              <w:t xml:space="preserve">Rudram Kramam, </w:t>
             </w:r>
           </w:p>
           <w:p>
@@ -770,21 +1946,12 @@
                 <w:szCs w:val="32"/>
                 <w:lang w:bidi="ta-IN"/>
               </w:rPr>
-              <w:t>PageNo. 236</w:t>
-            </w:r>
-          </w:p>
-          <w:p>
-            <w:pPr>
-              <w:spacing w:before="0" w:line="240" w:lineRule="auto"/>
-              <w:rPr>
-                <w:rFonts w:ascii="BRH Malayalam RN" w:hAnsi="BRH Malayalam RN" w:cs="Latha"/>
-                <w:sz w:val="32"/>
-                <w:szCs w:val="32"/>
-                <w:cs/>
-                <w:lang w:bidi="ta-IN"/>
-              </w:rPr>
-            </w:pPr>
-            <w:r>
+              <w:t>16.1, 2nd Anuvaakam</w:t>
+            </w:r>
+          </w:p>
+          <w:p>
+            <w:pPr>
+              <w:spacing w:before="0" w:line="240" w:lineRule="auto"/>
               <w:rPr>
                 <w:rFonts w:cs="Arial"/>
                 <w:b/>
@@ -792,7 +1959,38 @@
                 <w:szCs w:val="32"/>
                 <w:lang w:bidi="ta-IN"/>
               </w:rPr>
-              <w:t>Top page</w:t>
+            </w:pPr>
+            <w:r>
+              <w:rPr>
+                <w:rFonts w:cs="Arial"/>
+                <w:b/>
+                <w:sz w:val="28"/>
+                <w:szCs w:val="32"/>
+                <w:lang w:bidi="ta-IN"/>
+              </w:rPr>
+              <w:t>PageNo. 232</w:t>
+            </w:r>
+          </w:p>
+          <w:p>
+            <w:pPr>
+              <w:spacing w:before="0" w:line="240" w:lineRule="auto"/>
+              <w:rPr>
+                <w:rFonts w:cs="Arial"/>
+                <w:b/>
+                <w:sz w:val="36"/>
+                <w:szCs w:val="36"/>
+                <w:lang w:bidi="ta-IN"/>
+              </w:rPr>
+            </w:pPr>
+            <w:r>
+              <w:rPr>
+                <w:rFonts w:cs="Arial"/>
+                <w:b/>
+                <w:sz w:val="28"/>
+                <w:szCs w:val="32"/>
+                <w:lang w:bidi="ta-IN"/>
+              </w:rPr>
+              <w:t>Last line</w:t>
             </w:r>
           </w:p>
         </w:tc>
@@ -825,37 +2023,7 @@
                 <w:sz w:val="36"/>
                 <w:szCs w:val="36"/>
               </w:rPr>
-              <w:t>±–À£hõ—J sO§öMtz–Z£hõ—J</w:t>
-            </w:r>
-            <w:r>
-              <w:rPr>
-                <w:rFonts w:ascii="BRH Malayalam Extra" w:hAnsi="BRH Malayalam Extra" w:cs="BRH Malayalam Extra"/>
-                <w:sz w:val="36"/>
-                <w:szCs w:val="36"/>
-              </w:rPr>
-              <w:t xml:space="preserve"> |</w:t>
-            </w:r>
-          </w:p>
-          <w:p>
-            <w:pPr>
-              <w:widowControl w:val="0"/>
-              <w:autoSpaceDE w:val="0"/>
-              <w:autoSpaceDN w:val="0"/>
-              <w:adjustRightInd w:val="0"/>
-              <w:spacing w:before="0" w:line="240" w:lineRule="auto"/>
-              <w:rPr>
-                <w:rFonts w:ascii="BRH Malayalam Extra" w:hAnsi="BRH Malayalam Extra" w:cs="BRH Malayalam Extra"/>
-                <w:sz w:val="36"/>
-                <w:szCs w:val="36"/>
-              </w:rPr>
-            </w:pPr>
-            <w:r>
-              <w:rPr>
-                <w:rFonts w:ascii="BRH Malayalam Extra" w:hAnsi="BRH Malayalam Extra" w:cs="BRH Malayalam Extra"/>
-                <w:sz w:val="36"/>
-                <w:szCs w:val="36"/>
-              </w:rPr>
-              <w:t>±–À£</w:t>
+              <w:t>cx</w:t>
             </w:r>
             <w:r>
               <w:rPr>
@@ -864,23 +2032,15 @@
                 <w:szCs w:val="36"/>
                 <w:highlight w:val="yellow"/>
               </w:rPr>
-              <w:t>hõ–J</w:t>
-            </w:r>
-            <w:r>
-              <w:rPr>
-                <w:rFonts w:ascii="BRH Malayalam Extra" w:hAnsi="BRH Malayalam Extra" w:cs="BRH Malayalam Extra"/>
-                <w:sz w:val="36"/>
-                <w:szCs w:val="36"/>
-              </w:rPr>
-              <w:t xml:space="preserve"> CZy— ±–À£ - hõ–J</w:t>
-            </w:r>
-            <w:r>
-              <w:rPr>
-                <w:rFonts w:ascii="BRH Malayalam Extra" w:hAnsi="BRH Malayalam Extra" w:cs="BRH Malayalam Extra"/>
-                <w:sz w:val="36"/>
-                <w:szCs w:val="36"/>
-              </w:rPr>
-              <w:t xml:space="preserve"> |</w:t>
+              <w:t>¥p</w:t>
+            </w:r>
+            <w:r>
+              <w:rPr>
+                <w:rFonts w:ascii="BRH Malayalam Extra" w:hAnsi="BRH Malayalam Extra" w:cs="BRH Malayalam Extra"/>
+                <w:sz w:val="36"/>
+                <w:szCs w:val="36"/>
+              </w:rPr>
+              <w:t>—¥Z– sZû—dxI</w:t>
             </w:r>
           </w:p>
         </w:tc>
@@ -913,33 +2073,7 @@
                 <w:sz w:val="36"/>
                 <w:szCs w:val="36"/>
               </w:rPr>
-              <w:t>±–À£hõ—J sO§öMtz–Z£hõ—J</w:t>
-            </w:r>
-            <w:r>
-              <w:rPr>
-                <w:rFonts w:ascii="BRH Malayalam Extra" w:hAnsi="BRH Malayalam Extra" w:cs="BRH Malayalam Extra"/>
-                <w:sz w:val="36"/>
-                <w:szCs w:val="36"/>
-              </w:rPr>
-              <w:t xml:space="preserve"> |</w:t>
-            </w:r>
-          </w:p>
-          <w:p>
-            <w:pPr>
-              <w:spacing w:before="0" w:line="240" w:lineRule="auto"/>
-              <w:rPr>
-                <w:rFonts w:ascii="BRH Malayalam Extra" w:hAnsi="BRH Malayalam Extra" w:cs="BRH Malayalam Extra"/>
-                <w:sz w:val="36"/>
-                <w:szCs w:val="36"/>
-              </w:rPr>
-            </w:pPr>
-            <w:r>
-              <w:rPr>
-                <w:rFonts w:ascii="BRH Malayalam Extra" w:hAnsi="BRH Malayalam Extra" w:cs="BRH Malayalam Extra"/>
-                <w:sz w:val="36"/>
-                <w:szCs w:val="36"/>
-              </w:rPr>
-              <w:t>±–À£</w:t>
+              <w:t>cx</w:t>
             </w:r>
             <w:r>
               <w:rPr>
@@ -948,30 +2082,22 @@
                 <w:szCs w:val="36"/>
                 <w:highlight w:val="green"/>
               </w:rPr>
-              <w:t>hõ–</w:t>
-            </w:r>
-            <w:r>
-              <w:rPr>
-                <w:rFonts w:ascii="BRH Malayalam Extra" w:hAnsi="BRH Malayalam Extra" w:cs="BRH Malayalam Extra"/>
-                <w:sz w:val="36"/>
-                <w:szCs w:val="36"/>
-              </w:rPr>
-              <w:t xml:space="preserve"> CZy— ±–À£ - hõ–J</w:t>
-            </w:r>
-            <w:r>
-              <w:rPr>
-                <w:rFonts w:ascii="BRH Malayalam Extra" w:hAnsi="BRH Malayalam Extra" w:cs="BRH Malayalam Extra"/>
-                <w:sz w:val="36"/>
-                <w:szCs w:val="36"/>
-              </w:rPr>
-              <w:t xml:space="preserve"> |</w:t>
+              <w:t>p</w:t>
+            </w:r>
+            <w:r>
+              <w:rPr>
+                <w:rFonts w:ascii="BRH Malayalam Extra" w:hAnsi="BRH Malayalam Extra" w:cs="BRH Malayalam Extra"/>
+                <w:sz w:val="36"/>
+                <w:szCs w:val="36"/>
+              </w:rPr>
+              <w:t>—¥Z– sZû—dxI</w:t>
             </w:r>
           </w:p>
         </w:tc>
       </w:tr>
       <w:tr>
         <w:trPr>
-          <w:trHeight w:val="1407"/>
+          <w:trHeight w:val="1411"/>
         </w:trPr>
         <w:tc>
           <w:tcPr>
@@ -1002,7 +2128,7 @@
                 <w:szCs w:val="32"/>
                 <w:lang w:bidi="ta-IN"/>
               </w:rPr>
-              <w:t>16.2, 2nd Anuvaakam</w:t>
+              <w:t xml:space="preserve">Rudram Kramam, </w:t>
             </w:r>
           </w:p>
           <w:p>
@@ -1024,7 +2150,49 @@
                 <w:szCs w:val="32"/>
                 <w:lang w:bidi="ta-IN"/>
               </w:rPr>
-              <w:t>PageNo. 237</w:t>
+              <w:t>16.4, 2nd Anuvaakam</w:t>
+            </w:r>
+          </w:p>
+          <w:p>
+            <w:pPr>
+              <w:spacing w:before="0" w:line="240" w:lineRule="auto"/>
+              <w:rPr>
+                <w:rFonts w:cs="Arial"/>
+                <w:b/>
+                <w:sz w:val="28"/>
+                <w:szCs w:val="32"/>
+                <w:lang w:bidi="ta-IN"/>
+              </w:rPr>
+            </w:pPr>
+            <w:r>
+              <w:rPr>
+                <w:rFonts w:cs="Arial"/>
+                <w:b/>
+                <w:sz w:val="28"/>
+                <w:szCs w:val="32"/>
+                <w:lang w:bidi="ta-IN"/>
+              </w:rPr>
+              <w:t xml:space="preserve">PageNo. </w:t>
+            </w:r>
+            <w:r>
+              <w:rPr>
+                <w:rFonts w:cs="Arial"/>
+                <w:b/>
+                <w:sz w:val="28"/>
+                <w:szCs w:val="32"/>
+                <w:lang w:bidi="ta-IN"/>
+              </w:rPr>
+              <w:t>2</w:t>
+            </w:r>
+            <w:r>
+              <w:rPr>
+                <w:rFonts w:cs="Arial"/>
+                <w:b/>
+                <w:sz w:val="28"/>
+                <w:szCs w:val="32"/>
+                <w:lang w:bidi="ta-IN"/>
+              </w:rPr>
+              <w:t>39</w:t>
             </w:r>
           </w:p>
           <w:p>
@@ -1046,7 +2214,7 @@
                 <w:szCs w:val="32"/>
                 <w:lang w:bidi="ta-IN"/>
               </w:rPr>
-              <w:t>Middle page</w:t>
+              <w:t>Top page</w:t>
             </w:r>
           </w:p>
         </w:tc>
@@ -1079,15 +2247,15 @@
                 <w:sz w:val="36"/>
                 <w:szCs w:val="36"/>
               </w:rPr>
-              <w:t>qûhõ– qüûe—ZyhõJ</w:t>
-            </w:r>
-            <w:r>
-              <w:rPr>
-                <w:rFonts w:ascii="BRH Malayalam Extra" w:hAnsi="BRH Malayalam Extra" w:cs="BRH Malayalam Extra"/>
-                <w:sz w:val="36"/>
-                <w:szCs w:val="36"/>
-              </w:rPr>
-              <w:t xml:space="preserve"> | </w:t>
+              <w:t>±–À£hõ—J sO§öMtz–Z£hõ—J</w:t>
+            </w:r>
+            <w:r>
+              <w:rPr>
+                <w:rFonts w:ascii="BRH Malayalam Extra" w:hAnsi="BRH Malayalam Extra" w:cs="BRH Malayalam Extra"/>
+                <w:sz w:val="36"/>
+                <w:szCs w:val="36"/>
+              </w:rPr>
+              <w:t xml:space="preserve"> |</w:t>
             </w:r>
           </w:p>
           <w:p>
@@ -1109,7 +2277,7 @@
                 <w:sz w:val="36"/>
                 <w:szCs w:val="36"/>
               </w:rPr>
-              <w:t>qû</w:t>
+              <w:t>±–À£</w:t>
             </w:r>
             <w:r>
               <w:rPr>
@@ -1126,7 +2294,7 @@
                 <w:sz w:val="36"/>
                 <w:szCs w:val="36"/>
               </w:rPr>
-              <w:t xml:space="preserve"> CZy– qû - hõ–J</w:t>
+              <w:t xml:space="preserve"> CZy— ±–À£ - hõ–J</w:t>
             </w:r>
             <w:r>
               <w:rPr>
@@ -1167,33 +2335,33 @@
                 <w:sz w:val="36"/>
                 <w:szCs w:val="36"/>
               </w:rPr>
-              <w:t>qûhõ– qüûe—ZyhõJ</w:t>
-            </w:r>
-            <w:r>
-              <w:rPr>
-                <w:rFonts w:ascii="BRH Malayalam Extra" w:hAnsi="BRH Malayalam Extra" w:cs="BRH Malayalam Extra"/>
-                <w:sz w:val="36"/>
-                <w:szCs w:val="36"/>
-              </w:rPr>
-              <w:t xml:space="preserve"> | </w:t>
-            </w:r>
-          </w:p>
-          <w:p>
-            <w:pPr>
-              <w:spacing w:before="0" w:line="240" w:lineRule="auto"/>
-              <w:rPr>
-                <w:rFonts w:ascii="BRH Malayalam Extra" w:hAnsi="BRH Malayalam Extra" w:cs="BRH Malayalam Extra"/>
-                <w:sz w:val="36"/>
-                <w:szCs w:val="36"/>
-              </w:rPr>
-            </w:pPr>
-            <w:r>
-              <w:rPr>
-                <w:rFonts w:ascii="BRH Malayalam Extra" w:hAnsi="BRH Malayalam Extra" w:cs="BRH Malayalam Extra"/>
-                <w:sz w:val="36"/>
-                <w:szCs w:val="36"/>
-              </w:rPr>
-              <w:t>qû</w:t>
+              <w:t>±–À£hõ—J sO§öMtz–Z£hõ—J</w:t>
+            </w:r>
+            <w:r>
+              <w:rPr>
+                <w:rFonts w:ascii="BRH Malayalam Extra" w:hAnsi="BRH Malayalam Extra" w:cs="BRH Malayalam Extra"/>
+                <w:sz w:val="36"/>
+                <w:szCs w:val="36"/>
+              </w:rPr>
+              <w:t xml:space="preserve"> |</w:t>
+            </w:r>
+          </w:p>
+          <w:p>
+            <w:pPr>
+              <w:spacing w:before="0" w:line="240" w:lineRule="auto"/>
+              <w:rPr>
+                <w:rFonts w:ascii="BRH Malayalam Extra" w:hAnsi="BRH Malayalam Extra" w:cs="BRH Malayalam Extra"/>
+                <w:sz w:val="36"/>
+                <w:szCs w:val="36"/>
+              </w:rPr>
+            </w:pPr>
+            <w:r>
+              <w:rPr>
+                <w:rFonts w:ascii="BRH Malayalam Extra" w:hAnsi="BRH Malayalam Extra" w:cs="BRH Malayalam Extra"/>
+                <w:sz w:val="36"/>
+                <w:szCs w:val="36"/>
+              </w:rPr>
+              <w:t>±–À£</w:t>
             </w:r>
             <w:r>
               <w:rPr>
@@ -1202,15 +2370,15 @@
                 <w:szCs w:val="36"/>
                 <w:highlight w:val="green"/>
               </w:rPr>
-              <w:t>hõ</w:t>
-            </w:r>
-            <w:r>
-              <w:rPr>
-                <w:rFonts w:ascii="BRH Malayalam Extra" w:hAnsi="BRH Malayalam Extra" w:cs="BRH Malayalam Extra"/>
-                <w:sz w:val="36"/>
-                <w:szCs w:val="36"/>
-              </w:rPr>
-              <w:t>– CZy– qû - hõ–J</w:t>
+              <w:t>hõ–</w:t>
+            </w:r>
+            <w:r>
+              <w:rPr>
+                <w:rFonts w:ascii="BRH Malayalam Extra" w:hAnsi="BRH Malayalam Extra" w:cs="BRH Malayalam Extra"/>
+                <w:sz w:val="36"/>
+                <w:szCs w:val="36"/>
+              </w:rPr>
+              <w:t xml:space="preserve"> CZy— ±–À£ - hõ–J</w:t>
             </w:r>
             <w:r>
               <w:rPr>
@@ -1225,7 +2393,7 @@
       </w:tr>
       <w:tr>
         <w:trPr>
-          <w:trHeight w:val="3243"/>
+          <w:trHeight w:val="1407"/>
         </w:trPr>
         <w:tc>
           <w:tcPr>
@@ -1256,7 +2424,7 @@
                 <w:szCs w:val="32"/>
                 <w:lang w:bidi="ta-IN"/>
               </w:rPr>
-              <w:t>16.9, 9th Anuvaakam</w:t>
+              <w:t xml:space="preserve">Rudram Kramam, </w:t>
             </w:r>
           </w:p>
           <w:p>
@@ -1278,7 +2446,7 @@
                 <w:szCs w:val="32"/>
                 <w:lang w:bidi="ta-IN"/>
               </w:rPr>
-              <w:t>PageNo. 250</w:t>
+              <w:t>16.4, 2nd Anuvaakam</w:t>
             </w:r>
           </w:p>
           <w:p>
@@ -1300,12 +2468,9 @@
                 <w:szCs w:val="32"/>
                 <w:lang w:bidi="ta-IN"/>
               </w:rPr>
-              <w:t>Bottom page</w:t>
-            </w:r>
-          </w:p>
-          <w:p>
-            <w:pPr>
-              <w:spacing w:before="0" w:line="240" w:lineRule="auto"/>
+              <w:t>PageNo. 2</w:t>
+            </w:r>
+            <w:r>
               <w:rPr>
                 <w:rFonts w:cs="Arial"/>
                 <w:b/>
@@ -1313,74 +2478,7 @@
                 <w:szCs w:val="32"/>
                 <w:lang w:bidi="ta-IN"/>
               </w:rPr>
-            </w:pPr>
-          </w:p>
-          <w:p>
-            <w:pPr>
-              <w:spacing w:before="0" w:line="240" w:lineRule="auto"/>
-              <w:rPr>
-                <w:rFonts w:cs="Arial"/>
-                <w:b/>
-                <w:sz w:val="28"/>
-                <w:szCs w:val="32"/>
-                <w:lang w:bidi="ta-IN"/>
-              </w:rPr>
-            </w:pPr>
-          </w:p>
-          <w:p>
-            <w:pPr>
-              <w:spacing w:before="0" w:line="240" w:lineRule="auto"/>
-              <w:rPr>
-                <w:rFonts w:cs="Arial"/>
-                <w:b/>
-                <w:sz w:val="28"/>
-                <w:szCs w:val="32"/>
-                <w:lang w:bidi="ta-IN"/>
-              </w:rPr>
-            </w:pPr>
-          </w:p>
-          <w:p>
-            <w:pPr>
-              <w:spacing w:before="0" w:line="240" w:lineRule="auto"/>
-              <w:rPr>
-                <w:rFonts w:cs="Arial"/>
-                <w:b/>
-                <w:sz w:val="28"/>
-                <w:szCs w:val="32"/>
-                <w:lang w:bidi="ta-IN"/>
-              </w:rPr>
-            </w:pPr>
-            <w:r>
-              <w:rPr>
-                <w:rFonts w:cs="Arial"/>
-                <w:b/>
-                <w:sz w:val="28"/>
-                <w:szCs w:val="32"/>
-                <w:lang w:bidi="ta-IN"/>
-              </w:rPr>
-              <w:t>16.10, 10th Anuvaakam</w:t>
-            </w:r>
-          </w:p>
-          <w:p>
-            <w:pPr>
-              <w:spacing w:before="0" w:line="240" w:lineRule="auto"/>
-              <w:rPr>
-                <w:rFonts w:cs="Arial"/>
-                <w:b/>
-                <w:sz w:val="28"/>
-                <w:szCs w:val="32"/>
-                <w:lang w:bidi="ta-IN"/>
-              </w:rPr>
-            </w:pPr>
-            <w:r>
-              <w:rPr>
-                <w:rFonts w:cs="Arial"/>
-                <w:b/>
-                <w:sz w:val="28"/>
-                <w:szCs w:val="32"/>
-                <w:lang w:bidi="ta-IN"/>
-              </w:rPr>
-              <w:t>PageNo. 253</w:t>
+              <w:t>40</w:t>
             </w:r>
           </w:p>
           <w:p>
@@ -1435,7 +2533,15 @@
                 <w:sz w:val="36"/>
                 <w:szCs w:val="36"/>
               </w:rPr>
-              <w:t xml:space="preserve">di— Bizp–Z§¥KhõJ— | </w:t>
+              <w:t>qûhõ– qüûe—ZyhõJ</w:t>
+            </w:r>
+            <w:r>
+              <w:rPr>
+                <w:rFonts w:ascii="BRH Malayalam Extra" w:hAnsi="BRH Malayalam Extra" w:cs="BRH Malayalam Extra"/>
+                <w:sz w:val="36"/>
+                <w:szCs w:val="36"/>
+              </w:rPr>
+              <w:t xml:space="preserve"> | </w:t>
             </w:r>
           </w:p>
           <w:p>
@@ -1457,7 +2563,7 @@
                 <w:sz w:val="36"/>
                 <w:szCs w:val="36"/>
               </w:rPr>
-              <w:t>B–iz–</w:t>
+              <w:t>qû</w:t>
             </w:r>
             <w:r>
               <w:rPr>
@@ -1466,130 +2572,15 @@
                 <w:szCs w:val="36"/>
                 <w:highlight w:val="yellow"/>
               </w:rPr>
-              <w:t>p</w:t>
-            </w:r>
-            <w:r>
-              <w:rPr>
-                <w:rFonts w:ascii="BRH Malayalam Extra" w:hAnsi="BRH Malayalam Extra" w:cs="BRH Malayalam Extra"/>
-                <w:sz w:val="36"/>
-                <w:szCs w:val="36"/>
-              </w:rPr>
-              <w:t xml:space="preserve">Z§¥Khõ– </w:t>
-            </w:r>
-          </w:p>
-          <w:p>
-            <w:pPr>
-              <w:widowControl w:val="0"/>
-              <w:autoSpaceDE w:val="0"/>
-              <w:autoSpaceDN w:val="0"/>
-              <w:adjustRightInd w:val="0"/>
-              <w:spacing w:before="0" w:line="240" w:lineRule="auto"/>
-              <w:rPr>
-                <w:rFonts w:ascii="BRH Malayalam Extra" w:hAnsi="BRH Malayalam Extra" w:cs="BRH Malayalam Extra"/>
-                <w:sz w:val="36"/>
-                <w:szCs w:val="36"/>
-              </w:rPr>
-            </w:pPr>
-            <w:r>
-              <w:rPr>
-                <w:rFonts w:ascii="BRH Malayalam Extra" w:hAnsi="BRH Malayalam Extra" w:cs="BRH Malayalam Extra"/>
-                <w:sz w:val="36"/>
-                <w:szCs w:val="36"/>
-              </w:rPr>
-              <w:t>CZõx˜ - iz–p–Z§¥KhõJ—</w:t>
-            </w:r>
-            <w:r>
-              <w:rPr>
-                <w:rFonts w:ascii="BRH Malayalam Extra" w:hAnsi="BRH Malayalam Extra" w:cs="BRH Malayalam Extra"/>
-                <w:sz w:val="36"/>
-                <w:szCs w:val="36"/>
-              </w:rPr>
-              <w:t xml:space="preserve"> |</w:t>
-            </w:r>
-          </w:p>
-          <w:p>
-            <w:pPr>
-              <w:widowControl w:val="0"/>
-              <w:autoSpaceDE w:val="0"/>
-              <w:autoSpaceDN w:val="0"/>
-              <w:adjustRightInd w:val="0"/>
-              <w:spacing w:before="0" w:line="240" w:lineRule="auto"/>
-              <w:rPr>
-                <w:rFonts w:ascii="BRH Malayalam Extra" w:hAnsi="BRH Malayalam Extra" w:cs="BRH Malayalam Extra"/>
-                <w:sz w:val="36"/>
-                <w:szCs w:val="36"/>
-              </w:rPr>
-            </w:pPr>
-            <w:r>
-              <w:rPr>
-                <w:rFonts w:ascii="BRH Malayalam Extra" w:hAnsi="BRH Malayalam Extra" w:cs="BRH Malayalam Extra"/>
-                <w:sz w:val="36"/>
-                <w:szCs w:val="36"/>
-              </w:rPr>
-              <w:t>Z–d¡¥px— k¡öb</w:t>
-            </w:r>
-            <w:r>
-              <w:rPr>
-                <w:rFonts w:ascii="BRH Malayalam Extra" w:hAnsi="BRH Malayalam Extra" w:cs="BRH Malayalam Extra"/>
-                <w:sz w:val="36"/>
-                <w:szCs w:val="36"/>
-              </w:rPr>
-              <w:t xml:space="preserve"> | </w:t>
-            </w:r>
-            <w:r>
-              <w:rPr>
-                <w:rFonts w:ascii="BRH Malayalam Extra" w:hAnsi="BRH Malayalam Extra" w:cs="BRH Malayalam Extra"/>
-                <w:sz w:val="36"/>
-                <w:szCs w:val="36"/>
-              </w:rPr>
-              <w:t>k¡–öb– kz–ky–r–J</w:t>
-            </w:r>
-            <w:r>
-              <w:rPr>
-                <w:rFonts w:ascii="BRH Malayalam Extra" w:hAnsi="BRH Malayalam Extra" w:cs="BRH Malayalam Extra"/>
-                <w:sz w:val="36"/>
-                <w:szCs w:val="36"/>
-              </w:rPr>
-              <w:t xml:space="preserve"> | </w:t>
-            </w:r>
-          </w:p>
-          <w:p>
-            <w:pPr>
-              <w:widowControl w:val="0"/>
-              <w:autoSpaceDE w:val="0"/>
-              <w:autoSpaceDN w:val="0"/>
-              <w:adjustRightInd w:val="0"/>
-              <w:spacing w:before="0" w:line="240" w:lineRule="auto"/>
-              <w:rPr>
-                <w:rFonts w:ascii="BRH Malayalam Extra" w:hAnsi="BRH Malayalam Extra" w:cs="BRH Malayalam Extra"/>
-                <w:sz w:val="36"/>
-                <w:szCs w:val="36"/>
-              </w:rPr>
-            </w:pPr>
-            <w:r>
-              <w:rPr>
-                <w:rFonts w:ascii="BRH Malayalam Extra" w:hAnsi="BRH Malayalam Extra" w:cs="BRH Malayalam Extra"/>
-                <w:sz w:val="36"/>
-                <w:szCs w:val="36"/>
-              </w:rPr>
-              <w:t>kz–ky–</w:t>
-            </w:r>
-            <w:r>
-              <w:rPr>
-                <w:rFonts w:ascii="BRH Malayalam Extra" w:hAnsi="BRH Malayalam Extra" w:cs="BRH Malayalam Extra"/>
-                <w:sz w:val="36"/>
-                <w:szCs w:val="36"/>
-                <w:highlight w:val="yellow"/>
-              </w:rPr>
-              <w:t>r–J</w:t>
-            </w:r>
-            <w:r>
-              <w:rPr>
-                <w:rFonts w:ascii="BRH Malayalam Extra" w:hAnsi="BRH Malayalam Extra" w:cs="BRH Malayalam Extra"/>
-                <w:sz w:val="36"/>
-                <w:szCs w:val="36"/>
-              </w:rPr>
-              <w:t xml:space="preserve"> CZy— kzkyrJ</w:t>
+              <w:t>hõ–J</w:t>
+            </w:r>
+            <w:r>
+              <w:rPr>
+                <w:rFonts w:ascii="BRH Malayalam Extra" w:hAnsi="BRH Malayalam Extra" w:cs="BRH Malayalam Extra"/>
+                <w:sz w:val="36"/>
+                <w:szCs w:val="36"/>
+              </w:rPr>
+              <w:t xml:space="preserve"> CZy– qû - hõ–J</w:t>
             </w:r>
             <w:r>
               <w:rPr>
@@ -1630,9 +2621,320 @@
                 <w:sz w:val="36"/>
                 <w:szCs w:val="36"/>
               </w:rPr>
-              <w:t xml:space="preserve">di— Bizp–Z§¥KhõJ— | </w:t>
-            </w:r>
-          </w:p>
+              <w:t>qûhõ– qüûe—ZyhõJ</w:t>
+            </w:r>
+            <w:r>
+              <w:rPr>
+                <w:rFonts w:ascii="BRH Malayalam Extra" w:hAnsi="BRH Malayalam Extra" w:cs="BRH Malayalam Extra"/>
+                <w:sz w:val="36"/>
+                <w:szCs w:val="36"/>
+              </w:rPr>
+              <w:t xml:space="preserve"> | </w:t>
+            </w:r>
+          </w:p>
+          <w:p>
+            <w:pPr>
+              <w:spacing w:before="0" w:line="240" w:lineRule="auto"/>
+              <w:rPr>
+                <w:rFonts w:ascii="BRH Malayalam Extra" w:hAnsi="BRH Malayalam Extra" w:cs="BRH Malayalam Extra"/>
+                <w:sz w:val="36"/>
+                <w:szCs w:val="36"/>
+              </w:rPr>
+            </w:pPr>
+            <w:r>
+              <w:rPr>
+                <w:rFonts w:ascii="BRH Malayalam Extra" w:hAnsi="BRH Malayalam Extra" w:cs="BRH Malayalam Extra"/>
+                <w:sz w:val="36"/>
+                <w:szCs w:val="36"/>
+              </w:rPr>
+              <w:t>qû</w:t>
+            </w:r>
+            <w:r>
+              <w:rPr>
+                <w:rFonts w:ascii="BRH Malayalam Extra" w:hAnsi="BRH Malayalam Extra" w:cs="BRH Malayalam Extra"/>
+                <w:sz w:val="36"/>
+                <w:szCs w:val="36"/>
+                <w:highlight w:val="green"/>
+              </w:rPr>
+              <w:t>hõ</w:t>
+            </w:r>
+            <w:r>
+              <w:rPr>
+                <w:rFonts w:ascii="BRH Malayalam Extra" w:hAnsi="BRH Malayalam Extra" w:cs="BRH Malayalam Extra"/>
+                <w:sz w:val="36"/>
+                <w:szCs w:val="36"/>
+              </w:rPr>
+              <w:t>– CZy– qû - hõ–J</w:t>
+            </w:r>
+            <w:r>
+              <w:rPr>
+                <w:rFonts w:ascii="BRH Malayalam Extra" w:hAnsi="BRH Malayalam Extra" w:cs="BRH Malayalam Extra"/>
+                <w:sz w:val="36"/>
+                <w:szCs w:val="36"/>
+              </w:rPr>
+              <w:t xml:space="preserve"> |</w:t>
+            </w:r>
+          </w:p>
+        </w:tc>
+      </w:tr>
+      <w:tr>
+        <w:trPr>
+          <w:trHeight w:val="3243"/>
+        </w:trPr>
+        <w:tc>
+          <w:tcPr>
+            <w:tcW w:w="3339" w:type="dxa"/>
+            <w:tcBorders>
+              <w:top w:val="single" w:sz="4" w:space="0" w:color="000000"/>
+              <w:left w:val="single" w:sz="4" w:space="0" w:color="000000"/>
+              <w:bottom w:val="single" w:sz="4" w:space="0" w:color="000000"/>
+              <w:right w:val="single" w:sz="4" w:space="0" w:color="000000"/>
+            </w:tcBorders>
+          </w:tcPr>
+          <w:p>
+            <w:pPr>
+              <w:spacing w:before="0" w:line="240" w:lineRule="auto"/>
+              <w:rPr>
+                <w:rFonts w:cs="Arial"/>
+                <w:b/>
+                <w:sz w:val="28"/>
+                <w:szCs w:val="32"/>
+                <w:lang w:bidi="ta-IN"/>
+              </w:rPr>
+            </w:pPr>
+            <w:r>
+              <w:rPr>
+                <w:rFonts w:cs="Arial"/>
+                <w:b/>
+                <w:sz w:val="28"/>
+                <w:szCs w:val="32"/>
+                <w:lang w:bidi="ta-IN"/>
+              </w:rPr>
+              <w:lastRenderedPageBreak/>
+              <w:t xml:space="preserve">Rudram Kramam, </w:t>
+            </w:r>
+          </w:p>
+          <w:p>
+            <w:pPr>
+              <w:spacing w:before="0" w:line="240" w:lineRule="auto"/>
+              <w:rPr>
+                <w:rFonts w:cs="Arial"/>
+                <w:b/>
+                <w:sz w:val="28"/>
+                <w:szCs w:val="32"/>
+                <w:lang w:bidi="ta-IN"/>
+              </w:rPr>
+            </w:pPr>
+            <w:r>
+              <w:rPr>
+                <w:rFonts w:cs="Arial"/>
+                <w:b/>
+                <w:sz w:val="28"/>
+                <w:szCs w:val="32"/>
+                <w:lang w:bidi="ta-IN"/>
+              </w:rPr>
+              <w:t>16.9, 9th Anuvaakam</w:t>
+            </w:r>
+          </w:p>
+          <w:p>
+            <w:pPr>
+              <w:spacing w:before="0" w:line="240" w:lineRule="auto"/>
+              <w:rPr>
+                <w:rFonts w:cs="Arial"/>
+                <w:b/>
+                <w:sz w:val="28"/>
+                <w:szCs w:val="32"/>
+                <w:lang w:bidi="ta-IN"/>
+              </w:rPr>
+            </w:pPr>
+            <w:r>
+              <w:rPr>
+                <w:rFonts w:cs="Arial"/>
+                <w:b/>
+                <w:sz w:val="28"/>
+                <w:szCs w:val="32"/>
+                <w:lang w:bidi="ta-IN"/>
+              </w:rPr>
+              <w:t>PageNo. 25</w:t>
+            </w:r>
+            <w:r>
+              <w:rPr>
+                <w:rFonts w:cs="Arial"/>
+                <w:b/>
+                <w:sz w:val="28"/>
+                <w:szCs w:val="32"/>
+                <w:lang w:bidi="ta-IN"/>
+              </w:rPr>
+              <w:t>3</w:t>
+            </w:r>
+          </w:p>
+          <w:p>
+            <w:pPr>
+              <w:spacing w:before="0" w:line="240" w:lineRule="auto"/>
+              <w:rPr>
+                <w:rFonts w:cs="Arial"/>
+                <w:b/>
+                <w:sz w:val="28"/>
+                <w:szCs w:val="32"/>
+                <w:lang w:bidi="ta-IN"/>
+              </w:rPr>
+            </w:pPr>
+            <w:r>
+              <w:rPr>
+                <w:rFonts w:cs="Arial"/>
+                <w:b/>
+                <w:sz w:val="28"/>
+                <w:szCs w:val="32"/>
+                <w:lang w:bidi="ta-IN"/>
+              </w:rPr>
+              <w:t>Bottom page</w:t>
+            </w:r>
+          </w:p>
+          <w:p>
+            <w:pPr>
+              <w:spacing w:before="0" w:line="240" w:lineRule="auto"/>
+              <w:rPr>
+                <w:rFonts w:cs="Arial"/>
+                <w:b/>
+                <w:sz w:val="28"/>
+                <w:szCs w:val="32"/>
+                <w:lang w:bidi="ta-IN"/>
+              </w:rPr>
+            </w:pPr>
+          </w:p>
+          <w:p>
+            <w:pPr>
+              <w:spacing w:before="0" w:line="240" w:lineRule="auto"/>
+              <w:rPr>
+                <w:rFonts w:cs="Arial"/>
+                <w:b/>
+                <w:sz w:val="28"/>
+                <w:szCs w:val="32"/>
+                <w:lang w:bidi="ta-IN"/>
+              </w:rPr>
+            </w:pPr>
+          </w:p>
+          <w:p>
+            <w:pPr>
+              <w:spacing w:before="0" w:line="240" w:lineRule="auto"/>
+              <w:rPr>
+                <w:rFonts w:cs="Arial"/>
+                <w:b/>
+                <w:sz w:val="28"/>
+                <w:szCs w:val="32"/>
+                <w:lang w:bidi="ta-IN"/>
+              </w:rPr>
+            </w:pPr>
+          </w:p>
+          <w:p>
+            <w:pPr>
+              <w:spacing w:before="0" w:line="240" w:lineRule="auto"/>
+              <w:rPr>
+                <w:rFonts w:cs="Arial"/>
+                <w:b/>
+                <w:sz w:val="28"/>
+                <w:szCs w:val="32"/>
+                <w:lang w:bidi="ta-IN"/>
+              </w:rPr>
+            </w:pPr>
+            <w:r>
+              <w:rPr>
+                <w:rFonts w:cs="Arial"/>
+                <w:b/>
+                <w:sz w:val="28"/>
+                <w:szCs w:val="32"/>
+                <w:lang w:bidi="ta-IN"/>
+              </w:rPr>
+              <w:t xml:space="preserve">Rudram Kramam, </w:t>
+            </w:r>
+          </w:p>
+          <w:p>
+            <w:pPr>
+              <w:spacing w:before="0" w:line="240" w:lineRule="auto"/>
+              <w:rPr>
+                <w:rFonts w:cs="Arial"/>
+                <w:b/>
+                <w:sz w:val="28"/>
+                <w:szCs w:val="32"/>
+                <w:lang w:bidi="ta-IN"/>
+              </w:rPr>
+            </w:pPr>
+            <w:r>
+              <w:rPr>
+                <w:rFonts w:cs="Arial"/>
+                <w:b/>
+                <w:sz w:val="28"/>
+                <w:szCs w:val="32"/>
+                <w:lang w:bidi="ta-IN"/>
+              </w:rPr>
+              <w:t>16.10, 10th Anuvaakam</w:t>
+            </w:r>
+          </w:p>
+          <w:p>
+            <w:pPr>
+              <w:spacing w:before="0" w:line="240" w:lineRule="auto"/>
+              <w:rPr>
+                <w:rFonts w:cs="Arial"/>
+                <w:b/>
+                <w:sz w:val="28"/>
+                <w:szCs w:val="32"/>
+                <w:lang w:bidi="ta-IN"/>
+              </w:rPr>
+            </w:pPr>
+            <w:r>
+              <w:rPr>
+                <w:rFonts w:cs="Arial"/>
+                <w:b/>
+                <w:sz w:val="28"/>
+                <w:szCs w:val="32"/>
+                <w:lang w:bidi="ta-IN"/>
+              </w:rPr>
+              <w:t>PageNo. 25</w:t>
+            </w:r>
+            <w:r>
+              <w:rPr>
+                <w:rFonts w:cs="Arial"/>
+                <w:b/>
+                <w:sz w:val="28"/>
+                <w:szCs w:val="32"/>
+                <w:lang w:bidi="ta-IN"/>
+              </w:rPr>
+              <w:t>6</w:t>
+            </w:r>
+          </w:p>
+          <w:p>
+            <w:pPr>
+              <w:spacing w:before="0" w:line="240" w:lineRule="auto"/>
+              <w:rPr>
+                <w:rFonts w:ascii="BRH Malayalam RN" w:hAnsi="BRH Malayalam RN" w:cs="Latha"/>
+                <w:sz w:val="32"/>
+                <w:szCs w:val="32"/>
+                <w:cs/>
+                <w:lang w:bidi="ta-IN"/>
+              </w:rPr>
+            </w:pPr>
+            <w:r>
+              <w:rPr>
+                <w:rFonts w:cs="Arial"/>
+                <w:b/>
+                <w:sz w:val="28"/>
+                <w:szCs w:val="32"/>
+                <w:lang w:bidi="ta-IN"/>
+              </w:rPr>
+              <w:t>Middle page</w:t>
+            </w:r>
+          </w:p>
+        </w:tc>
+        <w:tc>
+          <w:tcPr>
+            <w:tcW w:w="5103" w:type="dxa"/>
+            <w:tcBorders>
+              <w:top w:val="single" w:sz="4" w:space="0" w:color="000000"/>
+              <w:left w:val="single" w:sz="4" w:space="0" w:color="000000"/>
+              <w:bottom w:val="single" w:sz="4" w:space="0" w:color="000000"/>
+              <w:right w:val="single" w:sz="4" w:space="0" w:color="000000"/>
+            </w:tcBorders>
+          </w:tcPr>
           <w:p>
             <w:pPr>
               <w:widowControl w:val="0"/>
@@ -1652,24 +2954,7 @@
                 <w:sz w:val="36"/>
                 <w:szCs w:val="36"/>
               </w:rPr>
-              <w:t>B–iz–</w:t>
-            </w:r>
-            <w:r>
-              <w:rPr>
-                <w:rFonts w:ascii="BRH Malayalam Extra" w:hAnsi="BRH Malayalam Extra" w:cs="BRH Malayalam Extra"/>
-                <w:sz w:val="36"/>
-                <w:szCs w:val="36"/>
-                <w:highlight w:val="green"/>
-              </w:rPr>
-              <w:t>p</w:t>
-            </w:r>
-            <w:r>
-              <w:rPr>
-                <w:rFonts w:ascii="BRH Malayalam Extra" w:hAnsi="BRH Malayalam Extra" w:cs="BRH Malayalam Extra"/>
-                <w:sz w:val="36"/>
-                <w:szCs w:val="36"/>
-              </w:rPr>
-              <w:t xml:space="preserve">–Z§¥Khõ– </w:t>
+              <w:t xml:space="preserve">di— Bizp–Z§¥KhõJ— | </w:t>
             </w:r>
           </w:p>
           <w:p>
@@ -1691,15 +2976,24 @@
                 <w:sz w:val="36"/>
                 <w:szCs w:val="36"/>
               </w:rPr>
-              <w:t>CZõx˜ - iz–p–Z§¥KhõJ—</w:t>
-            </w:r>
-            <w:r>
-              <w:rPr>
-                <w:rFonts w:ascii="BRH Malayalam Extra" w:hAnsi="BRH Malayalam Extra" w:cs="BRH Malayalam Extra"/>
-                <w:sz w:val="36"/>
-                <w:szCs w:val="36"/>
-              </w:rPr>
-              <w:t xml:space="preserve"> |</w:t>
+              <w:t>B–iz–</w:t>
+            </w:r>
+            <w:r>
+              <w:rPr>
+                <w:rFonts w:ascii="BRH Malayalam Extra" w:hAnsi="BRH Malayalam Extra" w:cs="BRH Malayalam Extra"/>
+                <w:sz w:val="36"/>
+                <w:szCs w:val="36"/>
+                <w:highlight w:val="yellow"/>
+              </w:rPr>
+              <w:t>p</w:t>
+            </w:r>
+            <w:r>
+              <w:rPr>
+                <w:rFonts w:ascii="BRH Malayalam Extra" w:hAnsi="BRH Malayalam Extra" w:cs="BRH Malayalam Extra"/>
+                <w:sz w:val="36"/>
+                <w:szCs w:val="36"/>
+              </w:rPr>
+              <w:t xml:space="preserve">Z§¥Khõ– </w:t>
             </w:r>
           </w:p>
           <w:p>
@@ -1721,6 +3015,41 @@
                 <w:sz w:val="36"/>
                 <w:szCs w:val="36"/>
               </w:rPr>
+              <w:t>CZõx˜ - iz–p–Z§¥KhõJ—</w:t>
+            </w:r>
+            <w:r>
+              <w:rPr>
+                <w:rFonts w:ascii="BRH Malayalam Extra" w:hAnsi="BRH Malayalam Extra" w:cs="BRH Malayalam Extra"/>
+                <w:sz w:val="36"/>
+                <w:szCs w:val="36"/>
+              </w:rPr>
+              <w:t xml:space="preserve"> |</w:t>
+            </w:r>
+          </w:p>
+          <w:p>
+            <w:pPr>
+              <w:pStyle w:val="NoSpacing"/>
+            </w:pPr>
+          </w:p>
+          <w:p>
+            <w:pPr>
+              <w:widowControl w:val="0"/>
+              <w:autoSpaceDE w:val="0"/>
+              <w:autoSpaceDN w:val="0"/>
+              <w:adjustRightInd w:val="0"/>
+              <w:spacing w:before="0" w:line="240" w:lineRule="auto"/>
+              <w:rPr>
+                <w:rFonts w:ascii="BRH Malayalam Extra" w:hAnsi="BRH Malayalam Extra" w:cs="BRH Malayalam Extra"/>
+                <w:sz w:val="36"/>
+                <w:szCs w:val="36"/>
+              </w:rPr>
+            </w:pPr>
+            <w:r>
+              <w:rPr>
+                <w:rFonts w:ascii="BRH Malayalam Extra" w:hAnsi="BRH Malayalam Extra" w:cs="BRH Malayalam Extra"/>
+                <w:sz w:val="36"/>
+                <w:szCs w:val="36"/>
+              </w:rPr>
               <w:t>Z–d¡¥px— k¡öb</w:t>
             </w:r>
             <w:r>
@@ -1750,6 +3079,10 @@
           </w:p>
           <w:p>
             <w:pPr>
+              <w:widowControl w:val="0"/>
+              <w:autoSpaceDE w:val="0"/>
+              <w:autoSpaceDN w:val="0"/>
+              <w:adjustRightInd w:val="0"/>
               <w:spacing w:before="0" w:line="240" w:lineRule="auto"/>
               <w:rPr>
                 <w:rFonts w:ascii="BRH Malayalam Extra" w:hAnsi="BRH Malayalam Extra" w:cs="BRH Malayalam Extra"/>
@@ -1770,8 +3103,204 @@
                 <w:rFonts w:ascii="BRH Malayalam Extra" w:hAnsi="BRH Malayalam Extra" w:cs="BRH Malayalam Extra"/>
                 <w:sz w:val="36"/>
                 <w:szCs w:val="36"/>
+                <w:highlight w:val="yellow"/>
+              </w:rPr>
+              <w:t>r–J</w:t>
+            </w:r>
+            <w:r>
+              <w:rPr>
+                <w:rFonts w:ascii="BRH Malayalam Extra" w:hAnsi="BRH Malayalam Extra" w:cs="BRH Malayalam Extra"/>
+                <w:sz w:val="36"/>
+                <w:szCs w:val="36"/>
+              </w:rPr>
+              <w:t xml:space="preserve"> CZy— kzkyrJ</w:t>
+            </w:r>
+            <w:r>
+              <w:rPr>
+                <w:rFonts w:ascii="BRH Malayalam Extra" w:hAnsi="BRH Malayalam Extra" w:cs="BRH Malayalam Extra"/>
+                <w:sz w:val="36"/>
+                <w:szCs w:val="36"/>
+              </w:rPr>
+              <w:t xml:space="preserve"> |</w:t>
+            </w:r>
+          </w:p>
+        </w:tc>
+        <w:tc>
+          <w:tcPr>
+            <w:tcW w:w="5220" w:type="dxa"/>
+            <w:tcBorders>
+              <w:top w:val="single" w:sz="4" w:space="0" w:color="000000"/>
+              <w:left w:val="single" w:sz="4" w:space="0" w:color="000000"/>
+              <w:bottom w:val="single" w:sz="4" w:space="0" w:color="000000"/>
+              <w:right w:val="single" w:sz="4" w:space="0" w:color="000000"/>
+            </w:tcBorders>
+          </w:tcPr>
+          <w:p>
+            <w:pPr>
+              <w:widowControl w:val="0"/>
+              <w:autoSpaceDE w:val="0"/>
+              <w:autoSpaceDN w:val="0"/>
+              <w:adjustRightInd w:val="0"/>
+              <w:spacing w:before="0" w:line="240" w:lineRule="auto"/>
+              <w:rPr>
+                <w:rFonts w:ascii="BRH Malayalam Extra" w:hAnsi="BRH Malayalam Extra" w:cs="BRH Malayalam Extra"/>
+                <w:sz w:val="36"/>
+                <w:szCs w:val="36"/>
+              </w:rPr>
+            </w:pPr>
+            <w:r>
+              <w:rPr>
+                <w:rFonts w:ascii="BRH Malayalam Extra" w:hAnsi="BRH Malayalam Extra" w:cs="BRH Malayalam Extra"/>
+                <w:sz w:val="36"/>
+                <w:szCs w:val="36"/>
+              </w:rPr>
+              <w:t xml:space="preserve">di— Bizp–Z§¥KhõJ— | </w:t>
+            </w:r>
+          </w:p>
+          <w:p>
+            <w:pPr>
+              <w:widowControl w:val="0"/>
+              <w:autoSpaceDE w:val="0"/>
+              <w:autoSpaceDN w:val="0"/>
+              <w:adjustRightInd w:val="0"/>
+              <w:spacing w:before="0" w:line="240" w:lineRule="auto"/>
+              <w:rPr>
+                <w:rFonts w:ascii="BRH Malayalam Extra" w:hAnsi="BRH Malayalam Extra" w:cs="BRH Malayalam Extra"/>
+                <w:sz w:val="36"/>
+                <w:szCs w:val="36"/>
+              </w:rPr>
+            </w:pPr>
+            <w:r>
+              <w:rPr>
+                <w:rFonts w:ascii="BRH Malayalam Extra" w:hAnsi="BRH Malayalam Extra" w:cs="BRH Malayalam Extra"/>
+                <w:sz w:val="36"/>
+                <w:szCs w:val="36"/>
+              </w:rPr>
+              <w:t>B–iz–</w:t>
+            </w:r>
+            <w:r>
+              <w:rPr>
+                <w:rFonts w:ascii="BRH Malayalam Extra" w:hAnsi="BRH Malayalam Extra" w:cs="BRH Malayalam Extra"/>
+                <w:sz w:val="36"/>
+                <w:szCs w:val="36"/>
                 <w:highlight w:val="green"/>
               </w:rPr>
+              <w:t>p</w:t>
+            </w:r>
+            <w:r>
+              <w:rPr>
+                <w:rFonts w:ascii="BRH Malayalam Extra" w:hAnsi="BRH Malayalam Extra" w:cs="BRH Malayalam Extra"/>
+                <w:sz w:val="36"/>
+                <w:szCs w:val="36"/>
+              </w:rPr>
+              <w:t xml:space="preserve">–Z§¥Khõ– </w:t>
+            </w:r>
+          </w:p>
+          <w:p>
+            <w:pPr>
+              <w:widowControl w:val="0"/>
+              <w:autoSpaceDE w:val="0"/>
+              <w:autoSpaceDN w:val="0"/>
+              <w:adjustRightInd w:val="0"/>
+              <w:spacing w:before="0" w:line="240" w:lineRule="auto"/>
+              <w:rPr>
+                <w:rFonts w:ascii="BRH Malayalam Extra" w:hAnsi="BRH Malayalam Extra" w:cs="BRH Malayalam Extra"/>
+                <w:sz w:val="36"/>
+                <w:szCs w:val="36"/>
+              </w:rPr>
+            </w:pPr>
+            <w:r>
+              <w:rPr>
+                <w:rFonts w:ascii="BRH Malayalam Extra" w:hAnsi="BRH Malayalam Extra" w:cs="BRH Malayalam Extra"/>
+                <w:sz w:val="36"/>
+                <w:szCs w:val="36"/>
+              </w:rPr>
+              <w:t>CZõx˜ - iz–p–Z§¥KhõJ—</w:t>
+            </w:r>
+            <w:r>
+              <w:rPr>
+                <w:rFonts w:ascii="BRH Malayalam Extra" w:hAnsi="BRH Malayalam Extra" w:cs="BRH Malayalam Extra"/>
+                <w:sz w:val="36"/>
+                <w:szCs w:val="36"/>
+              </w:rPr>
+              <w:t xml:space="preserve"> |</w:t>
+            </w:r>
+          </w:p>
+          <w:p>
+            <w:pPr>
+              <w:pStyle w:val="NoSpacing"/>
+            </w:pPr>
+          </w:p>
+          <w:p>
+            <w:pPr>
+              <w:widowControl w:val="0"/>
+              <w:autoSpaceDE w:val="0"/>
+              <w:autoSpaceDN w:val="0"/>
+              <w:adjustRightInd w:val="0"/>
+              <w:spacing w:before="0" w:line="240" w:lineRule="auto"/>
+              <w:rPr>
+                <w:rFonts w:ascii="BRH Malayalam Extra" w:hAnsi="BRH Malayalam Extra" w:cs="BRH Malayalam Extra"/>
+                <w:sz w:val="36"/>
+                <w:szCs w:val="36"/>
+              </w:rPr>
+            </w:pPr>
+            <w:r>
+              <w:rPr>
+                <w:rFonts w:ascii="BRH Malayalam Extra" w:hAnsi="BRH Malayalam Extra" w:cs="BRH Malayalam Extra"/>
+                <w:sz w:val="36"/>
+                <w:szCs w:val="36"/>
+              </w:rPr>
+              <w:t>Z–d¡¥px— k¡öb</w:t>
+            </w:r>
+            <w:r>
+              <w:rPr>
+                <w:rFonts w:ascii="BRH Malayalam Extra" w:hAnsi="BRH Malayalam Extra" w:cs="BRH Malayalam Extra"/>
+                <w:sz w:val="36"/>
+                <w:szCs w:val="36"/>
+              </w:rPr>
+              <w:t xml:space="preserve"> | </w:t>
+            </w:r>
+            <w:r>
+              <w:rPr>
+                <w:rFonts w:ascii="BRH Malayalam Extra" w:hAnsi="BRH Malayalam Extra" w:cs="BRH Malayalam Extra"/>
+                <w:sz w:val="36"/>
+                <w:szCs w:val="36"/>
+              </w:rPr>
+              <w:t>k¡–öb– kz–ky–r–J</w:t>
+            </w:r>
+            <w:r>
+              <w:rPr>
+                <w:rFonts w:ascii="BRH Malayalam Extra" w:hAnsi="BRH Malayalam Extra" w:cs="BRH Malayalam Extra"/>
+                <w:sz w:val="36"/>
+                <w:szCs w:val="36"/>
+              </w:rPr>
+              <w:t xml:space="preserve"> | </w:t>
+            </w:r>
+          </w:p>
+          <w:p>
+            <w:pPr>
+              <w:spacing w:before="0" w:line="240" w:lineRule="auto"/>
+              <w:rPr>
+                <w:rFonts w:ascii="BRH Malayalam Extra" w:hAnsi="BRH Malayalam Extra" w:cs="BRH Malayalam Extra"/>
+                <w:sz w:val="36"/>
+                <w:szCs w:val="36"/>
+              </w:rPr>
+            </w:pPr>
+            <w:r>
+              <w:rPr>
+                <w:rFonts w:ascii="BRH Malayalam Extra" w:hAnsi="BRH Malayalam Extra" w:cs="BRH Malayalam Extra"/>
+                <w:sz w:val="36"/>
+                <w:szCs w:val="36"/>
+              </w:rPr>
+              <w:t>kz–ky–</w:t>
+            </w:r>
+            <w:r>
+              <w:rPr>
+                <w:rFonts w:ascii="BRH Malayalam Extra" w:hAnsi="BRH Malayalam Extra" w:cs="BRH Malayalam Extra"/>
+                <w:sz w:val="36"/>
+                <w:szCs w:val="36"/>
+                <w:highlight w:val="green"/>
+              </w:rPr>
               <w:t>r–</w:t>
             </w:r>
             <w:r>
@@ -1781,6 +3310,1005 @@
                 <w:szCs w:val="36"/>
               </w:rPr>
               <w:t xml:space="preserve"> CZy— kzkyrJ</w:t>
+            </w:r>
+            <w:r>
+              <w:rPr>
+                <w:rFonts w:ascii="BRH Malayalam Extra" w:hAnsi="BRH Malayalam Extra" w:cs="BRH Malayalam Extra"/>
+                <w:sz w:val="36"/>
+                <w:szCs w:val="36"/>
+              </w:rPr>
+              <w:t xml:space="preserve"> |</w:t>
+            </w:r>
+          </w:p>
+        </w:tc>
+      </w:tr>
+      <w:tr>
+        <w:trPr>
+          <w:trHeight w:val="829"/>
+        </w:trPr>
+        <w:tc>
+          <w:tcPr>
+            <w:tcW w:w="3339" w:type="dxa"/>
+            <w:tcBorders>
+              <w:top w:val="single" w:sz="4" w:space="0" w:color="000000"/>
+              <w:left w:val="single" w:sz="4" w:space="0" w:color="000000"/>
+              <w:bottom w:val="single" w:sz="4" w:space="0" w:color="000000"/>
+              <w:right w:val="single" w:sz="4" w:space="0" w:color="000000"/>
+            </w:tcBorders>
+          </w:tcPr>
+          <w:p>
+            <w:pPr>
+              <w:spacing w:before="0" w:line="240" w:lineRule="auto"/>
+              <w:rPr>
+                <w:rFonts w:cs="Arial"/>
+                <w:b/>
+                <w:sz w:val="28"/>
+                <w:szCs w:val="32"/>
+                <w:lang w:bidi="ta-IN"/>
+              </w:rPr>
+            </w:pPr>
+            <w:r>
+              <w:rPr>
+                <w:rFonts w:cs="Arial"/>
+                <w:b/>
+                <w:sz w:val="28"/>
+                <w:szCs w:val="32"/>
+                <w:lang w:bidi="ta-IN"/>
+              </w:rPr>
+              <w:t xml:space="preserve">Chamaka Kramam, </w:t>
+            </w:r>
+          </w:p>
+          <w:p>
+            <w:pPr>
+              <w:spacing w:before="0" w:line="240" w:lineRule="auto"/>
+              <w:rPr>
+                <w:rFonts w:cs="Arial"/>
+                <w:b/>
+                <w:sz w:val="28"/>
+                <w:szCs w:val="32"/>
+                <w:lang w:bidi="ta-IN"/>
+              </w:rPr>
+            </w:pPr>
+            <w:r>
+              <w:rPr>
+                <w:rFonts w:cs="Arial"/>
+                <w:b/>
+                <w:sz w:val="28"/>
+                <w:szCs w:val="32"/>
+                <w:lang w:bidi="ta-IN"/>
+              </w:rPr>
+              <w:t>17.1, 1st Anuvaakam</w:t>
+            </w:r>
+          </w:p>
+          <w:p>
+            <w:pPr>
+              <w:spacing w:before="0" w:line="240" w:lineRule="auto"/>
+              <w:rPr>
+                <w:rFonts w:cs="Arial"/>
+                <w:b/>
+                <w:sz w:val="28"/>
+                <w:szCs w:val="32"/>
+                <w:lang w:bidi="ta-IN"/>
+              </w:rPr>
+            </w:pPr>
+            <w:r>
+              <w:rPr>
+                <w:rFonts w:cs="Arial"/>
+                <w:b/>
+                <w:sz w:val="28"/>
+                <w:szCs w:val="32"/>
+                <w:lang w:bidi="ta-IN"/>
+              </w:rPr>
+              <w:t>PageNo. 2</w:t>
+            </w:r>
+            <w:r>
+              <w:rPr>
+                <w:rFonts w:cs="Arial"/>
+                <w:b/>
+                <w:sz w:val="28"/>
+                <w:szCs w:val="32"/>
+                <w:lang w:bidi="ta-IN"/>
+              </w:rPr>
+              <w:t>68</w:t>
+            </w:r>
+          </w:p>
+          <w:p>
+            <w:pPr>
+              <w:spacing w:before="0" w:line="240" w:lineRule="auto"/>
+              <w:rPr>
+                <w:rFonts w:cs="Arial"/>
+                <w:b/>
+                <w:sz w:val="36"/>
+                <w:szCs w:val="36"/>
+                <w:lang w:bidi="ta-IN"/>
+              </w:rPr>
+            </w:pPr>
+            <w:r>
+              <w:rPr>
+                <w:rFonts w:cs="Arial"/>
+                <w:b/>
+                <w:sz w:val="28"/>
+                <w:szCs w:val="32"/>
+                <w:lang w:bidi="ta-IN"/>
+              </w:rPr>
+              <w:t>Middle page</w:t>
+            </w:r>
+          </w:p>
+        </w:tc>
+        <w:tc>
+          <w:tcPr>
+            <w:tcW w:w="5103" w:type="dxa"/>
+            <w:tcBorders>
+              <w:top w:val="single" w:sz="4" w:space="0" w:color="000000"/>
+              <w:left w:val="single" w:sz="4" w:space="0" w:color="000000"/>
+              <w:bottom w:val="single" w:sz="4" w:space="0" w:color="000000"/>
+              <w:right w:val="single" w:sz="4" w:space="0" w:color="000000"/>
+            </w:tcBorders>
+          </w:tcPr>
+          <w:p>
+            <w:pPr>
+              <w:widowControl w:val="0"/>
+              <w:autoSpaceDE w:val="0"/>
+              <w:autoSpaceDN w:val="0"/>
+              <w:adjustRightInd w:val="0"/>
+              <w:spacing w:before="0" w:line="240" w:lineRule="auto"/>
+              <w:rPr>
+                <w:rFonts w:ascii="BRH Malayalam Extra" w:hAnsi="BRH Malayalam Extra" w:cs="BRH Malayalam Extra"/>
+                <w:sz w:val="36"/>
+                <w:szCs w:val="36"/>
+              </w:rPr>
+            </w:pPr>
+            <w:r>
+              <w:rPr>
+                <w:rFonts w:ascii="BRH Malayalam Extra" w:hAnsi="BRH Malayalam Extra" w:cs="BRH Malayalam Extra"/>
+                <w:sz w:val="36"/>
+                <w:szCs w:val="36"/>
+              </w:rPr>
+              <w:t>¥</w:t>
+            </w:r>
+            <w:r>
+              <w:rPr>
+                <w:rFonts w:ascii="BRH Malayalam Extra" w:hAnsi="BRH Malayalam Extra" w:cs="BRH Malayalam Extra"/>
+                <w:sz w:val="36"/>
+                <w:szCs w:val="36"/>
+                <w:highlight w:val="yellow"/>
+              </w:rPr>
+              <w:t>i</w:t>
+            </w:r>
+            <w:r>
+              <w:rPr>
+                <w:rFonts w:ascii="BRH Malayalam Extra" w:hAnsi="BRH Malayalam Extra" w:cs="BRH Malayalam Extra"/>
+                <w:sz w:val="36"/>
+                <w:szCs w:val="36"/>
+              </w:rPr>
+              <w:t xml:space="preserve"> Z–d¢J</w:t>
+            </w:r>
+          </w:p>
+        </w:tc>
+        <w:tc>
+          <w:tcPr>
+            <w:tcW w:w="5220" w:type="dxa"/>
+            <w:tcBorders>
+              <w:top w:val="single" w:sz="4" w:space="0" w:color="000000"/>
+              <w:left w:val="single" w:sz="4" w:space="0" w:color="000000"/>
+              <w:bottom w:val="single" w:sz="4" w:space="0" w:color="000000"/>
+              <w:right w:val="single" w:sz="4" w:space="0" w:color="000000"/>
+            </w:tcBorders>
+          </w:tcPr>
+          <w:p>
+            <w:pPr>
+              <w:widowControl w:val="0"/>
+              <w:autoSpaceDE w:val="0"/>
+              <w:autoSpaceDN w:val="0"/>
+              <w:adjustRightInd w:val="0"/>
+              <w:spacing w:before="0" w:line="240" w:lineRule="auto"/>
+              <w:rPr>
+                <w:rFonts w:ascii="BRH Malayalam Extra" w:hAnsi="BRH Malayalam Extra" w:cs="BRH Malayalam Extra"/>
+                <w:sz w:val="36"/>
+                <w:szCs w:val="36"/>
+              </w:rPr>
+            </w:pPr>
+            <w:r>
+              <w:rPr>
+                <w:rFonts w:ascii="BRH Malayalam Extra" w:hAnsi="BRH Malayalam Extra" w:cs="BRH Malayalam Extra"/>
+                <w:sz w:val="36"/>
+                <w:szCs w:val="36"/>
+              </w:rPr>
+              <w:t>¥</w:t>
+            </w:r>
+            <w:r>
+              <w:rPr>
+                <w:rFonts w:ascii="BRH Malayalam Extra" w:hAnsi="BRH Malayalam Extra" w:cs="BRH Malayalam Extra"/>
+                <w:sz w:val="36"/>
+                <w:szCs w:val="36"/>
+                <w:highlight w:val="green"/>
+              </w:rPr>
+              <w:t>i</w:t>
+            </w:r>
+            <w:r>
+              <w:rPr>
+                <w:rFonts w:ascii="BRH Malayalam Extra" w:hAnsi="BRH Malayalam Extra" w:cs="BRH Malayalam Extra"/>
+                <w:sz w:val="36"/>
+                <w:szCs w:val="36"/>
+              </w:rPr>
+              <w:t>– Z–d¢J</w:t>
+            </w:r>
+          </w:p>
+        </w:tc>
+      </w:tr>
+      <w:tr>
+        <w:trPr>
+          <w:trHeight w:val="829"/>
+        </w:trPr>
+        <w:tc>
+          <w:tcPr>
+            <w:tcW w:w="3339" w:type="dxa"/>
+            <w:tcBorders>
+              <w:top w:val="single" w:sz="4" w:space="0" w:color="000000"/>
+              <w:left w:val="single" w:sz="4" w:space="0" w:color="000000"/>
+              <w:bottom w:val="single" w:sz="4" w:space="0" w:color="000000"/>
+              <w:right w:val="single" w:sz="4" w:space="0" w:color="000000"/>
+            </w:tcBorders>
+          </w:tcPr>
+          <w:p>
+            <w:pPr>
+              <w:spacing w:before="0" w:line="240" w:lineRule="auto"/>
+              <w:rPr>
+                <w:rFonts w:cs="Arial"/>
+                <w:b/>
+                <w:sz w:val="28"/>
+                <w:szCs w:val="32"/>
+                <w:lang w:bidi="ta-IN"/>
+              </w:rPr>
+            </w:pPr>
+            <w:r>
+              <w:rPr>
+                <w:rFonts w:cs="Arial"/>
+                <w:b/>
+                <w:sz w:val="28"/>
+                <w:szCs w:val="32"/>
+                <w:lang w:bidi="ta-IN"/>
+              </w:rPr>
+              <w:t xml:space="preserve">Chamaka Kramam, </w:t>
+            </w:r>
+          </w:p>
+          <w:p>
+            <w:pPr>
+              <w:spacing w:before="0" w:line="240" w:lineRule="auto"/>
+              <w:rPr>
+                <w:rFonts w:cs="Arial"/>
+                <w:b/>
+                <w:sz w:val="28"/>
+                <w:szCs w:val="32"/>
+                <w:lang w:bidi="ta-IN"/>
+              </w:rPr>
+            </w:pPr>
+            <w:r>
+              <w:rPr>
+                <w:rFonts w:cs="Arial"/>
+                <w:b/>
+                <w:sz w:val="28"/>
+                <w:szCs w:val="32"/>
+                <w:lang w:bidi="ta-IN"/>
+              </w:rPr>
+              <w:t>17.7, 7th Anuvaakam</w:t>
+            </w:r>
+          </w:p>
+          <w:p>
+            <w:pPr>
+              <w:spacing w:before="0" w:line="240" w:lineRule="auto"/>
+              <w:rPr>
+                <w:rFonts w:cs="Arial"/>
+                <w:b/>
+                <w:sz w:val="28"/>
+                <w:szCs w:val="32"/>
+                <w:lang w:bidi="ta-IN"/>
+              </w:rPr>
+            </w:pPr>
+            <w:r>
+              <w:rPr>
+                <w:rFonts w:cs="Arial"/>
+                <w:b/>
+                <w:sz w:val="28"/>
+                <w:szCs w:val="32"/>
+                <w:lang w:bidi="ta-IN"/>
+              </w:rPr>
+              <w:t>PageNo. 2</w:t>
+            </w:r>
+            <w:r>
+              <w:rPr>
+                <w:rFonts w:cs="Arial"/>
+                <w:b/>
+                <w:sz w:val="28"/>
+                <w:szCs w:val="32"/>
+                <w:lang w:bidi="ta-IN"/>
+              </w:rPr>
+              <w:t>85</w:t>
+            </w:r>
+          </w:p>
+          <w:p>
+            <w:pPr>
+              <w:spacing w:before="0" w:line="240" w:lineRule="auto"/>
+              <w:rPr>
+                <w:rFonts w:cs="Arial"/>
+                <w:b/>
+                <w:sz w:val="36"/>
+                <w:szCs w:val="36"/>
+                <w:lang w:bidi="ta-IN"/>
+              </w:rPr>
+            </w:pPr>
+            <w:r>
+              <w:rPr>
+                <w:rFonts w:cs="Arial"/>
+                <w:b/>
+                <w:sz w:val="28"/>
+                <w:szCs w:val="32"/>
+                <w:lang w:bidi="ta-IN"/>
+              </w:rPr>
+              <w:t>Middle page</w:t>
+            </w:r>
+          </w:p>
+        </w:tc>
+        <w:tc>
+          <w:tcPr>
+            <w:tcW w:w="5103" w:type="dxa"/>
+            <w:tcBorders>
+              <w:top w:val="single" w:sz="4" w:space="0" w:color="000000"/>
+              <w:left w:val="single" w:sz="4" w:space="0" w:color="000000"/>
+              <w:bottom w:val="single" w:sz="4" w:space="0" w:color="000000"/>
+              <w:right w:val="single" w:sz="4" w:space="0" w:color="000000"/>
+            </w:tcBorders>
+          </w:tcPr>
+          <w:p>
+            <w:pPr>
+              <w:widowControl w:val="0"/>
+              <w:autoSpaceDE w:val="0"/>
+              <w:autoSpaceDN w:val="0"/>
+              <w:adjustRightInd w:val="0"/>
+              <w:spacing w:before="0" w:line="240" w:lineRule="auto"/>
+              <w:rPr>
+                <w:rFonts w:ascii="BRH Malayalam Extra" w:hAnsi="BRH Malayalam Extra" w:cs="BRH Malayalam Extra"/>
+                <w:sz w:val="36"/>
+                <w:szCs w:val="36"/>
+              </w:rPr>
+            </w:pPr>
+            <w:r>
+              <w:rPr>
+                <w:rFonts w:ascii="BRH Malayalam Extra" w:hAnsi="BRH Malayalam Extra" w:cs="BRH Malayalam Extra"/>
+                <w:sz w:val="36"/>
+                <w:szCs w:val="36"/>
+              </w:rPr>
+              <w:t>¤¤i–öZx–</w:t>
+            </w:r>
+            <w:r>
+              <w:rPr>
+                <w:rFonts w:ascii="BRH Malayalam Extra" w:hAnsi="BRH Malayalam Extra" w:cs="BRH Malayalam Extra"/>
+                <w:sz w:val="36"/>
+                <w:szCs w:val="36"/>
+                <w:highlight w:val="yellow"/>
+              </w:rPr>
+              <w:t>p</w:t>
+            </w:r>
+            <w:r>
+              <w:rPr>
+                <w:rFonts w:ascii="BRH Malayalam Extra" w:hAnsi="BRH Malayalam Extra" w:cs="BRH Malayalam Extra"/>
+                <w:sz w:val="36"/>
+                <w:szCs w:val="36"/>
+              </w:rPr>
+              <w:t xml:space="preserve">k¡–Y CZy— </w:t>
+            </w:r>
+          </w:p>
+          <w:p>
+            <w:pPr>
+              <w:widowControl w:val="0"/>
+              <w:autoSpaceDE w:val="0"/>
+              <w:autoSpaceDN w:val="0"/>
+              <w:adjustRightInd w:val="0"/>
+              <w:spacing w:before="0" w:line="240" w:lineRule="auto"/>
+              <w:rPr>
+                <w:rFonts w:ascii="BRH Malayalam Extra" w:hAnsi="BRH Malayalam Extra" w:cs="BRH Malayalam Extra"/>
+                <w:sz w:val="36"/>
+                <w:szCs w:val="36"/>
+              </w:rPr>
+            </w:pPr>
+            <w:r>
+              <w:rPr>
+                <w:rFonts w:ascii="BRH Malayalam Extra" w:hAnsi="BRH Malayalam Extra" w:cs="BRH Malayalam Extra"/>
+                <w:sz w:val="36"/>
+                <w:szCs w:val="36"/>
+              </w:rPr>
+              <w:t>¤¤iöZx - p–k¡–YJ</w:t>
+            </w:r>
+          </w:p>
+        </w:tc>
+        <w:tc>
+          <w:tcPr>
+            <w:tcW w:w="5220" w:type="dxa"/>
+            <w:tcBorders>
+              <w:top w:val="single" w:sz="4" w:space="0" w:color="000000"/>
+              <w:left w:val="single" w:sz="4" w:space="0" w:color="000000"/>
+              <w:bottom w:val="single" w:sz="4" w:space="0" w:color="000000"/>
+              <w:right w:val="single" w:sz="4" w:space="0" w:color="000000"/>
+            </w:tcBorders>
+          </w:tcPr>
+          <w:p>
+            <w:pPr>
+              <w:widowControl w:val="0"/>
+              <w:autoSpaceDE w:val="0"/>
+              <w:autoSpaceDN w:val="0"/>
+              <w:adjustRightInd w:val="0"/>
+              <w:spacing w:before="0" w:line="240" w:lineRule="auto"/>
+              <w:rPr>
+                <w:rFonts w:ascii="BRH Malayalam Extra" w:hAnsi="BRH Malayalam Extra" w:cs="BRH Malayalam Extra"/>
+                <w:sz w:val="36"/>
+                <w:szCs w:val="36"/>
+              </w:rPr>
+            </w:pPr>
+            <w:r>
+              <w:rPr>
+                <w:rFonts w:ascii="BRH Malayalam Extra" w:hAnsi="BRH Malayalam Extra" w:cs="BRH Malayalam Extra"/>
+                <w:sz w:val="36"/>
+                <w:szCs w:val="36"/>
+              </w:rPr>
+              <w:t>¤¤i–öZx–</w:t>
+            </w:r>
+            <w:r>
+              <w:rPr>
+                <w:rFonts w:ascii="BRH Malayalam Extra" w:hAnsi="BRH Malayalam Extra" w:cs="BRH Malayalam Extra"/>
+                <w:sz w:val="36"/>
+                <w:szCs w:val="36"/>
+                <w:highlight w:val="green"/>
+              </w:rPr>
+              <w:t>p</w:t>
+            </w:r>
+            <w:r>
+              <w:rPr>
+                <w:rFonts w:ascii="BRH Malayalam Extra" w:hAnsi="BRH Malayalam Extra" w:cs="BRH Malayalam Extra"/>
+                <w:sz w:val="36"/>
+                <w:szCs w:val="36"/>
+              </w:rPr>
+              <w:t>–k¡–Y CZy—</w:t>
+            </w:r>
+          </w:p>
+          <w:p>
+            <w:pPr>
+              <w:widowControl w:val="0"/>
+              <w:autoSpaceDE w:val="0"/>
+              <w:autoSpaceDN w:val="0"/>
+              <w:adjustRightInd w:val="0"/>
+              <w:spacing w:before="0" w:line="240" w:lineRule="auto"/>
+              <w:rPr>
+                <w:rFonts w:ascii="BRH Malayalam Extra" w:hAnsi="BRH Malayalam Extra" w:cs="BRH Malayalam Extra"/>
+                <w:sz w:val="36"/>
+                <w:szCs w:val="36"/>
+              </w:rPr>
+            </w:pPr>
+            <w:r>
+              <w:rPr>
+                <w:rFonts w:ascii="BRH Malayalam Extra" w:hAnsi="BRH Malayalam Extra" w:cs="BRH Malayalam Extra"/>
+                <w:sz w:val="36"/>
+                <w:szCs w:val="36"/>
+              </w:rPr>
+              <w:t xml:space="preserve"> ¤¤iöZx - p–k¡–YJ</w:t>
+            </w:r>
+          </w:p>
+        </w:tc>
+      </w:tr>
+      <w:tr>
+        <w:trPr>
+          <w:trHeight w:val="829"/>
+        </w:trPr>
+        <w:tc>
+          <w:tcPr>
+            <w:tcW w:w="3339" w:type="dxa"/>
+            <w:tcBorders>
+              <w:top w:val="single" w:sz="4" w:space="0" w:color="000000"/>
+              <w:left w:val="single" w:sz="4" w:space="0" w:color="000000"/>
+              <w:bottom w:val="single" w:sz="4" w:space="0" w:color="000000"/>
+              <w:right w:val="single" w:sz="4" w:space="0" w:color="000000"/>
+            </w:tcBorders>
+          </w:tcPr>
+          <w:p>
+            <w:pPr>
+              <w:spacing w:before="0" w:line="240" w:lineRule="auto"/>
+              <w:rPr>
+                <w:rFonts w:cs="Arial"/>
+                <w:b/>
+                <w:sz w:val="28"/>
+                <w:szCs w:val="32"/>
+                <w:lang w:bidi="ta-IN"/>
+              </w:rPr>
+            </w:pPr>
+            <w:r>
+              <w:rPr>
+                <w:rFonts w:cs="Arial"/>
+                <w:b/>
+                <w:sz w:val="28"/>
+                <w:szCs w:val="32"/>
+                <w:lang w:bidi="ta-IN"/>
+              </w:rPr>
+              <w:t xml:space="preserve">Chamaka Kramam, </w:t>
+            </w:r>
+          </w:p>
+          <w:p>
+            <w:pPr>
+              <w:spacing w:before="0" w:line="240" w:lineRule="auto"/>
+              <w:rPr>
+                <w:rFonts w:cs="Arial"/>
+                <w:b/>
+                <w:sz w:val="28"/>
+                <w:szCs w:val="32"/>
+                <w:lang w:bidi="ta-IN"/>
+              </w:rPr>
+            </w:pPr>
+            <w:r>
+              <w:rPr>
+                <w:rFonts w:cs="Arial"/>
+                <w:b/>
+                <w:sz w:val="28"/>
+                <w:szCs w:val="32"/>
+                <w:lang w:bidi="ta-IN"/>
+              </w:rPr>
+              <w:t>17.10, 10th Anuvaakam</w:t>
+            </w:r>
+          </w:p>
+          <w:p>
+            <w:pPr>
+              <w:spacing w:before="0" w:line="240" w:lineRule="auto"/>
+              <w:rPr>
+                <w:rFonts w:cs="Arial"/>
+                <w:b/>
+                <w:sz w:val="28"/>
+                <w:szCs w:val="32"/>
+                <w:lang w:bidi="ta-IN"/>
+              </w:rPr>
+            </w:pPr>
+            <w:r>
+              <w:rPr>
+                <w:rFonts w:cs="Arial"/>
+                <w:b/>
+                <w:sz w:val="28"/>
+                <w:szCs w:val="32"/>
+                <w:lang w:bidi="ta-IN"/>
+              </w:rPr>
+              <w:t>PageNo. 2</w:t>
+            </w:r>
+            <w:r>
+              <w:rPr>
+                <w:rFonts w:cs="Arial"/>
+                <w:b/>
+                <w:sz w:val="28"/>
+                <w:szCs w:val="32"/>
+                <w:lang w:bidi="ta-IN"/>
+              </w:rPr>
+              <w:t>91</w:t>
+            </w:r>
+          </w:p>
+          <w:p>
+            <w:pPr>
+              <w:spacing w:before="0" w:line="240" w:lineRule="auto"/>
+              <w:rPr>
+                <w:rFonts w:cs="Arial"/>
+                <w:b/>
+                <w:sz w:val="36"/>
+                <w:szCs w:val="36"/>
+                <w:lang w:bidi="ta-IN"/>
+              </w:rPr>
+            </w:pPr>
+            <w:r>
+              <w:rPr>
+                <w:rFonts w:cs="Arial"/>
+                <w:b/>
+                <w:sz w:val="28"/>
+                <w:szCs w:val="32"/>
+                <w:lang w:bidi="ta-IN"/>
+              </w:rPr>
+              <w:t>end</w:t>
+            </w:r>
+            <w:r>
+              <w:rPr>
+                <w:rFonts w:cs="Arial"/>
+                <w:b/>
+                <w:sz w:val="28"/>
+                <w:szCs w:val="32"/>
+                <w:lang w:bidi="ta-IN"/>
+              </w:rPr>
+              <w:t xml:space="preserve"> page</w:t>
+            </w:r>
+          </w:p>
+        </w:tc>
+        <w:tc>
+          <w:tcPr>
+            <w:tcW w:w="5103" w:type="dxa"/>
+            <w:tcBorders>
+              <w:top w:val="single" w:sz="4" w:space="0" w:color="000000"/>
+              <w:left w:val="single" w:sz="4" w:space="0" w:color="000000"/>
+              <w:bottom w:val="single" w:sz="4" w:space="0" w:color="000000"/>
+              <w:right w:val="single" w:sz="4" w:space="0" w:color="000000"/>
+            </w:tcBorders>
+          </w:tcPr>
+          <w:p>
+            <w:pPr>
+              <w:widowControl w:val="0"/>
+              <w:autoSpaceDE w:val="0"/>
+              <w:autoSpaceDN w:val="0"/>
+              <w:adjustRightInd w:val="0"/>
+              <w:spacing w:before="0" w:line="240" w:lineRule="auto"/>
+              <w:rPr>
+                <w:rFonts w:ascii="BRH Malayalam Extra" w:hAnsi="BRH Malayalam Extra" w:cs="BRH Malayalam Extra"/>
+                <w:sz w:val="36"/>
+                <w:szCs w:val="36"/>
+              </w:rPr>
+            </w:pPr>
+            <w:r>
+              <w:rPr>
+                <w:rFonts w:ascii="BRH Malayalam Extra" w:hAnsi="BRH Malayalam Extra" w:cs="BRH Malayalam Extra"/>
+                <w:sz w:val="36"/>
+                <w:szCs w:val="36"/>
+                <w:highlight w:val="yellow"/>
+              </w:rPr>
+              <w:t>¥i</w:t>
+            </w:r>
+            <w:r>
+              <w:rPr>
+                <w:rFonts w:ascii="BRH Malayalam Extra" w:hAnsi="BRH Malayalam Extra" w:cs="BRH Malayalam Extra"/>
+                <w:sz w:val="36"/>
+                <w:szCs w:val="36"/>
+              </w:rPr>
+              <w:t xml:space="preserve"> by–Zõ¦–tz</w:t>
+            </w:r>
+          </w:p>
+        </w:tc>
+        <w:tc>
+          <w:tcPr>
+            <w:tcW w:w="5220" w:type="dxa"/>
+            <w:tcBorders>
+              <w:top w:val="single" w:sz="4" w:space="0" w:color="000000"/>
+              <w:left w:val="single" w:sz="4" w:space="0" w:color="000000"/>
+              <w:bottom w:val="single" w:sz="4" w:space="0" w:color="000000"/>
+              <w:right w:val="single" w:sz="4" w:space="0" w:color="000000"/>
+            </w:tcBorders>
+          </w:tcPr>
+          <w:p>
+            <w:pPr>
+              <w:widowControl w:val="0"/>
+              <w:autoSpaceDE w:val="0"/>
+              <w:autoSpaceDN w:val="0"/>
+              <w:adjustRightInd w:val="0"/>
+              <w:spacing w:before="0" w:line="240" w:lineRule="auto"/>
+              <w:rPr>
+                <w:rFonts w:ascii="BRH Malayalam Extra" w:hAnsi="BRH Malayalam Extra" w:cs="BRH Malayalam Extra"/>
+                <w:sz w:val="36"/>
+                <w:szCs w:val="36"/>
+              </w:rPr>
+            </w:pPr>
+            <w:r>
+              <w:rPr>
+                <w:rFonts w:ascii="BRH Malayalam Extra" w:hAnsi="BRH Malayalam Extra" w:cs="BRH Malayalam Extra"/>
+                <w:sz w:val="36"/>
+                <w:szCs w:val="36"/>
+              </w:rPr>
+              <w:t>¥</w:t>
+            </w:r>
+            <w:r>
+              <w:rPr>
+                <w:rFonts w:ascii="BRH Malayalam Extra" w:hAnsi="BRH Malayalam Extra" w:cs="BRH Malayalam Extra"/>
+                <w:sz w:val="36"/>
+                <w:szCs w:val="36"/>
+                <w:highlight w:val="green"/>
+              </w:rPr>
+              <w:t>i</w:t>
+            </w:r>
+            <w:r>
+              <w:rPr>
+                <w:rFonts w:ascii="BRH Malayalam Extra" w:hAnsi="BRH Malayalam Extra" w:cs="BRH Malayalam Extra"/>
+                <w:sz w:val="36"/>
+                <w:szCs w:val="36"/>
+              </w:rPr>
+              <w:t>– by–Zõ¦–tz</w:t>
+            </w:r>
+          </w:p>
+        </w:tc>
+      </w:tr>
+      <w:tr>
+        <w:trPr>
+          <w:trHeight w:val="829"/>
+        </w:trPr>
+        <w:tc>
+          <w:tcPr>
+            <w:tcW w:w="3339" w:type="dxa"/>
+            <w:tcBorders>
+              <w:top w:val="single" w:sz="4" w:space="0" w:color="000000"/>
+              <w:left w:val="single" w:sz="4" w:space="0" w:color="000000"/>
+              <w:bottom w:val="single" w:sz="4" w:space="0" w:color="000000"/>
+              <w:right w:val="single" w:sz="4" w:space="0" w:color="000000"/>
+            </w:tcBorders>
+          </w:tcPr>
+          <w:p>
+            <w:pPr>
+              <w:spacing w:before="0" w:line="240" w:lineRule="auto"/>
+              <w:rPr>
+                <w:rFonts w:cs="Arial"/>
+                <w:b/>
+                <w:sz w:val="28"/>
+                <w:szCs w:val="32"/>
+                <w:lang w:bidi="ta-IN"/>
+              </w:rPr>
+            </w:pPr>
+            <w:r>
+              <w:rPr>
+                <w:rFonts w:cs="Arial"/>
+                <w:b/>
+                <w:sz w:val="28"/>
+                <w:szCs w:val="32"/>
+                <w:lang w:bidi="ta-IN"/>
+              </w:rPr>
+              <w:t xml:space="preserve">Chamaka Kramam, </w:t>
+            </w:r>
+          </w:p>
+          <w:p>
+            <w:pPr>
+              <w:spacing w:before="0" w:line="240" w:lineRule="auto"/>
+              <w:rPr>
+                <w:rFonts w:cs="Arial"/>
+                <w:b/>
+                <w:sz w:val="28"/>
+                <w:szCs w:val="32"/>
+                <w:lang w:bidi="ta-IN"/>
+              </w:rPr>
+            </w:pPr>
+            <w:r>
+              <w:rPr>
+                <w:rFonts w:cs="Arial"/>
+                <w:b/>
+                <w:sz w:val="28"/>
+                <w:szCs w:val="32"/>
+                <w:lang w:bidi="ta-IN"/>
+              </w:rPr>
+              <w:t>17.1</w:t>
+            </w:r>
+            <w:r>
+              <w:rPr>
+                <w:rFonts w:cs="Arial"/>
+                <w:b/>
+                <w:sz w:val="28"/>
+                <w:szCs w:val="32"/>
+                <w:lang w:bidi="ta-IN"/>
+              </w:rPr>
+              <w:t>1</w:t>
+            </w:r>
+            <w:r>
+              <w:rPr>
+                <w:rFonts w:cs="Arial"/>
+                <w:b/>
+                <w:sz w:val="28"/>
+                <w:szCs w:val="32"/>
+                <w:lang w:bidi="ta-IN"/>
+              </w:rPr>
+              <w:t>, 1</w:t>
+            </w:r>
+            <w:r>
+              <w:rPr>
+                <w:rFonts w:cs="Arial"/>
+                <w:b/>
+                <w:sz w:val="28"/>
+                <w:szCs w:val="32"/>
+                <w:lang w:bidi="ta-IN"/>
+              </w:rPr>
+              <w:t>1</w:t>
+            </w:r>
+            <w:r>
+              <w:rPr>
+                <w:rFonts w:cs="Arial"/>
+                <w:b/>
+                <w:sz w:val="28"/>
+                <w:szCs w:val="32"/>
+                <w:lang w:bidi="ta-IN"/>
+              </w:rPr>
+              <w:t>th Anuvaakam</w:t>
+            </w:r>
+          </w:p>
+          <w:p>
+            <w:pPr>
+              <w:spacing w:before="0" w:line="240" w:lineRule="auto"/>
+              <w:rPr>
+                <w:rFonts w:cs="Arial"/>
+                <w:b/>
+                <w:sz w:val="28"/>
+                <w:szCs w:val="32"/>
+                <w:lang w:bidi="ta-IN"/>
+              </w:rPr>
+            </w:pPr>
+            <w:r>
+              <w:rPr>
+                <w:rFonts w:cs="Arial"/>
+                <w:b/>
+                <w:sz w:val="28"/>
+                <w:szCs w:val="32"/>
+                <w:lang w:bidi="ta-IN"/>
+              </w:rPr>
+              <w:t>PageNo. 297</w:t>
+            </w:r>
+          </w:p>
+          <w:p>
+            <w:pPr>
+              <w:spacing w:before="0" w:line="240" w:lineRule="auto"/>
+              <w:rPr>
+                <w:rFonts w:cs="Arial"/>
+                <w:b/>
+                <w:sz w:val="28"/>
+                <w:szCs w:val="32"/>
+                <w:lang w:bidi="ta-IN"/>
+              </w:rPr>
+            </w:pPr>
+            <w:r>
+              <w:rPr>
+                <w:rFonts w:cs="Arial"/>
+                <w:b/>
+                <w:sz w:val="28"/>
+                <w:szCs w:val="32"/>
+                <w:lang w:bidi="ta-IN"/>
+              </w:rPr>
+              <w:t>middle</w:t>
+            </w:r>
+            <w:r>
+              <w:rPr>
+                <w:rFonts w:cs="Arial"/>
+                <w:b/>
+                <w:sz w:val="28"/>
+                <w:szCs w:val="32"/>
+                <w:lang w:bidi="ta-IN"/>
+              </w:rPr>
+              <w:t xml:space="preserve"> page</w:t>
+            </w:r>
+          </w:p>
+        </w:tc>
+        <w:tc>
+          <w:tcPr>
+            <w:tcW w:w="5103" w:type="dxa"/>
+            <w:tcBorders>
+              <w:top w:val="single" w:sz="4" w:space="0" w:color="000000"/>
+              <w:left w:val="single" w:sz="4" w:space="0" w:color="000000"/>
+              <w:bottom w:val="single" w:sz="4" w:space="0" w:color="000000"/>
+              <w:right w:val="single" w:sz="4" w:space="0" w:color="000000"/>
+            </w:tcBorders>
+          </w:tcPr>
+          <w:p>
+            <w:pPr>
+              <w:widowControl w:val="0"/>
+              <w:autoSpaceDE w:val="0"/>
+              <w:autoSpaceDN w:val="0"/>
+              <w:adjustRightInd w:val="0"/>
+              <w:spacing w:before="0" w:line="240" w:lineRule="auto"/>
+              <w:rPr>
+                <w:rFonts w:ascii="BRH Malayalam Extra" w:hAnsi="BRH Malayalam Extra" w:cs="BRH Malayalam Extra"/>
+                <w:sz w:val="36"/>
+                <w:szCs w:val="36"/>
+                <w:highlight w:val="yellow"/>
+              </w:rPr>
+            </w:pPr>
+            <w:r>
+              <w:rPr>
+                <w:rFonts w:ascii="BRH Malayalam Extra" w:hAnsi="BRH Malayalam Extra" w:cs="BRH Malayalam Extra"/>
+                <w:sz w:val="36"/>
+                <w:szCs w:val="36"/>
+              </w:rPr>
+              <w:t xml:space="preserve">P– </w:t>
+            </w:r>
+            <w:r>
+              <w:rPr>
+                <w:rFonts w:ascii="BRH Malayalam Extra" w:hAnsi="BRH Malayalam Extra" w:cs="BRH Malayalam Extra"/>
+                <w:sz w:val="36"/>
+                <w:szCs w:val="36"/>
+                <w:highlight w:val="yellow"/>
+              </w:rPr>
+              <w:t>¥i</w:t>
+            </w:r>
+            <w:r>
+              <w:rPr>
+                <w:rFonts w:ascii="BRH Malayalam Extra" w:hAnsi="BRH Malayalam Extra" w:cs="BRH Malayalam Extra"/>
+                <w:sz w:val="36"/>
+                <w:szCs w:val="36"/>
+              </w:rPr>
+              <w:t xml:space="preserve"> | ¥</w:t>
+            </w:r>
+            <w:r>
+              <w:rPr>
+                <w:rFonts w:ascii="BRH Malayalam Extra" w:hAnsi="BRH Malayalam Extra" w:cs="BRH Malayalam Extra"/>
+                <w:sz w:val="36"/>
+                <w:szCs w:val="36"/>
+              </w:rPr>
+              <w:t>i–„ræxP—Zûxky</w:t>
+            </w:r>
+            <w:r>
+              <w:rPr>
+                <w:rFonts w:ascii="BRH Devanagari Extra" w:hAnsi="BRH Devanagari Extra" w:cs="BRH Malayalam Extra"/>
+                <w:sz w:val="36"/>
+                <w:szCs w:val="36"/>
+              </w:rPr>
+              <w:t>óè</w:t>
+            </w:r>
+            <w:r>
+              <w:rPr>
+                <w:rFonts w:ascii="BRH Malayalam Extra" w:hAnsi="BRH Malayalam Extra" w:cs="BRH Malayalam Extra"/>
+                <w:sz w:val="36"/>
+                <w:szCs w:val="36"/>
+              </w:rPr>
+              <w:t>qZ§</w:t>
+            </w:r>
+            <w:r>
+              <w:rPr>
+                <w:rFonts w:ascii="BRH Malayalam Extra" w:hAnsi="BRH Malayalam Extra" w:cs="BRH Malayalam Extra"/>
+                <w:sz w:val="36"/>
+                <w:szCs w:val="36"/>
+              </w:rPr>
+              <w:t xml:space="preserve"> |</w:t>
+            </w:r>
+          </w:p>
+        </w:tc>
+        <w:tc>
+          <w:tcPr>
+            <w:tcW w:w="5220" w:type="dxa"/>
+            <w:tcBorders>
+              <w:top w:val="single" w:sz="4" w:space="0" w:color="000000"/>
+              <w:left w:val="single" w:sz="4" w:space="0" w:color="000000"/>
+              <w:bottom w:val="single" w:sz="4" w:space="0" w:color="000000"/>
+              <w:right w:val="single" w:sz="4" w:space="0" w:color="000000"/>
+            </w:tcBorders>
+          </w:tcPr>
+          <w:p>
+            <w:pPr>
+              <w:widowControl w:val="0"/>
+              <w:autoSpaceDE w:val="0"/>
+              <w:autoSpaceDN w:val="0"/>
+              <w:adjustRightInd w:val="0"/>
+              <w:spacing w:before="0" w:line="240" w:lineRule="auto"/>
+              <w:rPr>
+                <w:rFonts w:ascii="BRH Malayalam Extra" w:hAnsi="BRH Malayalam Extra" w:cs="BRH Malayalam Extra"/>
+                <w:sz w:val="36"/>
+                <w:szCs w:val="36"/>
+              </w:rPr>
+            </w:pPr>
+            <w:r>
+              <w:rPr>
+                <w:rFonts w:ascii="BRH Malayalam Extra" w:hAnsi="BRH Malayalam Extra" w:cs="BRH Malayalam Extra"/>
+                <w:sz w:val="36"/>
+                <w:szCs w:val="36"/>
+              </w:rPr>
+              <w:t xml:space="preserve">P– </w:t>
+            </w:r>
+            <w:r>
+              <w:rPr>
+                <w:rFonts w:ascii="BRH Malayalam Extra" w:hAnsi="BRH Malayalam Extra" w:cs="BRH Malayalam Extra"/>
+                <w:sz w:val="36"/>
+                <w:szCs w:val="36"/>
+                <w:highlight w:val="green"/>
+              </w:rPr>
+              <w:t xml:space="preserve">¥i– | </w:t>
+            </w:r>
+            <w:r>
+              <w:rPr>
+                <w:rFonts w:ascii="BRH Malayalam Extra" w:hAnsi="BRH Malayalam Extra" w:cs="BRH Malayalam Extra"/>
+                <w:sz w:val="36"/>
+                <w:szCs w:val="36"/>
+              </w:rPr>
+              <w:t>¥i–„ræxP—Zûxky</w:t>
+            </w:r>
+            <w:r>
+              <w:rPr>
+                <w:rFonts w:ascii="BRH Devanagari Extra" w:hAnsi="BRH Devanagari Extra" w:cs="BRH Malayalam Extra"/>
+                <w:sz w:val="36"/>
+                <w:szCs w:val="36"/>
+              </w:rPr>
+              <w:t>óè</w:t>
+            </w:r>
+            <w:r>
+              <w:rPr>
+                <w:rFonts w:ascii="BRH Malayalam Extra" w:hAnsi="BRH Malayalam Extra" w:cs="BRH Malayalam Extra"/>
+                <w:sz w:val="36"/>
+                <w:szCs w:val="36"/>
+              </w:rPr>
+              <w:t>qZ§</w:t>
             </w:r>
             <w:r>
               <w:rPr>
@@ -3431,6 +5959,7 @@
                 <w:sz w:val="28"/>
                 <w:szCs w:val="28"/>
               </w:rPr>
+              <w:lastRenderedPageBreak/>
               <w:t>Page No. 91</w:t>
             </w:r>
           </w:p>
@@ -3460,6 +5989,7 @@
                 <w:sz w:val="36"/>
                 <w:szCs w:val="36"/>
               </w:rPr>
+              <w:lastRenderedPageBreak/>
               <w:t>¥ddz–j¥Z— „hz–</w:t>
             </w:r>
             <w:r>
@@ -5057,6 +7587,7 @@
                 <w:sz w:val="28"/>
                 <w:szCs w:val="28"/>
               </w:rPr>
+              <w:lastRenderedPageBreak/>
               <w:t xml:space="preserve">Statement </w:t>
             </w:r>
             <w:r>
@@ -5125,6 +7656,7 @@
                 <w:sz w:val="36"/>
                 <w:szCs w:val="36"/>
               </w:rPr>
+              <w:lastRenderedPageBreak/>
               <w:t>i£–</w:t>
             </w:r>
             <w:r>
@@ -5442,25 +7974,14 @@
                 <w:szCs w:val="28"/>
               </w:rPr>
             </w:pPr>
-            <w:proofErr w:type="gramStart"/>
-            <w:r>
-              <w:rPr>
-                <w:rFonts w:cs="Arial"/>
-                <w:b/>
-                <w:sz w:val="28"/>
-                <w:szCs w:val="28"/>
-              </w:rPr>
-              <w:t>12.5  rudra</w:t>
-            </w:r>
-            <w:proofErr w:type="gramEnd"/>
-            <w:r>
-              <w:rPr>
-                <w:rFonts w:cs="Arial"/>
-                <w:b/>
-                <w:sz w:val="28"/>
-                <w:szCs w:val="28"/>
-              </w:rPr>
-              <w:t xml:space="preserve"> trishati</w:t>
+            <w:r>
+              <w:rPr>
+                <w:rFonts w:cs="Arial"/>
+                <w:b/>
+                <w:sz w:val="28"/>
+                <w:szCs w:val="28"/>
+              </w:rPr>
+              <w:t>12.5  rudra trishati</w:t>
             </w:r>
           </w:p>
           <w:p>
@@ -5772,7 +8293,6 @@
                 <w:szCs w:val="28"/>
               </w:rPr>
             </w:pPr>
-            <w:proofErr w:type="gramStart"/>
             <w:r>
               <w:rPr>
                 <w:rFonts w:cs="Arial"/>
@@ -5782,7 +8302,6 @@
               </w:rPr>
               <w:t>12.7  Namakaaram</w:t>
             </w:r>
-            <w:proofErr w:type="gramEnd"/>
           </w:p>
           <w:p>
             <w:pPr>
@@ -6011,7 +8530,6 @@
                 <w:szCs w:val="28"/>
               </w:rPr>
             </w:pPr>
-            <w:proofErr w:type="gramStart"/>
             <w:r>
               <w:rPr>
                 <w:rFonts w:cs="Arial"/>
@@ -6021,7 +8539,6 @@
               </w:rPr>
               <w:t>12.14  rudram</w:t>
             </w:r>
-            <w:proofErr w:type="gramEnd"/>
           </w:p>
           <w:p>
             <w:pPr>
@@ -6250,25 +8767,14 @@
                 <w:szCs w:val="28"/>
               </w:rPr>
             </w:pPr>
-            <w:proofErr w:type="gramStart"/>
-            <w:r>
-              <w:rPr>
-                <w:rFonts w:cs="Arial"/>
-                <w:b/>
-                <w:sz w:val="28"/>
-                <w:szCs w:val="28"/>
-              </w:rPr>
-              <w:t>16.1  rudra</w:t>
-            </w:r>
-            <w:proofErr w:type="gramEnd"/>
-            <w:r>
-              <w:rPr>
-                <w:rFonts w:cs="Arial"/>
-                <w:b/>
-                <w:sz w:val="28"/>
-                <w:szCs w:val="28"/>
-              </w:rPr>
-              <w:t xml:space="preserve"> Kramam</w:t>
+            <w:r>
+              <w:rPr>
+                <w:rFonts w:cs="Arial"/>
+                <w:b/>
+                <w:sz w:val="28"/>
+                <w:szCs w:val="28"/>
+              </w:rPr>
+              <w:t>16.1  rudra Kramam</w:t>
             </w:r>
           </w:p>
           <w:p>
@@ -6464,25 +8970,14 @@
                 <w:szCs w:val="28"/>
               </w:rPr>
             </w:pPr>
-            <w:proofErr w:type="gramStart"/>
-            <w:r>
-              <w:rPr>
-                <w:rFonts w:cs="Arial"/>
-                <w:b/>
-                <w:sz w:val="28"/>
-                <w:szCs w:val="28"/>
-              </w:rPr>
-              <w:t>16.4  rudra</w:t>
-            </w:r>
-            <w:proofErr w:type="gramEnd"/>
-            <w:r>
-              <w:rPr>
-                <w:rFonts w:cs="Arial"/>
-                <w:b/>
-                <w:sz w:val="28"/>
-                <w:szCs w:val="28"/>
-              </w:rPr>
-              <w:t xml:space="preserve"> Kramam</w:t>
+            <w:r>
+              <w:rPr>
+                <w:rFonts w:cs="Arial"/>
+                <w:b/>
+                <w:sz w:val="28"/>
+                <w:szCs w:val="28"/>
+              </w:rPr>
+              <w:t>16.4  rudra Kramam</w:t>
             </w:r>
           </w:p>
           <w:p>
@@ -6737,25 +9232,15 @@
                 <w:szCs w:val="28"/>
               </w:rPr>
             </w:pPr>
-            <w:proofErr w:type="gramStart"/>
-            <w:r>
-              <w:rPr>
-                <w:rFonts w:cs="Arial"/>
-                <w:b/>
-                <w:sz w:val="28"/>
-                <w:szCs w:val="28"/>
-              </w:rPr>
-              <w:t>16.6  rudra</w:t>
-            </w:r>
-            <w:proofErr w:type="gramEnd"/>
-            <w:r>
-              <w:rPr>
-                <w:rFonts w:cs="Arial"/>
-                <w:b/>
-                <w:sz w:val="28"/>
-                <w:szCs w:val="28"/>
-              </w:rPr>
-              <w:t xml:space="preserve"> Kramam</w:t>
+            <w:r>
+              <w:rPr>
+                <w:rFonts w:cs="Arial"/>
+                <w:b/>
+                <w:sz w:val="28"/>
+                <w:szCs w:val="28"/>
+              </w:rPr>
+              <w:lastRenderedPageBreak/>
+              <w:t>16.6  rudra Kramam</w:t>
             </w:r>
           </w:p>
           <w:p>
@@ -6967,25 +9452,14 @@
                 <w:szCs w:val="28"/>
               </w:rPr>
             </w:pPr>
-            <w:proofErr w:type="gramStart"/>
-            <w:r>
-              <w:rPr>
-                <w:rFonts w:cs="Arial"/>
-                <w:b/>
-                <w:sz w:val="28"/>
-                <w:szCs w:val="28"/>
-              </w:rPr>
-              <w:t>16.4  rudra</w:t>
-            </w:r>
-            <w:proofErr w:type="gramEnd"/>
-            <w:r>
-              <w:rPr>
-                <w:rFonts w:cs="Arial"/>
-                <w:b/>
-                <w:sz w:val="28"/>
-                <w:szCs w:val="28"/>
-              </w:rPr>
-              <w:t xml:space="preserve"> Kramam</w:t>
+            <w:r>
+              <w:rPr>
+                <w:rFonts w:cs="Arial"/>
+                <w:b/>
+                <w:sz w:val="28"/>
+                <w:szCs w:val="28"/>
+              </w:rPr>
+              <w:t>16.4  rudra Kramam</w:t>
             </w:r>
           </w:p>
           <w:p>
@@ -7181,25 +9655,14 @@
                 <w:szCs w:val="28"/>
               </w:rPr>
             </w:pPr>
-            <w:proofErr w:type="gramStart"/>
-            <w:r>
-              <w:rPr>
-                <w:rFonts w:cs="Arial"/>
-                <w:b/>
-                <w:sz w:val="28"/>
-                <w:szCs w:val="28"/>
-              </w:rPr>
-              <w:t>17.2  chamaka</w:t>
-            </w:r>
-            <w:proofErr w:type="gramEnd"/>
-            <w:r>
-              <w:rPr>
-                <w:rFonts w:cs="Arial"/>
-                <w:b/>
-                <w:sz w:val="28"/>
-                <w:szCs w:val="28"/>
-              </w:rPr>
-              <w:t xml:space="preserve"> Kramam</w:t>
+            <w:r>
+              <w:rPr>
+                <w:rFonts w:cs="Arial"/>
+                <w:b/>
+                <w:sz w:val="28"/>
+                <w:szCs w:val="28"/>
+              </w:rPr>
+              <w:t>17.2  chamaka Kramam</w:t>
             </w:r>
           </w:p>
           <w:p>
@@ -8009,6 +10472,7 @@
                 <w:sz w:val="28"/>
                 <w:szCs w:val="28"/>
               </w:rPr>
+              <w:lastRenderedPageBreak/>
               <w:t>9.</w:t>
             </w:r>
             <w:r>
@@ -9840,6 +12304,7 @@
                 <w:sz w:val="28"/>
                 <w:szCs w:val="28"/>
               </w:rPr>
+              <w:lastRenderedPageBreak/>
               <w:t>Item No - 14.</w:t>
             </w:r>
             <w:r>
@@ -11806,6 +14271,7 @@
                 <w:sz w:val="28"/>
                 <w:szCs w:val="28"/>
               </w:rPr>
+              <w:lastRenderedPageBreak/>
               <w:t>Rudra Kramam</w:t>
             </w:r>
           </w:p>
@@ -13072,6 +15538,7 @@
                 <w:sz w:val="36"/>
                 <w:szCs w:val="36"/>
               </w:rPr>
+              <w:lastRenderedPageBreak/>
               <w:t xml:space="preserve">3.1.4 </w:t>
             </w:r>
           </w:p>
@@ -14477,6 +16944,7 @@
                 <w:sz w:val="28"/>
                 <w:szCs w:val="28"/>
               </w:rPr>
+              <w:lastRenderedPageBreak/>
               <w:t xml:space="preserve">9.1 </w:t>
             </w:r>
           </w:p>
@@ -14879,23 +17347,13 @@
                 <w:szCs w:val="28"/>
               </w:rPr>
             </w:pPr>
-            <w:proofErr w:type="gramStart"/>
-            <w:r>
-              <w:rPr>
-                <w:rFonts w:cs="Arial"/>
-                <w:sz w:val="28"/>
-                <w:szCs w:val="28"/>
-              </w:rPr>
-              <w:t>9.6 ,</w:t>
-            </w:r>
-            <w:proofErr w:type="gramEnd"/>
-            <w:r>
-              <w:rPr>
-                <w:rFonts w:cs="Arial"/>
-                <w:sz w:val="28"/>
-                <w:szCs w:val="28"/>
-              </w:rPr>
-              <w:t xml:space="preserve"> </w:t>
+            <w:r>
+              <w:rPr>
+                <w:rFonts w:cs="Arial"/>
+                <w:sz w:val="28"/>
+                <w:szCs w:val="28"/>
+              </w:rPr>
+              <w:t xml:space="preserve">9.6 , </w:t>
             </w:r>
           </w:p>
           <w:p>
@@ -16276,6 +18734,7 @@
                 <w:sz w:val="28"/>
                 <w:szCs w:val="28"/>
               </w:rPr>
+              <w:lastRenderedPageBreak/>
               <w:t>19.4.1</w:t>
             </w:r>
           </w:p>
@@ -17653,6 +20112,7 @@
                 <w:sz w:val="40"/>
                 <w:szCs w:val="40"/>
               </w:rPr>
+              <w:lastRenderedPageBreak/>
               <w:t>“</w:t>
             </w:r>
             <w:r>
@@ -19292,6 +21752,7 @@
                 <w:sz w:val="28"/>
                 <w:szCs w:val="28"/>
               </w:rPr>
+              <w:lastRenderedPageBreak/>
               <w:t>16.</w:t>
             </w:r>
             <w:r>
@@ -20840,6 +23301,7 @@
                 <w:sz w:val="28"/>
                 <w:szCs w:val="28"/>
               </w:rPr>
+              <w:lastRenderedPageBreak/>
               <w:t xml:space="preserve">17.11 Chamaka Krama padaH, </w:t>
             </w:r>
           </w:p>
@@ -22304,7 +24766,18 @@
                 <w:szCs w:val="36"/>
                 <w:lang w:val="en-IN" w:eastAsia="en-IN" w:bidi="ml-IN"/>
               </w:rPr>
-              <w:t xml:space="preserve"> ktsy</w:t>
+              <w:t xml:space="preserve"> </w:t>
+            </w:r>
+            <w:r>
+              <w:rPr>
+                <w:rFonts w:ascii="BRH Malayalam Extra" w:eastAsia="Times New Roman" w:hAnsi="BRH Malayalam Extra" w:cs="BRH Malayalam Extra"/>
+                <w:color w:val="000000"/>
+                <w:sz w:val="36"/>
+                <w:szCs w:val="36"/>
+                <w:lang w:val="en-IN" w:eastAsia="en-IN" w:bidi="ml-IN"/>
+              </w:rPr>
+              <w:lastRenderedPageBreak/>
+              <w:t>ktsy</w:t>
             </w:r>
           </w:p>
         </w:tc>
@@ -22334,6 +24807,7 @@
                 <w:szCs w:val="36"/>
                 <w:lang w:val="en-IN" w:eastAsia="en-IN" w:bidi="ml-IN"/>
               </w:rPr>
+              <w:lastRenderedPageBreak/>
               <w:t>¹xdZJ A¹xd</w:t>
             </w:r>
             <w:r>
@@ -22355,7 +24829,18 @@
                 <w:szCs w:val="36"/>
                 <w:lang w:val="en-IN" w:eastAsia="en-IN" w:bidi="ml-IN"/>
               </w:rPr>
-              <w:t xml:space="preserve"> ktsy</w:t>
+              <w:t xml:space="preserve"> </w:t>
+            </w:r>
+            <w:r>
+              <w:rPr>
+                <w:rFonts w:ascii="BRH Malayalam Extra" w:eastAsia="Times New Roman" w:hAnsi="BRH Malayalam Extra" w:cs="BRH Malayalam Extra"/>
+                <w:color w:val="000000"/>
+                <w:sz w:val="36"/>
+                <w:szCs w:val="36"/>
+                <w:lang w:val="en-IN" w:eastAsia="en-IN" w:bidi="ml-IN"/>
+              </w:rPr>
+              <w:lastRenderedPageBreak/>
+              <w:t>ktsy</w:t>
             </w:r>
           </w:p>
           <w:p>
@@ -22392,6 +24877,7 @@
                 <w:szCs w:val="28"/>
                 <w:u w:val="single"/>
               </w:rPr>
+              <w:lastRenderedPageBreak/>
               <w:t>3.4.4</w:t>
             </w:r>
             <w:r>
@@ -23909,6 +26395,7 @@
                 <w:szCs w:val="28"/>
                 <w:u w:val="single"/>
               </w:rPr>
+              <w:lastRenderedPageBreak/>
               <w:t>11.4</w:t>
             </w:r>
             <w:r>
@@ -25249,6 +27736,7 @@
                 <w:szCs w:val="36"/>
                 <w:lang w:val="en-IN" w:eastAsia="en-IN" w:bidi="ml-IN"/>
               </w:rPr>
+              <w:lastRenderedPageBreak/>
               <w:t>A–sõ py–¹xd–-</w:t>
             </w:r>
             <w:r>
@@ -26663,7 +29151,18 @@
                 <w:szCs w:val="36"/>
                 <w:lang w:val="en-IN" w:eastAsia="en-IN" w:bidi="ml-IN"/>
               </w:rPr>
-              <w:t xml:space="preserve"> öZydjd</w:t>
+              <w:t xml:space="preserve"> </w:t>
+            </w:r>
+            <w:r>
+              <w:rPr>
+                <w:rFonts w:ascii="BRH Malayalam Extra" w:eastAsia="Times New Roman" w:hAnsi="BRH Malayalam Extra" w:cs="BRH Malayalam Extra"/>
+                <w:color w:val="000000"/>
+                <w:sz w:val="36"/>
+                <w:szCs w:val="36"/>
+                <w:lang w:val="en-IN" w:eastAsia="en-IN" w:bidi="ml-IN"/>
+              </w:rPr>
+              <w:lastRenderedPageBreak/>
+              <w:t>öZydjd</w:t>
             </w:r>
           </w:p>
         </w:tc>
@@ -26694,6 +29193,7 @@
                 <w:szCs w:val="36"/>
                 <w:lang w:val="en-IN" w:eastAsia="en-IN" w:bidi="ml-IN"/>
               </w:rPr>
+              <w:lastRenderedPageBreak/>
               <w:t>¤¤KmxsxPm-sËy</w:t>
             </w:r>
             <w:r>
@@ -26715,7 +29215,18 @@
                 <w:szCs w:val="36"/>
                 <w:lang w:val="en-IN" w:eastAsia="en-IN" w:bidi="ml-IN"/>
               </w:rPr>
-              <w:t xml:space="preserve"> öZydjd</w:t>
+              <w:t xml:space="preserve"> </w:t>
+            </w:r>
+            <w:r>
+              <w:rPr>
+                <w:rFonts w:ascii="BRH Malayalam Extra" w:eastAsia="Times New Roman" w:hAnsi="BRH Malayalam Extra" w:cs="BRH Malayalam Extra"/>
+                <w:color w:val="000000"/>
+                <w:sz w:val="36"/>
+                <w:szCs w:val="36"/>
+                <w:lang w:val="en-IN" w:eastAsia="en-IN" w:bidi="ml-IN"/>
+              </w:rPr>
+              <w:lastRenderedPageBreak/>
+              <w:t>öZydjd</w:t>
             </w:r>
           </w:p>
           <w:p>
@@ -26755,6 +29266,7 @@
                 <w:szCs w:val="28"/>
                 <w:u w:val="single"/>
               </w:rPr>
+              <w:lastRenderedPageBreak/>
               <w:t>12.14 Sri Rudram</w:t>
             </w:r>
             <w:r>
@@ -27619,7 +30131,6 @@
                 <w:lang w:bidi="ml-IN"/>
               </w:rPr>
             </w:pPr>
-            <w:proofErr w:type="gramStart"/>
             <w:r>
               <w:rPr>
                 <w:rFonts w:eastAsia="Times New Roman" w:cs="Arial"/>
@@ -27627,17 +30138,7 @@
                 <w:szCs w:val="28"/>
                 <w:lang w:bidi="ml-IN"/>
               </w:rPr>
-              <w:t>Deepam,DhUpam</w:t>
-            </w:r>
-            <w:proofErr w:type="gramEnd"/>
-            <w:r>
-              <w:rPr>
-                <w:rFonts w:eastAsia="Times New Roman" w:cs="Arial"/>
-                <w:sz w:val="28"/>
-                <w:szCs w:val="28"/>
-                <w:lang w:bidi="ml-IN"/>
-              </w:rPr>
-              <w:t xml:space="preserve"> </w:t>
+              <w:t xml:space="preserve">Deepam,DhUpam </w:t>
             </w:r>
           </w:p>
           <w:p>
@@ -27986,6 +30487,7 @@
                 <w:szCs w:val="36"/>
                 <w:lang w:val="en-IN" w:eastAsia="en-IN" w:bidi="ml-IN"/>
               </w:rPr>
+              <w:lastRenderedPageBreak/>
               <w:t xml:space="preserve">¥Mx–ex </w:t>
             </w:r>
             <w:r>
@@ -28094,6 +30596,7 @@
                 <w:szCs w:val="36"/>
                 <w:lang w:val="en-IN" w:eastAsia="en-IN" w:bidi="ml-IN"/>
               </w:rPr>
+              <w:lastRenderedPageBreak/>
               <w:t>Cr¡—qüy–p</w:t>
             </w:r>
             <w:r>
@@ -28188,6 +30691,7 @@
                 <w:szCs w:val="36"/>
                 <w:lang w:val="en-IN" w:eastAsia="en-IN" w:bidi="ml-IN"/>
               </w:rPr>
+              <w:lastRenderedPageBreak/>
               <w:t xml:space="preserve">¥Mx–ex </w:t>
             </w:r>
             <w:r>
@@ -28277,6 +30781,7 @@
                 <w:szCs w:val="28"/>
                 <w:u w:val="single"/>
               </w:rPr>
+              <w:lastRenderedPageBreak/>
               <w:t>16.2</w:t>
             </w:r>
             <w:r>
@@ -29284,6 +31789,7 @@
                 <w:szCs w:val="36"/>
                 <w:lang w:val="en-IN" w:eastAsia="en-IN" w:bidi="ml-IN"/>
               </w:rPr>
+              <w:lastRenderedPageBreak/>
               <w:t>B–</w:t>
             </w:r>
             <w:r>
@@ -29360,6 +31866,7 @@
                 <w:szCs w:val="36"/>
                 <w:lang w:val="en-IN" w:eastAsia="en-IN" w:bidi="ml-IN"/>
               </w:rPr>
+              <w:lastRenderedPageBreak/>
               <w:t>t£–</w:t>
             </w:r>
             <w:r>
@@ -29488,6 +31995,7 @@
                 <w:szCs w:val="36"/>
                 <w:lang w:val="en-IN" w:eastAsia="en-IN" w:bidi="ml-IN"/>
               </w:rPr>
+              <w:lastRenderedPageBreak/>
               <w:t>B–</w:t>
             </w:r>
             <w:r>
@@ -29567,6 +32075,7 @@
                 <w:sz w:val="28"/>
                 <w:szCs w:val="28"/>
               </w:rPr>
+              <w:lastRenderedPageBreak/>
               <w:t>16.10 Rudra Kramam</w:t>
             </w:r>
           </w:p>
@@ -30645,6 +33154,7 @@
                 <w:szCs w:val="36"/>
                 <w:lang w:val="en-IN" w:eastAsia="en-IN" w:bidi="ml-IN"/>
               </w:rPr>
+              <w:lastRenderedPageBreak/>
               <w:t>¤F–öÉx–</w:t>
             </w:r>
             <w:r>
@@ -30692,6 +33202,7 @@
                 <w:szCs w:val="36"/>
                 <w:lang w:val="it-IT"/>
               </w:rPr>
+              <w:lastRenderedPageBreak/>
               <w:t xml:space="preserve">E–Z¡–öM–tx </w:t>
             </w:r>
             <w:r>
@@ -30767,6 +33278,7 @@
                 <w:szCs w:val="36"/>
                 <w:lang w:val="it-IT" w:eastAsia="en-IN" w:bidi="ml-IN"/>
               </w:rPr>
+              <w:lastRenderedPageBreak/>
               <w:t>¤F–öÉx</w:t>
             </w:r>
             <w:r>
@@ -30825,6 +33337,7 @@
                 <w:sz w:val="28"/>
                 <w:szCs w:val="28"/>
               </w:rPr>
+              <w:lastRenderedPageBreak/>
               <w:t>17.8 Chamaka Kramam</w:t>
             </w:r>
           </w:p>
@@ -32459,6 +34972,7 @@
                 <w:szCs w:val="36"/>
                 <w:lang w:val="en-IN" w:eastAsia="en-IN" w:bidi="ml-IN"/>
               </w:rPr>
+              <w:lastRenderedPageBreak/>
               <w:t>s¡dy—ÒyZx–ªax</w:t>
             </w:r>
           </w:p>
@@ -32490,6 +35004,7 @@
                 <w:szCs w:val="36"/>
                 <w:lang w:val="en-IN" w:eastAsia="en-IN" w:bidi="ml-IN"/>
               </w:rPr>
+              <w:lastRenderedPageBreak/>
               <w:t>¥p–bx–Ç–py–¹x</w:t>
             </w:r>
             <w:r>
@@ -32536,6 +35051,7 @@
                 <w:szCs w:val="36"/>
                 <w:lang w:val="en-IN" w:eastAsia="en-IN" w:bidi="ml-IN"/>
               </w:rPr>
+              <w:lastRenderedPageBreak/>
               <w:t>s¡dy—ÒyZx–ªax</w:t>
             </w:r>
           </w:p>
@@ -32573,6 +35089,7 @@
                 <w:sz w:val="28"/>
                 <w:szCs w:val="28"/>
               </w:rPr>
+              <w:lastRenderedPageBreak/>
               <w:t>19.2.1</w:t>
             </w:r>
           </w:p>
@@ -33715,7 +36232,17 @@
                 <w:sz w:val="28"/>
                 <w:szCs w:val="28"/>
               </w:rPr>
-              <w:t xml:space="preserve"> only for Main deity Shiva- Parvati at respective places. Kindly take note of the changes</w:t>
+              <w:t xml:space="preserve"> only for Main deity Shiva- Parvati at </w:t>
+            </w:r>
+            <w:r>
+              <w:rPr>
+                <w:rFonts w:cs="Arial"/>
+                <w:color w:val="000000"/>
+                <w:sz w:val="28"/>
+                <w:szCs w:val="28"/>
+              </w:rPr>
+              <w:lastRenderedPageBreak/>
+              <w:t>respective places. Kindly take note of the changes</w:t>
             </w:r>
           </w:p>
         </w:tc>
@@ -33740,6 +36267,7 @@
                 <w:sz w:val="28"/>
                 <w:szCs w:val="28"/>
               </w:rPr>
+              <w:lastRenderedPageBreak/>
               <w:t xml:space="preserve"> Swasti Vacanam or Asheervada vyAkyani</w:t>
             </w:r>
           </w:p>
@@ -33845,27 +36373,7 @@
                 <w:sz w:val="28"/>
                 <w:szCs w:val="28"/>
               </w:rPr>
-              <w:t xml:space="preserve"> missing </w:t>
-            </w:r>
-            <w:proofErr w:type="gramStart"/>
-            <w:r>
-              <w:rPr>
-                <w:rFonts w:cs="Arial"/>
-                <w:color w:val="000000"/>
-                <w:sz w:val="28"/>
-                <w:szCs w:val="28"/>
-              </w:rPr>
-              <w:t>nasal</w:t>
-            </w:r>
-            <w:proofErr w:type="gramEnd"/>
-            <w:r>
-              <w:rPr>
-                <w:rFonts w:cs="Arial"/>
-                <w:color w:val="000000"/>
-                <w:sz w:val="28"/>
-                <w:szCs w:val="28"/>
-              </w:rPr>
-              <w:t xml:space="preserve"> have been added</w:t>
+              <w:t xml:space="preserve"> missing nasal have been added</w:t>
             </w:r>
           </w:p>
           <w:p>
@@ -33934,27 +36442,7 @@
                 <w:sz w:val="28"/>
                 <w:szCs w:val="28"/>
               </w:rPr>
-              <w:t xml:space="preserve">Dot for pause added after n. also before </w:t>
-            </w:r>
-            <w:proofErr w:type="gramStart"/>
-            <w:r>
-              <w:rPr>
-                <w:rFonts w:cs="Arial"/>
-                <w:color w:val="000000"/>
-                <w:sz w:val="28"/>
-                <w:szCs w:val="28"/>
-              </w:rPr>
-              <w:t>y,v</w:t>
-            </w:r>
-            <w:proofErr w:type="gramEnd"/>
-            <w:r>
-              <w:rPr>
-                <w:rFonts w:cs="Arial"/>
-                <w:color w:val="000000"/>
-                <w:sz w:val="28"/>
-                <w:szCs w:val="28"/>
-              </w:rPr>
-              <w:t xml:space="preserve"> where required</w:t>
+              <w:t>Dot for pause added after n. also before y,v where required</w:t>
             </w:r>
           </w:p>
           <w:p>
@@ -34095,6 +36583,7 @@
           <w:szCs w:val="32"/>
           <w:u w:val="single"/>
         </w:rPr>
+        <w:lastRenderedPageBreak/>
         <w:t>Malayalam Shiva Stuti Book</w:t>
       </w:r>
       <w:r>
@@ -35314,6 +37803,7 @@
                 <w:sz w:val="28"/>
                 <w:szCs w:val="28"/>
               </w:rPr>
+              <w:lastRenderedPageBreak/>
               <w:t>Section 12.4 Upacharam (snanam)</w:t>
             </w:r>
           </w:p>
@@ -36417,6 +38907,7 @@
                 <w:sz w:val="32"/>
                 <w:szCs w:val="32"/>
               </w:rPr>
+              <w:lastRenderedPageBreak/>
               <w:t>Section 19.1.8 and 19.4.8 after Mantra Pushpam</w:t>
             </w:r>
           </w:p>

</xml_diff>